<commit_message>
perbaiki kode kode praktikum
</commit_message>
<xml_diff>
--- a/LAPORAN PRAKTIKUM.docx
+++ b/LAPORAN PRAKTIKUM.docx
@@ -107,6 +107,7 @@
         <w:rPr>
           <w:b/>
           <w:bCs/>
+          <w:noProof/>
         </w:rPr>
         <w:drawing>
           <wp:inline distT="0" distB="0" distL="0" distR="0" wp14:anchorId="393CE27B" wp14:editId="21601EFF">
@@ -193,9 +194,9 @@
         <w:tblLook w:val="04A0" w:firstRow="1" w:lastRow="0" w:firstColumn="1" w:lastColumn="0" w:noHBand="0" w:noVBand="1"/>
       </w:tblPr>
       <w:tblGrid>
-        <w:gridCol w:w="2201"/>
+        <w:gridCol w:w="2198"/>
         <w:gridCol w:w="288"/>
-        <w:gridCol w:w="5448"/>
+        <w:gridCol w:w="5451"/>
       </w:tblGrid>
       <w:tr>
         <w:tc>
@@ -355,6 +356,9 @@
             <w:pPr>
               <w:ind w:firstLine="0"/>
             </w:pPr>
+            <w:r>
+              <w:t>Muhammad Rafif Al Hafizh</w:t>
+            </w:r>
           </w:p>
           <w:p>
             <w:pPr>
@@ -511,7 +515,7 @@
           <w:numId w:val="0"/>
         </w:numPr>
       </w:pPr>
-      <w:bookmarkStart w:id="0" w:name="_Toc226637610"/>
+      <w:bookmarkStart w:id="0" w:name="_Toc227252098"/>
       <w:r>
         <w:lastRenderedPageBreak/>
         <w:t>DAFTAR ISI</w:t>
@@ -559,7 +563,7 @@
         <w:rPr>
           <w:noProof/>
         </w:rPr>
-        <w:instrText xml:space="preserve"> PAGEREF _Toc226637610 \h </w:instrText>
+        <w:instrText xml:space="preserve"> PAGEREF _Toc227252098 \h </w:instrText>
       </w:r>
       <w:r>
         <w:rPr>
@@ -604,16 +608,22 @@
       </w:r>
       <w:r>
         <w:rPr>
-          <w:i/>
-          <w:iCs/>
           <w:noProof/>
         </w:rPr>
-        <w:t xml:space="preserve"> Object Oriented Programing</w:t>
-      </w:r>
-      <w:r>
-        <w:rPr>
+        <w:t xml:space="preserve"> Pengenalan </w:t>
+      </w:r>
+      <w:r>
+        <w:rPr>
+          <w:i/>
+          <w:iCs/>
           <w:noProof/>
         </w:rPr>
+        <w:t>Object Oriented Programing</w:t>
+      </w:r>
+      <w:r>
+        <w:rPr>
+          <w:noProof/>
+        </w:rPr>
         <w:tab/>
       </w:r>
       <w:r>
@@ -626,7 +636,7 @@
         <w:rPr>
           <w:noProof/>
         </w:rPr>
-        <w:instrText xml:space="preserve"> PAGEREF _Toc226637611 \h </w:instrText>
+        <w:instrText xml:space="preserve"> PAGEREF _Toc227252099 \h </w:instrText>
       </w:r>
       <w:r>
         <w:rPr>
@@ -707,7 +717,7 @@
         <w:rPr>
           <w:noProof/>
         </w:rPr>
-        <w:instrText xml:space="preserve"> PAGEREF _Toc226637612 \h </w:instrText>
+        <w:instrText xml:space="preserve"> PAGEREF _Toc227252100 \h </w:instrText>
       </w:r>
       <w:r>
         <w:rPr>
@@ -724,7 +734,7 @@
         <w:rPr>
           <w:noProof/>
         </w:rPr>
-        <w:t>4</w:t>
+        <w:t>7</w:t>
       </w:r>
       <w:r>
         <w:rPr>
@@ -787,7 +797,7 @@
         <w:rPr>
           <w:noProof/>
         </w:rPr>
-        <w:instrText xml:space="preserve"> PAGEREF _Toc226637613 \h </w:instrText>
+        <w:instrText xml:space="preserve"> PAGEREF _Toc227252101 \h </w:instrText>
       </w:r>
       <w:r>
         <w:rPr>
@@ -804,7 +814,88 @@
         <w:rPr>
           <w:noProof/>
         </w:rPr>
-        <w:t>5</w:t>
+        <w:t>10</w:t>
+      </w:r>
+      <w:r>
+        <w:rPr>
+          <w:noProof/>
+        </w:rPr>
+        <w:fldChar w:fldCharType="end"/>
+      </w:r>
+    </w:p>
+    <w:p>
+      <w:pPr>
+        <w:pStyle w:val="TOC1"/>
+        <w:rPr>
+          <w:rFonts w:asciiTheme="minorHAnsi" w:eastAsiaTheme="minorEastAsia" w:hAnsiTheme="minorHAnsi"/>
+          <w:b w:val="0"/>
+          <w:noProof/>
+          <w:lang w:eastAsia="id-ID"/>
+        </w:rPr>
+      </w:pPr>
+      <w:r>
+        <w:rPr>
+          <w:iCs/>
+          <w:noProof/>
+        </w:rPr>
+        <w:t>PERTEMUAN 4</w:t>
+      </w:r>
+      <w:r>
+        <w:rPr>
+          <w:i/>
+          <w:iCs/>
+          <w:noProof/>
+        </w:rPr>
+        <w:t xml:space="preserve"> Inharitance</w:t>
+      </w:r>
+      <w:r>
+        <w:rPr>
+          <w:noProof/>
+        </w:rPr>
+        <w:t xml:space="preserve"> dan </w:t>
+      </w:r>
+      <w:r>
+        <w:rPr>
+          <w:i/>
+          <w:iCs/>
+          <w:noProof/>
+        </w:rPr>
+        <w:t>Polymorphism</w:t>
+      </w:r>
+      <w:r>
+        <w:rPr>
+          <w:noProof/>
+        </w:rPr>
+        <w:tab/>
+      </w:r>
+      <w:r>
+        <w:rPr>
+          <w:noProof/>
+        </w:rPr>
+        <w:fldChar w:fldCharType="begin"/>
+      </w:r>
+      <w:r>
+        <w:rPr>
+          <w:noProof/>
+        </w:rPr>
+        <w:instrText xml:space="preserve"> PAGEREF _Toc227252102 \h </w:instrText>
+      </w:r>
+      <w:r>
+        <w:rPr>
+          <w:noProof/>
+        </w:rPr>
+      </w:r>
+      <w:r>
+        <w:rPr>
+          <w:noProof/>
+        </w:rPr>
+        <w:fldChar w:fldCharType="separate"/>
+      </w:r>
+      <w:r>
+        <w:rPr>
+          <w:noProof/>
+        </w:rPr>
+        <w:t>11</w:t>
       </w:r>
       <w:r>
         <w:rPr>
@@ -869,7 +960,10 @@
         <w:lastRenderedPageBreak/>
         <w:br/>
       </w:r>
-      <w:bookmarkStart w:id="1" w:name="_Toc226637611"/>
+      <w:bookmarkStart w:id="1" w:name="_Toc227252099"/>
+      <w:r>
+        <w:t xml:space="preserve">Pengenalan </w:t>
+      </w:r>
       <w:proofErr w:type="spellStart"/>
       <w:r>
         <w:rPr>
@@ -915,9 +1009,1429 @@
     </w:p>
     <w:p>
       <w:pPr>
-        <w:spacing w:after="160" w:line="278" w:lineRule="auto"/>
-        <w:ind w:firstLine="0"/>
-      </w:pPr>
+        <w:pStyle w:val="Judul2"/>
+      </w:pPr>
+      <w:r>
+        <w:t xml:space="preserve"> Latar Belakang</w:t>
+      </w:r>
+    </w:p>
+    <w:p>
+      <w:r>
+        <w:t xml:space="preserve">Perkembangan perangkat lunak yang semakin kompleks menuntut adanya pendekatan pemrograman yang mampu meningkatkan </w:t>
+      </w:r>
+      <w:proofErr w:type="spellStart"/>
+      <w:r>
+        <w:t>modularitas</w:t>
+      </w:r>
+      <w:proofErr w:type="spellEnd"/>
+      <w:r>
+        <w:t xml:space="preserve">, </w:t>
+      </w:r>
+      <w:proofErr w:type="spellStart"/>
+      <w:r>
+        <w:t>reusabilitas</w:t>
+      </w:r>
+      <w:proofErr w:type="spellEnd"/>
+      <w:r>
+        <w:t xml:space="preserve">, serta kemudahan dalam pemeliharaan kode. Salah satu paradigma yang banyak digunakan adalah </w:t>
+      </w:r>
+      <w:proofErr w:type="spellStart"/>
+      <w:r>
+        <w:rPr>
+          <w:rStyle w:val="Kuat"/>
+          <w:b w:val="0"/>
+          <w:bCs w:val="0"/>
+          <w:i/>
+          <w:iCs/>
+        </w:rPr>
+        <w:t>Object-Oriented</w:t>
+      </w:r>
+      <w:proofErr w:type="spellEnd"/>
+      <w:r>
+        <w:rPr>
+          <w:rStyle w:val="Kuat"/>
+          <w:b w:val="0"/>
+          <w:bCs w:val="0"/>
+          <w:i/>
+          <w:iCs/>
+        </w:rPr>
+        <w:t xml:space="preserve"> </w:t>
+      </w:r>
+      <w:proofErr w:type="spellStart"/>
+      <w:r>
+        <w:rPr>
+          <w:rStyle w:val="Kuat"/>
+          <w:b w:val="0"/>
+          <w:bCs w:val="0"/>
+          <w:i/>
+          <w:iCs/>
+        </w:rPr>
+        <w:t>Programming</w:t>
+      </w:r>
+      <w:proofErr w:type="spellEnd"/>
+      <w:r>
+        <w:rPr>
+          <w:rStyle w:val="Kuat"/>
+        </w:rPr>
+        <w:t xml:space="preserve"> (OOP)</w:t>
+      </w:r>
+      <w:r>
+        <w:t>.</w:t>
+      </w:r>
+    </w:p>
+    <w:p>
+      <w:r>
+        <w:t>OOP memungkinkan pengembang untuk merepresentasikan entitas dunia nyata ke dalam bentuk objek yang memiliki atribut (data) dan metode (fungsi). Dengan pendekatan ini, struktur program menjadi lebih terorganisir dan mudah dikembangkan.</w:t>
+      </w:r>
+    </w:p>
+    <w:p>
+      <w:pPr>
+        <w:pStyle w:val="Judul2"/>
+      </w:pPr>
+      <w:r>
+        <w:t xml:space="preserve"> Tujuan Praktikum</w:t>
+      </w:r>
+    </w:p>
+    <w:p>
+      <w:pPr>
+        <w:pStyle w:val="DaftarParagraf"/>
+        <w:numPr>
+          <w:ilvl w:val="6"/>
+          <w:numId w:val="4"/>
+        </w:numPr>
+        <w:ind w:left="709" w:hanging="283"/>
+      </w:pPr>
+      <w:r>
+        <w:t xml:space="preserve">Memahami konsep dasar </w:t>
+      </w:r>
+      <w:proofErr w:type="spellStart"/>
+      <w:r>
+        <w:t>Object-Oriented</w:t>
+      </w:r>
+      <w:proofErr w:type="spellEnd"/>
+      <w:r>
+        <w:t xml:space="preserve"> </w:t>
+      </w:r>
+      <w:proofErr w:type="spellStart"/>
+      <w:r>
+        <w:t>Programming</w:t>
+      </w:r>
+      <w:proofErr w:type="spellEnd"/>
+      <w:r>
+        <w:t xml:space="preserve">. </w:t>
+      </w:r>
+    </w:p>
+    <w:p>
+      <w:pPr>
+        <w:pStyle w:val="DaftarParagraf"/>
+        <w:numPr>
+          <w:ilvl w:val="6"/>
+          <w:numId w:val="4"/>
+        </w:numPr>
+        <w:ind w:left="709" w:hanging="283"/>
+      </w:pPr>
+      <w:r>
+        <w:t xml:space="preserve">Mengenal struktur dasar </w:t>
+      </w:r>
+      <w:proofErr w:type="spellStart"/>
+      <w:r>
+        <w:t>class</w:t>
+      </w:r>
+      <w:proofErr w:type="spellEnd"/>
+      <w:r>
+        <w:t xml:space="preserve"> dan </w:t>
+      </w:r>
+      <w:proofErr w:type="spellStart"/>
+      <w:r>
+        <w:t>object</w:t>
+      </w:r>
+      <w:proofErr w:type="spellEnd"/>
+      <w:r>
+        <w:t xml:space="preserve">. </w:t>
+      </w:r>
+    </w:p>
+    <w:p>
+      <w:pPr>
+        <w:pStyle w:val="DaftarParagraf"/>
+        <w:numPr>
+          <w:ilvl w:val="6"/>
+          <w:numId w:val="4"/>
+        </w:numPr>
+        <w:ind w:left="709" w:hanging="283"/>
+      </w:pPr>
+      <w:r>
+        <w:t xml:space="preserve">Mampu mengimplementasikan </w:t>
+      </w:r>
+      <w:proofErr w:type="spellStart"/>
+      <w:r>
+        <w:t>class</w:t>
+      </w:r>
+      <w:proofErr w:type="spellEnd"/>
+      <w:r>
+        <w:t xml:space="preserve"> sederhana menggunakan bahasa </w:t>
+      </w:r>
+      <w:proofErr w:type="spellStart"/>
+      <w:r>
+        <w:t>Python</w:t>
+      </w:r>
+      <w:proofErr w:type="spellEnd"/>
+      <w:r>
+        <w:t xml:space="preserve">. </w:t>
+      </w:r>
+    </w:p>
+    <w:p>
+      <w:pPr>
+        <w:pStyle w:val="DaftarParagraf"/>
+        <w:numPr>
+          <w:ilvl w:val="6"/>
+          <w:numId w:val="4"/>
+        </w:numPr>
+        <w:ind w:left="709" w:hanging="283"/>
+      </w:pPr>
+      <w:r>
+        <w:t xml:space="preserve">Memahami atribut dan metode dalam </w:t>
+      </w:r>
+      <w:proofErr w:type="spellStart"/>
+      <w:r>
+        <w:t>class</w:t>
+      </w:r>
+      <w:proofErr w:type="spellEnd"/>
+      <w:r>
+        <w:t>.</w:t>
+      </w:r>
+    </w:p>
+    <w:p>
+      <w:pPr>
+        <w:pStyle w:val="Judul2"/>
+      </w:pPr>
+      <w:r>
+        <w:t xml:space="preserve"> Dasar teori</w:t>
+      </w:r>
+    </w:p>
+    <w:p>
+      <w:proofErr w:type="spellStart"/>
+      <w:r>
+        <w:t>Object-Oriented</w:t>
+      </w:r>
+      <w:proofErr w:type="spellEnd"/>
+      <w:r>
+        <w:t xml:space="preserve"> </w:t>
+      </w:r>
+      <w:proofErr w:type="spellStart"/>
+      <w:r>
+        <w:t>Programming</w:t>
+      </w:r>
+      <w:proofErr w:type="spellEnd"/>
+      <w:r>
+        <w:t xml:space="preserve"> (OOP) merupakan paradigma pemrograman yang berorientasi pada objek. Konsep utama dalam OOP meliputi:</w:t>
+      </w:r>
+    </w:p>
+    <w:p>
+      <w:pPr>
+        <w:numPr>
+          <w:ilvl w:val="0"/>
+          <w:numId w:val="6"/>
+        </w:numPr>
+      </w:pPr>
+      <w:proofErr w:type="spellStart"/>
+      <w:r>
+        <w:rPr>
+          <w:b/>
+          <w:bCs/>
+        </w:rPr>
+        <w:t>Class</w:t>
+      </w:r>
+      <w:proofErr w:type="spellEnd"/>
+      <w:r>
+        <w:t xml:space="preserve"> adalah </w:t>
+      </w:r>
+      <w:proofErr w:type="spellStart"/>
+      <w:r>
+        <w:t>blueprint</w:t>
+      </w:r>
+      <w:proofErr w:type="spellEnd"/>
+      <w:r>
+        <w:t xml:space="preserve"> atau cetakan untuk membuat objek. </w:t>
+      </w:r>
+    </w:p>
+    <w:p>
+      <w:pPr>
+        <w:numPr>
+          <w:ilvl w:val="0"/>
+          <w:numId w:val="6"/>
+        </w:numPr>
+      </w:pPr>
+      <w:proofErr w:type="spellStart"/>
+      <w:r>
+        <w:rPr>
+          <w:b/>
+          <w:bCs/>
+        </w:rPr>
+        <w:t>Objec</w:t>
+      </w:r>
+      <w:r>
+        <w:rPr>
+          <w:b/>
+          <w:bCs/>
+        </w:rPr>
+        <w:t>t</w:t>
+      </w:r>
+      <w:proofErr w:type="spellEnd"/>
+      <w:r>
+        <w:rPr>
+          <w:b/>
+          <w:bCs/>
+        </w:rPr>
+        <w:t xml:space="preserve"> </w:t>
+      </w:r>
+      <w:r>
+        <w:t xml:space="preserve">adalah </w:t>
+      </w:r>
+      <w:proofErr w:type="spellStart"/>
+      <w:r>
+        <w:t>instance</w:t>
+      </w:r>
+      <w:proofErr w:type="spellEnd"/>
+      <w:r>
+        <w:t xml:space="preserve"> dari </w:t>
+      </w:r>
+      <w:proofErr w:type="spellStart"/>
+      <w:r>
+        <w:t>class</w:t>
+      </w:r>
+      <w:proofErr w:type="spellEnd"/>
+      <w:r>
+        <w:t xml:space="preserve"> yang memiliki atribut dan perilaku. </w:t>
+      </w:r>
+    </w:p>
+    <w:p>
+      <w:pPr>
+        <w:numPr>
+          <w:ilvl w:val="0"/>
+          <w:numId w:val="6"/>
+        </w:numPr>
+      </w:pPr>
+      <w:r>
+        <w:rPr>
+          <w:b/>
+          <w:bCs/>
+        </w:rPr>
+        <w:t>Atribut (</w:t>
+      </w:r>
+      <w:proofErr w:type="spellStart"/>
+      <w:r>
+        <w:rPr>
+          <w:b/>
+          <w:bCs/>
+        </w:rPr>
+        <w:t>Attribute</w:t>
+      </w:r>
+      <w:proofErr w:type="spellEnd"/>
+      <w:r>
+        <w:rPr>
+          <w:b/>
+          <w:bCs/>
+        </w:rPr>
+        <w:t>)</w:t>
+      </w:r>
+      <w:r>
+        <w:t xml:space="preserve"> adalah </w:t>
+      </w:r>
+      <w:r>
+        <w:t>v</w:t>
+      </w:r>
+      <w:r>
+        <w:t xml:space="preserve">ariabel yang dimiliki oleh objek. </w:t>
+      </w:r>
+    </w:p>
+    <w:p>
+      <w:pPr>
+        <w:numPr>
+          <w:ilvl w:val="0"/>
+          <w:numId w:val="6"/>
+        </w:numPr>
+      </w:pPr>
+      <w:r>
+        <w:rPr>
+          <w:b/>
+          <w:bCs/>
+        </w:rPr>
+        <w:t>Metode (</w:t>
+      </w:r>
+      <w:proofErr w:type="spellStart"/>
+      <w:r>
+        <w:rPr>
+          <w:b/>
+          <w:bCs/>
+        </w:rPr>
+        <w:t>Method</w:t>
+      </w:r>
+      <w:proofErr w:type="spellEnd"/>
+      <w:r>
+        <w:rPr>
+          <w:b/>
+          <w:bCs/>
+        </w:rPr>
+        <w:t>)</w:t>
+      </w:r>
+      <w:r>
+        <w:t xml:space="preserve"> </w:t>
+      </w:r>
+      <w:r>
+        <w:t>adalah f</w:t>
+      </w:r>
+      <w:r>
+        <w:t xml:space="preserve">ungsi yang terdapat dalam </w:t>
+      </w:r>
+      <w:proofErr w:type="spellStart"/>
+      <w:r>
+        <w:t>class</w:t>
+      </w:r>
+      <w:proofErr w:type="spellEnd"/>
+      <w:r>
+        <w:t xml:space="preserve"> dan digunakan untuk memanipulasi atribut. </w:t>
+      </w:r>
+    </w:p>
+    <w:p>
+      <w:pPr>
+        <w:pStyle w:val="Judul2"/>
+      </w:pPr>
+      <w:r>
+        <w:lastRenderedPageBreak/>
+        <w:t xml:space="preserve"> Praktikum</w:t>
+      </w:r>
+    </w:p>
+    <w:p>
+      <w:pPr>
+        <w:pStyle w:val="Judul3"/>
+      </w:pPr>
+      <w:r>
+        <w:t>Kode</w:t>
+      </w:r>
+      <w:r>
+        <w:t xml:space="preserve"> 1</w:t>
+      </w:r>
+    </w:p>
+    <w:p>
+      <w:pPr>
+        <w:jc w:val="center"/>
+      </w:pPr>
+      <w:r>
+        <w:rPr>
+          <w:noProof/>
+        </w:rPr>
+        <w:drawing>
+          <wp:inline distT="0" distB="0" distL="0" distR="0" wp14:anchorId="7D867C53" wp14:editId="10CD683A">
+            <wp:extent cx="4351020" cy="2339340"/>
+            <wp:effectExtent l="0" t="0" r="0" b="3810"/>
+            <wp:docPr id="538208143" name="Gambar 1"/>
+            <wp:cNvGraphicFramePr>
+              <a:graphicFrameLocks xmlns:a="http://schemas.openxmlformats.org/drawingml/2006/main" noChangeAspect="1"/>
+            </wp:cNvGraphicFramePr>
+            <a:graphic xmlns:a="http://schemas.openxmlformats.org/drawingml/2006/main">
+              <a:graphicData uri="http://schemas.openxmlformats.org/drawingml/2006/picture">
+                <pic:pic xmlns:pic="http://schemas.openxmlformats.org/drawingml/2006/picture">
+                  <pic:nvPicPr>
+                    <pic:cNvPr id="538208143" name=""/>
+                    <pic:cNvPicPr/>
+                  </pic:nvPicPr>
+                  <pic:blipFill rotWithShape="1">
+                    <a:blip r:embed="rId9"/>
+                    <a:srcRect l="6803" t="15006" r="6867" b="9471"/>
+                    <a:stretch>
+                      <a:fillRect/>
+                    </a:stretch>
+                  </pic:blipFill>
+                  <pic:spPr bwMode="auto">
+                    <a:xfrm>
+                      <a:off x="0" y="0"/>
+                      <a:ext cx="4353732" cy="2340798"/>
+                    </a:xfrm>
+                    <a:prstGeom prst="rect">
+                      <a:avLst/>
+                    </a:prstGeom>
+                    <a:ln>
+                      <a:noFill/>
+                    </a:ln>
+                    <a:extLst>
+                      <a:ext uri="{53640926-AAD7-44D8-BBD7-CCE9431645EC}">
+                        <a14:shadowObscured xmlns:a14="http://schemas.microsoft.com/office/drawing/2010/main"/>
+                      </a:ext>
+                    </a:extLst>
+                  </pic:spPr>
+                </pic:pic>
+              </a:graphicData>
+            </a:graphic>
+          </wp:inline>
+        </w:drawing>
+      </w:r>
+    </w:p>
+    <w:p>
+      <w:proofErr w:type="spellStart"/>
+      <w:r>
+        <w:t>Class</w:t>
+      </w:r>
+      <w:proofErr w:type="spellEnd"/>
+      <w:r>
+        <w:t xml:space="preserve"> </w:t>
+      </w:r>
+      <w:r>
+        <w:rPr>
+          <w:i/>
+          <w:iCs/>
+        </w:rPr>
+        <w:t>Mahasiswa</w:t>
+      </w:r>
+      <w:r>
+        <w:t xml:space="preserve"> merupakan </w:t>
+      </w:r>
+      <w:proofErr w:type="spellStart"/>
+      <w:r>
+        <w:t>blueprint</w:t>
+      </w:r>
+      <w:proofErr w:type="spellEnd"/>
+      <w:r>
+        <w:t xml:space="preserve"> yang mendefinisikan struktur data dan perilaku objek mahasiswa, dilengkapi </w:t>
+      </w:r>
+      <w:proofErr w:type="spellStart"/>
+      <w:r>
+        <w:t>constructor</w:t>
+      </w:r>
+      <w:proofErr w:type="spellEnd"/>
+      <w:r>
+        <w:t xml:space="preserve"> __</w:t>
+      </w:r>
+      <w:proofErr w:type="spellStart"/>
+      <w:r>
+        <w:t>init</w:t>
+      </w:r>
+      <w:proofErr w:type="spellEnd"/>
+      <w:r>
+        <w:t xml:space="preserve">__ dan </w:t>
+      </w:r>
+      <w:proofErr w:type="spellStart"/>
+      <w:r>
+        <w:t>method</w:t>
+      </w:r>
+      <w:proofErr w:type="spellEnd"/>
+      <w:r>
+        <w:t xml:space="preserve"> </w:t>
+      </w:r>
+      <w:proofErr w:type="spellStart"/>
+      <w:r>
+        <w:t>info_mahasiswa</w:t>
+      </w:r>
+      <w:proofErr w:type="spellEnd"/>
+      <w:r>
+        <w:t>.</w:t>
+      </w:r>
+    </w:p>
+    <w:p>
+      <w:r>
+        <w:t xml:space="preserve">Objek mahasiswa1 adalah hasil </w:t>
+      </w:r>
+      <w:proofErr w:type="spellStart"/>
+      <w:r>
+        <w:t>instansiasi</w:t>
+      </w:r>
+      <w:proofErr w:type="spellEnd"/>
+      <w:r>
+        <w:t xml:space="preserve"> dari </w:t>
+      </w:r>
+      <w:proofErr w:type="spellStart"/>
+      <w:r>
+        <w:t>class</w:t>
+      </w:r>
+      <w:proofErr w:type="spellEnd"/>
+      <w:r>
+        <w:t xml:space="preserve"> </w:t>
+      </w:r>
+      <w:r>
+        <w:rPr>
+          <w:i/>
+          <w:iCs/>
+        </w:rPr>
+        <w:t>Mahasiswa</w:t>
+      </w:r>
+      <w:r>
+        <w:t xml:space="preserve"> yang menyimpan data mahasiswa dan digunakan untuk memanggil </w:t>
+      </w:r>
+      <w:proofErr w:type="spellStart"/>
+      <w:r>
+        <w:t>method</w:t>
+      </w:r>
+      <w:proofErr w:type="spellEnd"/>
+      <w:r>
+        <w:t>.</w:t>
+      </w:r>
+      <w:r>
+        <w:t xml:space="preserve"> </w:t>
+      </w:r>
+    </w:p>
+    <w:p>
+      <w:r>
+        <w:t xml:space="preserve">Atribut terdiri dari nama, </w:t>
+      </w:r>
+      <w:proofErr w:type="spellStart"/>
+      <w:r>
+        <w:t>npm</w:t>
+      </w:r>
+      <w:proofErr w:type="spellEnd"/>
+      <w:r>
+        <w:t xml:space="preserve">, jurusan, semester, dan asal, yang </w:t>
+      </w:r>
+      <w:proofErr w:type="spellStart"/>
+      <w:r>
+        <w:t>diinisialisasi</w:t>
+      </w:r>
+      <w:proofErr w:type="spellEnd"/>
+      <w:r>
+        <w:t xml:space="preserve"> melalui </w:t>
+      </w:r>
+      <w:proofErr w:type="spellStart"/>
+      <w:r>
+        <w:t>constructor</w:t>
+      </w:r>
+      <w:proofErr w:type="spellEnd"/>
+      <w:r>
+        <w:t xml:space="preserve"> dan disimpan menggunakan </w:t>
+      </w:r>
+      <w:proofErr w:type="spellStart"/>
+      <w:r>
+        <w:t>self</w:t>
+      </w:r>
+      <w:proofErr w:type="spellEnd"/>
+      <w:r>
+        <w:t>.</w:t>
+      </w:r>
+    </w:p>
+    <w:p>
+      <w:proofErr w:type="spellStart"/>
+      <w:r>
+        <w:t>Method</w:t>
+      </w:r>
+      <w:proofErr w:type="spellEnd"/>
+      <w:r>
+        <w:t xml:space="preserve"> </w:t>
+      </w:r>
+      <w:proofErr w:type="spellStart"/>
+      <w:r>
+        <w:t>info_mahasiswa</w:t>
+      </w:r>
+      <w:proofErr w:type="spellEnd"/>
+      <w:r>
+        <w:t xml:space="preserve"> digunakan untuk menampilkan data mahasiswa dengan mengakses atribut melalui </w:t>
+      </w:r>
+      <w:proofErr w:type="spellStart"/>
+      <w:r>
+        <w:t>self</w:t>
+      </w:r>
+      <w:proofErr w:type="spellEnd"/>
+      <w:r>
+        <w:t xml:space="preserve"> dan mencetaknya dalam format terstruktur</w:t>
+      </w:r>
+      <w:r>
+        <w:t xml:space="preserve">. Sehingga menghasilkan </w:t>
+      </w:r>
+      <w:proofErr w:type="spellStart"/>
+      <w:r>
+        <w:t>output</w:t>
+      </w:r>
+      <w:proofErr w:type="spellEnd"/>
+      <w:r>
+        <w:t xml:space="preserve"> berupa:</w:t>
+      </w:r>
+    </w:p>
+    <w:p>
+      <w:pPr>
+        <w:jc w:val="center"/>
+      </w:pPr>
+      <w:r>
+        <w:rPr>
+          <w:noProof/>
+        </w:rPr>
+        <w:drawing>
+          <wp:inline distT="0" distB="0" distL="0" distR="0" wp14:anchorId="11E29088" wp14:editId="07DBAF7D">
+            <wp:extent cx="2987040" cy="760730"/>
+            <wp:effectExtent l="0" t="0" r="3810" b="1270"/>
+            <wp:docPr id="674020065" name="Gambar 1"/>
+            <wp:cNvGraphicFramePr>
+              <a:graphicFrameLocks xmlns:a="http://schemas.openxmlformats.org/drawingml/2006/main" noChangeAspect="1"/>
+            </wp:cNvGraphicFramePr>
+            <a:graphic xmlns:a="http://schemas.openxmlformats.org/drawingml/2006/main">
+              <a:graphicData uri="http://schemas.openxmlformats.org/drawingml/2006/picture">
+                <pic:pic xmlns:pic="http://schemas.openxmlformats.org/drawingml/2006/picture">
+                  <pic:nvPicPr>
+                    <pic:cNvPr id="674020065" name=""/>
+                    <pic:cNvPicPr/>
+                  </pic:nvPicPr>
+                  <pic:blipFill rotWithShape="1">
+                    <a:blip r:embed="rId10"/>
+                    <a:srcRect r="40733"/>
+                    <a:stretch>
+                      <a:fillRect/>
+                    </a:stretch>
+                  </pic:blipFill>
+                  <pic:spPr bwMode="auto">
+                    <a:xfrm>
+                      <a:off x="0" y="0"/>
+                      <a:ext cx="2987040" cy="760730"/>
+                    </a:xfrm>
+                    <a:prstGeom prst="rect">
+                      <a:avLst/>
+                    </a:prstGeom>
+                    <a:ln>
+                      <a:noFill/>
+                    </a:ln>
+                    <a:extLst>
+                      <a:ext uri="{53640926-AAD7-44D8-BBD7-CCE9431645EC}">
+                        <a14:shadowObscured xmlns:a14="http://schemas.microsoft.com/office/drawing/2010/main"/>
+                      </a:ext>
+                    </a:extLst>
+                  </pic:spPr>
+                </pic:pic>
+              </a:graphicData>
+            </a:graphic>
+          </wp:inline>
+        </w:drawing>
+      </w:r>
+    </w:p>
+    <w:p>
+      <w:pPr>
+        <w:pStyle w:val="Judul3"/>
+      </w:pPr>
+      <w:r>
+        <w:lastRenderedPageBreak/>
+        <w:t>Kode 2</w:t>
+      </w:r>
+    </w:p>
+    <w:p>
+      <w:pPr>
+        <w:jc w:val="center"/>
+      </w:pPr>
+      <w:r>
+        <w:rPr>
+          <w:noProof/>
+        </w:rPr>
+        <w:drawing>
+          <wp:inline distT="0" distB="0" distL="0" distR="0" wp14:anchorId="7E4C5350" wp14:editId="6FDA1A84">
+            <wp:extent cx="3669102" cy="1767840"/>
+            <wp:effectExtent l="0" t="0" r="7620" b="3810"/>
+            <wp:docPr id="1029768990" name="Gambar 1"/>
+            <wp:cNvGraphicFramePr>
+              <a:graphicFrameLocks xmlns:a="http://schemas.openxmlformats.org/drawingml/2006/main" noChangeAspect="1"/>
+            </wp:cNvGraphicFramePr>
+            <a:graphic xmlns:a="http://schemas.openxmlformats.org/drawingml/2006/main">
+              <a:graphicData uri="http://schemas.openxmlformats.org/drawingml/2006/picture">
+                <pic:pic xmlns:pic="http://schemas.openxmlformats.org/drawingml/2006/picture">
+                  <pic:nvPicPr>
+                    <pic:cNvPr id="1029768990" name=""/>
+                    <pic:cNvPicPr/>
+                  </pic:nvPicPr>
+                  <pic:blipFill rotWithShape="1">
+                    <a:blip r:embed="rId11"/>
+                    <a:srcRect l="9525" t="21880" r="7320" b="13695"/>
+                    <a:stretch>
+                      <a:fillRect/>
+                    </a:stretch>
+                  </pic:blipFill>
+                  <pic:spPr bwMode="auto">
+                    <a:xfrm>
+                      <a:off x="0" y="0"/>
+                      <a:ext cx="3669925" cy="1768237"/>
+                    </a:xfrm>
+                    <a:prstGeom prst="rect">
+                      <a:avLst/>
+                    </a:prstGeom>
+                    <a:ln>
+                      <a:noFill/>
+                    </a:ln>
+                    <a:extLst>
+                      <a:ext uri="{53640926-AAD7-44D8-BBD7-CCE9431645EC}">
+                        <a14:shadowObscured xmlns:a14="http://schemas.microsoft.com/office/drawing/2010/main"/>
+                      </a:ext>
+                    </a:extLst>
+                  </pic:spPr>
+                </pic:pic>
+              </a:graphicData>
+            </a:graphic>
+          </wp:inline>
+        </w:drawing>
+      </w:r>
+    </w:p>
+    <w:p>
+      <w:proofErr w:type="spellStart"/>
+      <w:r>
+        <w:t>Class</w:t>
+      </w:r>
+      <w:proofErr w:type="spellEnd"/>
+      <w:r>
+        <w:t xml:space="preserve"> </w:t>
+      </w:r>
+      <w:r>
+        <w:rPr>
+          <w:i/>
+          <w:iCs/>
+        </w:rPr>
+        <w:t>trapesium</w:t>
+      </w:r>
+      <w:r>
+        <w:t xml:space="preserve"> digunakan sebagai </w:t>
+      </w:r>
+      <w:proofErr w:type="spellStart"/>
+      <w:r>
+        <w:t>blueprint</w:t>
+      </w:r>
+      <w:proofErr w:type="spellEnd"/>
+      <w:r>
+        <w:t xml:space="preserve"> untuk merepresentasikan bangun datar trapesium dengan parameter </w:t>
+      </w:r>
+      <w:proofErr w:type="spellStart"/>
+      <w:r>
+        <w:rPr>
+          <w:i/>
+          <w:iCs/>
+        </w:rPr>
+        <w:t>sisi_a</w:t>
+      </w:r>
+      <w:proofErr w:type="spellEnd"/>
+      <w:r>
+        <w:t xml:space="preserve">, </w:t>
+      </w:r>
+      <w:proofErr w:type="spellStart"/>
+      <w:r>
+        <w:rPr>
+          <w:i/>
+          <w:iCs/>
+        </w:rPr>
+        <w:t>sisi_b</w:t>
+      </w:r>
+      <w:proofErr w:type="spellEnd"/>
+      <w:r>
+        <w:t xml:space="preserve">, dan </w:t>
+      </w:r>
+      <w:r>
+        <w:rPr>
+          <w:i/>
+          <w:iCs/>
+        </w:rPr>
+        <w:t>tinggi</w:t>
+      </w:r>
+      <w:r>
+        <w:t>.</w:t>
+      </w:r>
+    </w:p>
+    <w:p>
+      <w:r>
+        <w:t xml:space="preserve">Objek </w:t>
+      </w:r>
+      <w:r>
+        <w:rPr>
+          <w:i/>
+          <w:iCs/>
+        </w:rPr>
+        <w:t>trapesium1</w:t>
+      </w:r>
+      <w:r>
+        <w:t xml:space="preserve"> merupakan hasil </w:t>
+      </w:r>
+      <w:proofErr w:type="spellStart"/>
+      <w:r>
+        <w:t>instansiasi</w:t>
+      </w:r>
+      <w:proofErr w:type="spellEnd"/>
+      <w:r>
+        <w:t xml:space="preserve"> dari </w:t>
+      </w:r>
+      <w:proofErr w:type="spellStart"/>
+      <w:r>
+        <w:t>class</w:t>
+      </w:r>
+      <w:proofErr w:type="spellEnd"/>
+      <w:r>
+        <w:t xml:space="preserve"> trapesium dengan nilai </w:t>
+      </w:r>
+      <w:proofErr w:type="spellStart"/>
+      <w:r>
+        <w:rPr>
+          <w:i/>
+          <w:iCs/>
+        </w:rPr>
+        <w:t>sisi</w:t>
+      </w:r>
+      <w:r>
+        <w:t>_</w:t>
+      </w:r>
+      <w:r>
+        <w:rPr>
+          <w:i/>
+          <w:iCs/>
+        </w:rPr>
+        <w:t>a</w:t>
+      </w:r>
+      <w:proofErr w:type="spellEnd"/>
+      <w:r>
+        <w:t xml:space="preserve"> = 10, </w:t>
+      </w:r>
+      <w:proofErr w:type="spellStart"/>
+      <w:r>
+        <w:rPr>
+          <w:i/>
+          <w:iCs/>
+        </w:rPr>
+        <w:t>sisi_b</w:t>
+      </w:r>
+      <w:proofErr w:type="spellEnd"/>
+      <w:r>
+        <w:t xml:space="preserve"> = 15, dan </w:t>
+      </w:r>
+      <w:r>
+        <w:rPr>
+          <w:i/>
+          <w:iCs/>
+        </w:rPr>
+        <w:t>tinggi</w:t>
+      </w:r>
+      <w:r>
+        <w:t xml:space="preserve"> = 5, yang kemudian digunakan untuk menjalankan perhitungan luas.</w:t>
+      </w:r>
+    </w:p>
+    <w:p>
+      <w:r>
+        <w:t xml:space="preserve">Atribut terdiri dari </w:t>
+      </w:r>
+      <w:proofErr w:type="spellStart"/>
+      <w:r>
+        <w:rPr>
+          <w:i/>
+          <w:iCs/>
+        </w:rPr>
+        <w:t>sisi_a</w:t>
+      </w:r>
+      <w:proofErr w:type="spellEnd"/>
+      <w:r>
+        <w:rPr>
+          <w:i/>
+          <w:iCs/>
+        </w:rPr>
+        <w:t xml:space="preserve">, </w:t>
+      </w:r>
+      <w:proofErr w:type="spellStart"/>
+      <w:r>
+        <w:rPr>
+          <w:i/>
+          <w:iCs/>
+        </w:rPr>
+        <w:t>sisi_b</w:t>
+      </w:r>
+      <w:proofErr w:type="spellEnd"/>
+      <w:r>
+        <w:rPr>
+          <w:i/>
+          <w:iCs/>
+        </w:rPr>
+        <w:t>,</w:t>
+      </w:r>
+      <w:r>
+        <w:t xml:space="preserve"> dan </w:t>
+      </w:r>
+      <w:r>
+        <w:rPr>
+          <w:i/>
+          <w:iCs/>
+        </w:rPr>
+        <w:t>tinggi</w:t>
+      </w:r>
+      <w:r>
+        <w:t>, yang menyimpan nilai dimensi trapesium dan digunakan dalam proses perhitungan.</w:t>
+      </w:r>
+    </w:p>
+    <w:p>
+      <w:proofErr w:type="spellStart"/>
+      <w:r>
+        <w:t>Method</w:t>
+      </w:r>
+      <w:proofErr w:type="spellEnd"/>
+      <w:r>
+        <w:t xml:space="preserve"> </w:t>
+      </w:r>
+      <w:proofErr w:type="spellStart"/>
+      <w:r>
+        <w:t>luas_trapesium</w:t>
+      </w:r>
+      <w:proofErr w:type="spellEnd"/>
+      <w:r>
+        <w:t xml:space="preserve">() berfungsi menghitung luas menggunakan rumus </w:t>
+      </w:r>
+      <m:oMath>
+        <m:f>
+          <m:fPr>
+            <m:ctrlPr>
+              <w:rPr>
+                <w:rFonts w:ascii="Cambria Math" w:hAnsi="Cambria Math"/>
+              </w:rPr>
+            </m:ctrlPr>
+          </m:fPr>
+          <m:num>
+            <m:r>
+              <w:rPr>
+                <w:rFonts w:ascii="Cambria Math" w:hAnsi="Cambria Math"/>
+              </w:rPr>
+              <m:t>1</m:t>
+            </m:r>
+          </m:num>
+          <m:den>
+            <m:r>
+              <w:rPr>
+                <w:rFonts w:ascii="Cambria Math" w:hAnsi="Cambria Math"/>
+              </w:rPr>
+              <m:t>2</m:t>
+            </m:r>
+          </m:den>
+        </m:f>
+        <m:r>
+          <w:rPr>
+            <w:rFonts w:ascii="Cambria Math" w:hAnsi="Cambria Math"/>
+          </w:rPr>
+          <m:t>×(sisi</m:t>
+        </m:r>
+        <m:r>
+          <m:rPr>
+            <m:sty m:val="p"/>
+          </m:rPr>
+          <w:rPr>
+            <w:rFonts w:ascii="Cambria Math" w:hAnsi="Cambria Math"/>
+          </w:rPr>
+          <m:t>_</m:t>
+        </m:r>
+        <m:r>
+          <w:rPr>
+            <w:rFonts w:ascii="Cambria Math" w:hAnsi="Cambria Math"/>
+          </w:rPr>
+          <m:t>a+sisi</m:t>
+        </m:r>
+        <m:r>
+          <m:rPr>
+            <m:sty m:val="p"/>
+          </m:rPr>
+          <w:rPr>
+            <w:rFonts w:ascii="Cambria Math" w:hAnsi="Cambria Math"/>
+          </w:rPr>
+          <m:t>_</m:t>
+        </m:r>
+        <m:r>
+          <w:rPr>
+            <w:rFonts w:ascii="Cambria Math" w:hAnsi="Cambria Math"/>
+          </w:rPr>
+          <m:t>b)×tinggi</m:t>
+        </m:r>
+      </m:oMath>
+      <w:r>
+        <w:t xml:space="preserve">, kemudian langsung menampilkan </w:t>
+      </w:r>
+      <w:r>
+        <w:t>sebagai berikut:</w:t>
+      </w:r>
+    </w:p>
+    <w:p>
+      <w:pPr>
+        <w:jc w:val="center"/>
+      </w:pPr>
+      <w:r>
+        <w:rPr>
+          <w:noProof/>
+        </w:rPr>
+        <w:drawing>
+          <wp:inline distT="0" distB="0" distL="0" distR="0" wp14:anchorId="0855E30D" wp14:editId="61F41195">
+            <wp:extent cx="2034716" cy="350550"/>
+            <wp:effectExtent l="0" t="0" r="3810" b="0"/>
+            <wp:docPr id="409612098" name="Gambar 1"/>
+            <wp:cNvGraphicFramePr>
+              <a:graphicFrameLocks xmlns:a="http://schemas.openxmlformats.org/drawingml/2006/main" noChangeAspect="1"/>
+            </wp:cNvGraphicFramePr>
+            <a:graphic xmlns:a="http://schemas.openxmlformats.org/drawingml/2006/main">
+              <a:graphicData uri="http://schemas.openxmlformats.org/drawingml/2006/picture">
+                <pic:pic xmlns:pic="http://schemas.openxmlformats.org/drawingml/2006/picture">
+                  <pic:nvPicPr>
+                    <pic:cNvPr id="409612098" name=""/>
+                    <pic:cNvPicPr/>
+                  </pic:nvPicPr>
+                  <pic:blipFill>
+                    <a:blip r:embed="rId12"/>
+                    <a:stretch>
+                      <a:fillRect/>
+                    </a:stretch>
+                  </pic:blipFill>
+                  <pic:spPr>
+                    <a:xfrm>
+                      <a:off x="0" y="0"/>
+                      <a:ext cx="2034716" cy="350550"/>
+                    </a:xfrm>
+                    <a:prstGeom prst="rect">
+                      <a:avLst/>
+                    </a:prstGeom>
+                  </pic:spPr>
+                </pic:pic>
+              </a:graphicData>
+            </a:graphic>
+          </wp:inline>
+        </w:drawing>
+      </w:r>
+    </w:p>
+    <w:p>
+      <w:pPr>
+        <w:pStyle w:val="Judul3"/>
+      </w:pPr>
+      <w:r>
+        <w:t>Kode 3</w:t>
+      </w:r>
+    </w:p>
+    <w:p>
+      <w:pPr>
+        <w:jc w:val="center"/>
+      </w:pPr>
+      <w:r>
+        <w:rPr>
+          <w:noProof/>
+        </w:rPr>
+        <w:drawing>
+          <wp:inline distT="0" distB="0" distL="0" distR="0" wp14:anchorId="73A53857" wp14:editId="52B0ECA8">
+            <wp:extent cx="3234000" cy="2286000"/>
+            <wp:effectExtent l="0" t="0" r="5080" b="0"/>
+            <wp:docPr id="1054051782" name="Gambar 1"/>
+            <wp:cNvGraphicFramePr>
+              <a:graphicFrameLocks xmlns:a="http://schemas.openxmlformats.org/drawingml/2006/main" noChangeAspect="1"/>
+            </wp:cNvGraphicFramePr>
+            <a:graphic xmlns:a="http://schemas.openxmlformats.org/drawingml/2006/main">
+              <a:graphicData uri="http://schemas.openxmlformats.org/drawingml/2006/picture">
+                <pic:pic xmlns:pic="http://schemas.openxmlformats.org/drawingml/2006/picture">
+                  <pic:nvPicPr>
+                    <pic:cNvPr id="1054051782" name=""/>
+                    <pic:cNvPicPr/>
+                  </pic:nvPicPr>
+                  <pic:blipFill rotWithShape="1">
+                    <a:blip r:embed="rId13"/>
+                    <a:srcRect l="9827" t="19192" r="8681" b="9814"/>
+                    <a:stretch>
+                      <a:fillRect/>
+                    </a:stretch>
+                  </pic:blipFill>
+                  <pic:spPr bwMode="auto">
+                    <a:xfrm>
+                      <a:off x="0" y="0"/>
+                      <a:ext cx="3241226" cy="2291108"/>
+                    </a:xfrm>
+                    <a:prstGeom prst="rect">
+                      <a:avLst/>
+                    </a:prstGeom>
+                    <a:ln>
+                      <a:noFill/>
+                    </a:ln>
+                    <a:extLst>
+                      <a:ext uri="{53640926-AAD7-44D8-BBD7-CCE9431645EC}">
+                        <a14:shadowObscured xmlns:a14="http://schemas.microsoft.com/office/drawing/2010/main"/>
+                      </a:ext>
+                    </a:extLst>
+                  </pic:spPr>
+                </pic:pic>
+              </a:graphicData>
+            </a:graphic>
+          </wp:inline>
+        </w:drawing>
+      </w:r>
+    </w:p>
+    <w:p>
+      <w:proofErr w:type="spellStart"/>
+      <w:r>
+        <w:lastRenderedPageBreak/>
+        <w:t>Class</w:t>
+      </w:r>
+      <w:proofErr w:type="spellEnd"/>
+      <w:r>
+        <w:t xml:space="preserve"> </w:t>
+      </w:r>
+      <w:r>
+        <w:rPr>
+          <w:i/>
+          <w:iCs/>
+        </w:rPr>
+        <w:t>Gaji</w:t>
+      </w:r>
+      <w:r>
+        <w:t xml:space="preserve"> digunakan untuk merepresentasikan data penghasilan seseorang serta mekanisme perhitungan pajaknya. </w:t>
+      </w:r>
+      <w:proofErr w:type="spellStart"/>
+      <w:r>
+        <w:t>Class</w:t>
+      </w:r>
+      <w:proofErr w:type="spellEnd"/>
+      <w:r>
+        <w:t xml:space="preserve"> ini memiliki </w:t>
+      </w:r>
+      <w:proofErr w:type="spellStart"/>
+      <w:r>
+        <w:t>constructor</w:t>
+      </w:r>
+      <w:proofErr w:type="spellEnd"/>
+      <w:r>
+        <w:t xml:space="preserve"> untuk menerima nilai gaji dan </w:t>
+      </w:r>
+      <w:proofErr w:type="spellStart"/>
+      <w:r>
+        <w:t>method</w:t>
+      </w:r>
+      <w:proofErr w:type="spellEnd"/>
+      <w:r>
+        <w:t xml:space="preserve"> untuk menentukan apakah dikenakan pajak atau tidak.</w:t>
+      </w:r>
+    </w:p>
+    <w:p>
+      <w:r>
+        <w:t xml:space="preserve">Atribut </w:t>
+      </w:r>
+      <w:proofErr w:type="spellStart"/>
+      <w:r>
+        <w:rPr>
+          <w:i/>
+          <w:iCs/>
+        </w:rPr>
+        <w:t>self.gaji</w:t>
+      </w:r>
+      <w:proofErr w:type="spellEnd"/>
+      <w:r>
+        <w:t xml:space="preserve"> menyimpan nilai penghasilan yang diberikan saat objek dibuat. Nilai ini menjadi dasar dalam proses pengambilan keputusan (percabangan) terkait pajak.</w:t>
+      </w:r>
+    </w:p>
+    <w:p>
+      <w:proofErr w:type="spellStart"/>
+      <w:r>
+        <w:t>Method</w:t>
+      </w:r>
+      <w:proofErr w:type="spellEnd"/>
+      <w:r>
+        <w:t xml:space="preserve"> </w:t>
+      </w:r>
+      <w:proofErr w:type="spellStart"/>
+      <w:r>
+        <w:rPr>
+          <w:i/>
+          <w:iCs/>
+        </w:rPr>
+        <w:t>hitung_pajak</w:t>
+      </w:r>
+      <w:proofErr w:type="spellEnd"/>
+      <w:r>
+        <w:rPr>
+          <w:i/>
+          <w:iCs/>
+        </w:rPr>
+        <w:t>()</w:t>
+      </w:r>
+      <w:r>
+        <w:t xml:space="preserve"> berfungsi untuk melakukan logika percabangan:</w:t>
+      </w:r>
+    </w:p>
+    <w:p>
+      <w:pPr>
+        <w:numPr>
+          <w:ilvl w:val="0"/>
+          <w:numId w:val="7"/>
+        </w:numPr>
+        <w:ind w:hanging="294"/>
+      </w:pPr>
+      <w:r>
+        <w:t xml:space="preserve">Jika </w:t>
+      </w:r>
+      <w:r>
+        <w:rPr>
+          <w:i/>
+          <w:iCs/>
+        </w:rPr>
+        <w:t>gaji</w:t>
+      </w:r>
+      <w:r>
+        <w:t xml:space="preserve"> &gt; 5.000.000, maka dikenakan pajak sebesar 10% dari </w:t>
+      </w:r>
+      <w:r>
+        <w:rPr>
+          <w:i/>
+          <w:iCs/>
+        </w:rPr>
+        <w:t>gaji</w:t>
+      </w:r>
+      <w:r>
+        <w:t xml:space="preserve">. </w:t>
+      </w:r>
+    </w:p>
+    <w:p>
+      <w:pPr>
+        <w:numPr>
+          <w:ilvl w:val="0"/>
+          <w:numId w:val="7"/>
+        </w:numPr>
+        <w:ind w:hanging="294"/>
+      </w:pPr>
+      <w:r>
+        <w:t>Jika tidak, maka tidak dikenakan pajak.</w:t>
+      </w:r>
+      <w:r>
+        <w:t xml:space="preserve"> </w:t>
+      </w:r>
+      <w:r>
+        <w:t xml:space="preserve">Hasil perhitungan langsung ditampilkan menggunakan </w:t>
+      </w:r>
+      <w:proofErr w:type="spellStart"/>
+      <w:r>
+        <w:t>print</w:t>
+      </w:r>
+      <w:proofErr w:type="spellEnd"/>
+      <w:r>
+        <w:t>.</w:t>
+      </w:r>
+    </w:p>
+    <w:p>
+      <w:r>
+        <w:t>Dua objek dibuat:</w:t>
+      </w:r>
+    </w:p>
+    <w:p>
+      <w:pPr>
+        <w:numPr>
+          <w:ilvl w:val="0"/>
+          <w:numId w:val="8"/>
+        </w:numPr>
+        <w:ind w:hanging="294"/>
+      </w:pPr>
+      <w:r>
+        <w:rPr>
+          <w:i/>
+          <w:iCs/>
+        </w:rPr>
+        <w:t>gaji1</w:t>
+      </w:r>
+      <w:r>
+        <w:t xml:space="preserve"> dengan nilai 6.000.000</w:t>
+      </w:r>
+    </w:p>
+    <w:p>
+      <w:pPr>
+        <w:numPr>
+          <w:ilvl w:val="0"/>
+          <w:numId w:val="8"/>
+        </w:numPr>
+        <w:ind w:hanging="294"/>
+      </w:pPr>
+      <w:r>
+        <w:rPr>
+          <w:i/>
+          <w:iCs/>
+        </w:rPr>
+        <w:t>gaji2</w:t>
+      </w:r>
+      <w:r>
+        <w:t xml:space="preserve"> dengan nilai 4.000.000 </w:t>
+      </w:r>
+    </w:p>
+    <w:p>
+      <w:r>
+        <w:t xml:space="preserve">Perulangan digunakan untuk menjalankan </w:t>
+      </w:r>
+      <w:proofErr w:type="spellStart"/>
+      <w:r>
+        <w:t>method</w:t>
+      </w:r>
+      <w:proofErr w:type="spellEnd"/>
+      <w:r>
+        <w:t xml:space="preserve"> </w:t>
+      </w:r>
+      <w:proofErr w:type="spellStart"/>
+      <w:r>
+        <w:rPr>
+          <w:i/>
+          <w:iCs/>
+        </w:rPr>
+        <w:t>hitung_pajak</w:t>
+      </w:r>
+      <w:proofErr w:type="spellEnd"/>
+      <w:r>
+        <w:rPr>
+          <w:i/>
+          <w:iCs/>
+        </w:rPr>
+        <w:t>()</w:t>
+      </w:r>
+      <w:r>
+        <w:t xml:space="preserve"> pada setiap objek dalam </w:t>
+      </w:r>
+      <w:proofErr w:type="spellStart"/>
+      <w:r>
+        <w:t>list</w:t>
+      </w:r>
+      <w:proofErr w:type="spellEnd"/>
+      <w:r>
+        <w:t>.</w:t>
+      </w:r>
+    </w:p>
+    <w:p>
+      <w:pPr>
+        <w:jc w:val="center"/>
+      </w:pPr>
+      <w:r>
+        <w:rPr>
+          <w:noProof/>
+        </w:rPr>
+        <w:drawing>
+          <wp:inline distT="0" distB="0" distL="0" distR="0" wp14:anchorId="61AF0E52" wp14:editId="776AC1E0">
+            <wp:extent cx="3322320" cy="314960"/>
+            <wp:effectExtent l="0" t="0" r="0" b="8890"/>
+            <wp:docPr id="1849065206" name="Gambar 1"/>
+            <wp:cNvGraphicFramePr>
+              <a:graphicFrameLocks xmlns:a="http://schemas.openxmlformats.org/drawingml/2006/main" noChangeAspect="1"/>
+            </wp:cNvGraphicFramePr>
+            <a:graphic xmlns:a="http://schemas.openxmlformats.org/drawingml/2006/main">
+              <a:graphicData uri="http://schemas.openxmlformats.org/drawingml/2006/picture">
+                <pic:pic xmlns:pic="http://schemas.openxmlformats.org/drawingml/2006/picture">
+                  <pic:nvPicPr>
+                    <pic:cNvPr id="1849065206" name=""/>
+                    <pic:cNvPicPr/>
+                  </pic:nvPicPr>
+                  <pic:blipFill rotWithShape="1">
+                    <a:blip r:embed="rId14"/>
+                    <a:srcRect r="34081"/>
+                    <a:stretch>
+                      <a:fillRect/>
+                    </a:stretch>
+                  </pic:blipFill>
+                  <pic:spPr bwMode="auto">
+                    <a:xfrm>
+                      <a:off x="0" y="0"/>
+                      <a:ext cx="3322320" cy="314960"/>
+                    </a:xfrm>
+                    <a:prstGeom prst="rect">
+                      <a:avLst/>
+                    </a:prstGeom>
+                    <a:ln>
+                      <a:noFill/>
+                    </a:ln>
+                    <a:extLst>
+                      <a:ext uri="{53640926-AAD7-44D8-BBD7-CCE9431645EC}">
+                        <a14:shadowObscured xmlns:a14="http://schemas.microsoft.com/office/drawing/2010/main"/>
+                      </a:ext>
+                    </a:extLst>
+                  </pic:spPr>
+                </pic:pic>
+              </a:graphicData>
+            </a:graphic>
+          </wp:inline>
+        </w:drawing>
+      </w:r>
+    </w:p>
+    <w:p/>
+    <w:p/>
+    <w:p/>
+    <w:p/>
+    <w:p/>
+    <w:p>
       <w:r>
         <w:br w:type="page"/>
       </w:r>
@@ -935,7 +2449,7 @@
         <w:lastRenderedPageBreak/>
         <w:br/>
       </w:r>
-      <w:bookmarkStart w:id="2" w:name="_Toc226637612"/>
+      <w:bookmarkStart w:id="2" w:name="_Toc227252100"/>
       <w:proofErr w:type="spellStart"/>
       <w:r>
         <w:rPr>
@@ -968,24 +2482,1746 @@
     </w:p>
     <w:p>
       <w:pPr>
-        <w:spacing w:after="160" w:line="278" w:lineRule="auto"/>
+        <w:pStyle w:val="Judul2"/>
+      </w:pPr>
+      <w:r>
+        <w:t xml:space="preserve"> Latar Belakang</w:t>
+      </w:r>
+    </w:p>
+    <w:p>
+      <w:pPr>
+        <w:rPr>
+          <w:lang w:eastAsia="id-ID"/>
+        </w:rPr>
+      </w:pPr>
+      <w:r>
+        <w:rPr>
+          <w:lang w:eastAsia="id-ID"/>
+        </w:rPr>
+        <w:t xml:space="preserve">Dalam paradigma </w:t>
+      </w:r>
+      <w:proofErr w:type="spellStart"/>
+      <w:r>
+        <w:rPr>
+          <w:i/>
+          <w:iCs/>
+          <w:lang w:eastAsia="id-ID"/>
+        </w:rPr>
+        <w:t>Object-Oriented</w:t>
+      </w:r>
+      <w:proofErr w:type="spellEnd"/>
+      <w:r>
+        <w:rPr>
+          <w:i/>
+          <w:iCs/>
+          <w:lang w:eastAsia="id-ID"/>
+        </w:rPr>
+        <w:t xml:space="preserve"> </w:t>
+      </w:r>
+      <w:proofErr w:type="spellStart"/>
+      <w:r>
+        <w:rPr>
+          <w:i/>
+          <w:iCs/>
+          <w:lang w:eastAsia="id-ID"/>
+        </w:rPr>
+        <w:t>Programming</w:t>
+      </w:r>
+      <w:proofErr w:type="spellEnd"/>
+      <w:r>
+        <w:rPr>
+          <w:lang w:eastAsia="id-ID"/>
+        </w:rPr>
+        <w:t xml:space="preserve"> (OOP), </w:t>
+      </w:r>
+      <w:proofErr w:type="spellStart"/>
+      <w:r>
+        <w:rPr>
+          <w:i/>
+          <w:iCs/>
+          <w:lang w:eastAsia="id-ID"/>
+        </w:rPr>
+        <w:t>class</w:t>
+      </w:r>
+      <w:proofErr w:type="spellEnd"/>
+      <w:r>
+        <w:rPr>
+          <w:lang w:eastAsia="id-ID"/>
+        </w:rPr>
+        <w:t xml:space="preserve"> dan </w:t>
+      </w:r>
+      <w:proofErr w:type="spellStart"/>
+      <w:r>
+        <w:rPr>
+          <w:i/>
+          <w:iCs/>
+          <w:lang w:eastAsia="id-ID"/>
+        </w:rPr>
+        <w:t>object</w:t>
+      </w:r>
+      <w:proofErr w:type="spellEnd"/>
+      <w:r>
+        <w:rPr>
+          <w:lang w:eastAsia="id-ID"/>
+        </w:rPr>
+        <w:t xml:space="preserve"> merupakan konsep fundamental yang menjadi dasar dalam membangun sistem berbasis objek. </w:t>
+      </w:r>
+      <w:proofErr w:type="spellStart"/>
+      <w:r>
+        <w:rPr>
+          <w:lang w:eastAsia="id-ID"/>
+        </w:rPr>
+        <w:t>Class</w:t>
+      </w:r>
+      <w:proofErr w:type="spellEnd"/>
+      <w:r>
+        <w:rPr>
+          <w:lang w:eastAsia="id-ID"/>
+        </w:rPr>
+        <w:t xml:space="preserve"> berfungsi sebagai cetakan (</w:t>
+      </w:r>
+      <w:proofErr w:type="spellStart"/>
+      <w:r>
+        <w:rPr>
+          <w:i/>
+          <w:iCs/>
+          <w:lang w:eastAsia="id-ID"/>
+        </w:rPr>
+        <w:t>blueprint</w:t>
+      </w:r>
+      <w:proofErr w:type="spellEnd"/>
+      <w:r>
+        <w:rPr>
+          <w:lang w:eastAsia="id-ID"/>
+        </w:rPr>
+        <w:t xml:space="preserve">) yang mendefinisikan atribut dan </w:t>
+      </w:r>
+      <w:proofErr w:type="spellStart"/>
+      <w:r>
+        <w:rPr>
+          <w:lang w:eastAsia="id-ID"/>
+        </w:rPr>
+        <w:t>method</w:t>
+      </w:r>
+      <w:proofErr w:type="spellEnd"/>
+      <w:r>
+        <w:rPr>
+          <w:lang w:eastAsia="id-ID"/>
+        </w:rPr>
+        <w:t xml:space="preserve">, sedangkan </w:t>
+      </w:r>
+      <w:proofErr w:type="spellStart"/>
+      <w:r>
+        <w:rPr>
+          <w:lang w:eastAsia="id-ID"/>
+        </w:rPr>
+        <w:t>object</w:t>
+      </w:r>
+      <w:proofErr w:type="spellEnd"/>
+      <w:r>
+        <w:rPr>
+          <w:lang w:eastAsia="id-ID"/>
+        </w:rPr>
+        <w:t xml:space="preserve"> merupakan </w:t>
+      </w:r>
+      <w:proofErr w:type="spellStart"/>
+      <w:r>
+        <w:rPr>
+          <w:lang w:eastAsia="id-ID"/>
+        </w:rPr>
+        <w:t>instansiasi</w:t>
+      </w:r>
+      <w:proofErr w:type="spellEnd"/>
+      <w:r>
+        <w:rPr>
+          <w:lang w:eastAsia="id-ID"/>
+        </w:rPr>
+        <w:t xml:space="preserve"> nyata dari </w:t>
+      </w:r>
+      <w:proofErr w:type="spellStart"/>
+      <w:r>
+        <w:rPr>
+          <w:lang w:eastAsia="id-ID"/>
+        </w:rPr>
+        <w:t>class</w:t>
+      </w:r>
+      <w:proofErr w:type="spellEnd"/>
+      <w:r>
+        <w:rPr>
+          <w:lang w:eastAsia="id-ID"/>
+        </w:rPr>
+        <w:t xml:space="preserve"> tersebut.</w:t>
+      </w:r>
+    </w:p>
+    <w:p>
+      <w:pPr>
+        <w:rPr>
+          <w:lang w:eastAsia="id-ID"/>
+        </w:rPr>
+      </w:pPr>
+      <w:r>
+        <w:rPr>
+          <w:lang w:eastAsia="id-ID"/>
+        </w:rPr>
+        <w:t xml:space="preserve">Pemahaman mengenai </w:t>
+      </w:r>
+      <w:proofErr w:type="spellStart"/>
+      <w:r>
+        <w:rPr>
+          <w:lang w:eastAsia="id-ID"/>
+        </w:rPr>
+        <w:t>class</w:t>
+      </w:r>
+      <w:proofErr w:type="spellEnd"/>
+      <w:r>
+        <w:rPr>
+          <w:lang w:eastAsia="id-ID"/>
+        </w:rPr>
+        <w:t xml:space="preserve"> dan </w:t>
+      </w:r>
+      <w:proofErr w:type="spellStart"/>
+      <w:r>
+        <w:rPr>
+          <w:lang w:eastAsia="id-ID"/>
+        </w:rPr>
+        <w:t>object</w:t>
+      </w:r>
+      <w:proofErr w:type="spellEnd"/>
+      <w:r>
+        <w:rPr>
+          <w:lang w:eastAsia="id-ID"/>
+        </w:rPr>
+        <w:t xml:space="preserve"> sangat penting karena menjadi fondasi dalam pengembangan perangkat lunak yang modular, terstruktur, dan mudah dikembangkan. Dengan memanfaatkan konsep ini, data dan fungsi dapat dikemas dalam satu kesatuan yang logis.</w:t>
+      </w:r>
+    </w:p>
+    <w:p>
+      <w:pPr>
+        <w:pStyle w:val="Judul2"/>
+        <w:rPr>
+          <w:rFonts w:eastAsia="Times New Roman"/>
+          <w:lang w:eastAsia="id-ID"/>
+        </w:rPr>
+      </w:pPr>
+      <w:r>
+        <w:rPr>
+          <w:rFonts w:eastAsia="Times New Roman"/>
+          <w:lang w:eastAsia="id-ID"/>
+        </w:rPr>
+        <w:t xml:space="preserve"> Tujuan Praktikum</w:t>
+      </w:r>
+    </w:p>
+    <w:p>
+      <w:pPr>
+        <w:pStyle w:val="DaftarParagraf"/>
+        <w:numPr>
+          <w:ilvl w:val="6"/>
+          <w:numId w:val="4"/>
+        </w:numPr>
+        <w:ind w:left="709" w:hanging="283"/>
+        <w:rPr>
+          <w:rFonts w:hAnsi="Symbol"/>
+          <w:lang w:eastAsia="id-ID"/>
+        </w:rPr>
+      </w:pPr>
+      <w:r>
+        <w:rPr>
+          <w:lang w:eastAsia="id-ID"/>
+        </w:rPr>
+        <w:t xml:space="preserve">Memahami konsep </w:t>
+      </w:r>
+      <w:proofErr w:type="spellStart"/>
+      <w:r>
+        <w:rPr>
+          <w:lang w:eastAsia="id-ID"/>
+        </w:rPr>
+        <w:t>class</w:t>
+      </w:r>
+      <w:proofErr w:type="spellEnd"/>
+      <w:r>
+        <w:rPr>
+          <w:lang w:eastAsia="id-ID"/>
+        </w:rPr>
+        <w:t xml:space="preserve"> dan </w:t>
+      </w:r>
+      <w:proofErr w:type="spellStart"/>
+      <w:r>
+        <w:rPr>
+          <w:lang w:eastAsia="id-ID"/>
+        </w:rPr>
+        <w:t>object</w:t>
+      </w:r>
+      <w:proofErr w:type="spellEnd"/>
+      <w:r>
+        <w:rPr>
+          <w:lang w:eastAsia="id-ID"/>
+        </w:rPr>
+        <w:t xml:space="preserve"> dalam OOP. </w:t>
+      </w:r>
+    </w:p>
+    <w:p>
+      <w:pPr>
+        <w:pStyle w:val="DaftarParagraf"/>
+        <w:numPr>
+          <w:ilvl w:val="6"/>
+          <w:numId w:val="4"/>
+        </w:numPr>
+        <w:ind w:left="709" w:hanging="283"/>
+        <w:rPr>
+          <w:rFonts w:hAnsi="Symbol"/>
+          <w:lang w:eastAsia="id-ID"/>
+        </w:rPr>
+      </w:pPr>
+      <w:r>
+        <w:rPr>
+          <w:lang w:eastAsia="id-ID"/>
+        </w:rPr>
+        <w:t xml:space="preserve">Mampu membuat </w:t>
+      </w:r>
+      <w:proofErr w:type="spellStart"/>
+      <w:r>
+        <w:rPr>
+          <w:lang w:eastAsia="id-ID"/>
+        </w:rPr>
+        <w:t>class</w:t>
+      </w:r>
+      <w:proofErr w:type="spellEnd"/>
+      <w:r>
+        <w:rPr>
+          <w:lang w:eastAsia="id-ID"/>
+        </w:rPr>
+        <w:t xml:space="preserve"> sederhana. </w:t>
+      </w:r>
+    </w:p>
+    <w:p>
+      <w:pPr>
+        <w:pStyle w:val="DaftarParagraf"/>
+        <w:numPr>
+          <w:ilvl w:val="6"/>
+          <w:numId w:val="4"/>
+        </w:numPr>
+        <w:ind w:left="709" w:hanging="283"/>
+        <w:rPr>
+          <w:rFonts w:hAnsi="Symbol"/>
+          <w:lang w:eastAsia="id-ID"/>
+        </w:rPr>
+      </w:pPr>
+      <w:r>
+        <w:rPr>
+          <w:lang w:eastAsia="id-ID"/>
+        </w:rPr>
+        <w:t xml:space="preserve">Mampu melakukan </w:t>
+      </w:r>
+      <w:proofErr w:type="spellStart"/>
+      <w:r>
+        <w:rPr>
+          <w:lang w:eastAsia="id-ID"/>
+        </w:rPr>
+        <w:t>instansiasi</w:t>
+      </w:r>
+      <w:proofErr w:type="spellEnd"/>
+      <w:r>
+        <w:rPr>
+          <w:lang w:eastAsia="id-ID"/>
+        </w:rPr>
+        <w:t xml:space="preserve"> </w:t>
+      </w:r>
+      <w:proofErr w:type="spellStart"/>
+      <w:r>
+        <w:rPr>
+          <w:lang w:eastAsia="id-ID"/>
+        </w:rPr>
+        <w:t>object</w:t>
+      </w:r>
+      <w:proofErr w:type="spellEnd"/>
+      <w:r>
+        <w:rPr>
+          <w:lang w:eastAsia="id-ID"/>
+        </w:rPr>
+        <w:t xml:space="preserve"> dari </w:t>
+      </w:r>
+      <w:proofErr w:type="spellStart"/>
+      <w:r>
+        <w:rPr>
+          <w:lang w:eastAsia="id-ID"/>
+        </w:rPr>
+        <w:t>class</w:t>
+      </w:r>
+      <w:proofErr w:type="spellEnd"/>
+      <w:r>
+        <w:rPr>
+          <w:lang w:eastAsia="id-ID"/>
+        </w:rPr>
+        <w:t xml:space="preserve">. </w:t>
+      </w:r>
+    </w:p>
+    <w:p>
+      <w:pPr>
+        <w:pStyle w:val="DaftarParagraf"/>
+        <w:numPr>
+          <w:ilvl w:val="6"/>
+          <w:numId w:val="4"/>
+        </w:numPr>
+        <w:ind w:left="709" w:hanging="283"/>
+        <w:rPr>
+          <w:rFonts w:hAnsi="Symbol"/>
+          <w:lang w:eastAsia="id-ID"/>
+        </w:rPr>
+      </w:pPr>
+      <w:r>
+        <w:rPr>
+          <w:lang w:eastAsia="id-ID"/>
+        </w:rPr>
+        <w:t xml:space="preserve">Memahami hubungan antara atribut dan </w:t>
+      </w:r>
+      <w:proofErr w:type="spellStart"/>
+      <w:r>
+        <w:rPr>
+          <w:lang w:eastAsia="id-ID"/>
+        </w:rPr>
+        <w:t>method</w:t>
+      </w:r>
+      <w:proofErr w:type="spellEnd"/>
+      <w:r>
+        <w:rPr>
+          <w:lang w:eastAsia="id-ID"/>
+        </w:rPr>
+        <w:t xml:space="preserve"> dalam </w:t>
+      </w:r>
+      <w:proofErr w:type="spellStart"/>
+      <w:r>
+        <w:rPr>
+          <w:lang w:eastAsia="id-ID"/>
+        </w:rPr>
+        <w:t>object</w:t>
+      </w:r>
+      <w:proofErr w:type="spellEnd"/>
+      <w:r>
+        <w:rPr>
+          <w:lang w:eastAsia="id-ID"/>
+        </w:rPr>
+        <w:t>.</w:t>
+      </w:r>
+    </w:p>
+    <w:p>
+      <w:pPr>
+        <w:pStyle w:val="DaftarParagraf"/>
+        <w:numPr>
+          <w:ilvl w:val="6"/>
+          <w:numId w:val="4"/>
+        </w:numPr>
+        <w:ind w:left="709" w:hanging="283"/>
+        <w:rPr>
+          <w:rFonts w:hAnsi="Symbol"/>
+          <w:lang w:eastAsia="id-ID"/>
+        </w:rPr>
+      </w:pPr>
+      <w:r>
+        <w:rPr>
+          <w:lang w:eastAsia="id-ID"/>
+        </w:rPr>
+        <w:t xml:space="preserve">Mengimplementasikan </w:t>
+      </w:r>
+      <w:proofErr w:type="spellStart"/>
+      <w:r>
+        <w:rPr>
+          <w:lang w:eastAsia="id-ID"/>
+        </w:rPr>
+        <w:t>class</w:t>
+      </w:r>
+      <w:proofErr w:type="spellEnd"/>
+      <w:r>
+        <w:rPr>
+          <w:lang w:eastAsia="id-ID"/>
+        </w:rPr>
+        <w:t xml:space="preserve"> dan </w:t>
+      </w:r>
+      <w:proofErr w:type="spellStart"/>
+      <w:r>
+        <w:rPr>
+          <w:lang w:eastAsia="id-ID"/>
+        </w:rPr>
+        <w:t>object</w:t>
+      </w:r>
+      <w:proofErr w:type="spellEnd"/>
+      <w:r>
+        <w:rPr>
+          <w:lang w:eastAsia="id-ID"/>
+        </w:rPr>
+        <w:t xml:space="preserve"> dalam </w:t>
+      </w:r>
+      <w:proofErr w:type="spellStart"/>
+      <w:r>
+        <w:rPr>
+          <w:lang w:eastAsia="id-ID"/>
+        </w:rPr>
+        <w:t>Python</w:t>
+      </w:r>
+      <w:proofErr w:type="spellEnd"/>
+      <w:r>
+        <w:rPr>
+          <w:lang w:eastAsia="id-ID"/>
+        </w:rPr>
+        <w:t>.</w:t>
+      </w:r>
+    </w:p>
+    <w:p>
+      <w:pPr>
+        <w:pStyle w:val="Judul2"/>
+        <w:rPr>
+          <w:rFonts w:eastAsia="Times New Roman"/>
+          <w:lang w:eastAsia="id-ID"/>
+        </w:rPr>
+      </w:pPr>
+      <w:r>
+        <w:rPr>
+          <w:rFonts w:eastAsia="Times New Roman"/>
+          <w:lang w:eastAsia="id-ID"/>
+        </w:rPr>
+        <w:t xml:space="preserve"> </w:t>
+      </w:r>
+      <w:r>
+        <w:rPr>
+          <w:rFonts w:eastAsia="Times New Roman"/>
+          <w:lang w:eastAsia="id-ID"/>
+        </w:rPr>
+        <w:t>Dasar Teori</w:t>
+      </w:r>
+    </w:p>
+    <w:p>
+      <w:pPr>
+        <w:rPr>
+          <w:lang w:eastAsia="id-ID"/>
+        </w:rPr>
+      </w:pPr>
+      <w:proofErr w:type="spellStart"/>
+      <w:r>
+        <w:rPr>
+          <w:lang w:eastAsia="id-ID"/>
+        </w:rPr>
+        <w:t>Class</w:t>
+      </w:r>
+      <w:proofErr w:type="spellEnd"/>
+      <w:r>
+        <w:rPr>
+          <w:lang w:eastAsia="id-ID"/>
+        </w:rPr>
+        <w:t xml:space="preserve"> </w:t>
+      </w:r>
+      <w:r>
+        <w:rPr>
+          <w:lang w:eastAsia="id-ID"/>
+        </w:rPr>
+        <w:t xml:space="preserve">adalah struktur yang digunakan untuk mendefinisikan atribut (data) dan </w:t>
+      </w:r>
+      <w:proofErr w:type="spellStart"/>
+      <w:r>
+        <w:rPr>
+          <w:lang w:eastAsia="id-ID"/>
+        </w:rPr>
+        <w:t>method</w:t>
+      </w:r>
+      <w:proofErr w:type="spellEnd"/>
+      <w:r>
+        <w:rPr>
+          <w:lang w:eastAsia="id-ID"/>
+        </w:rPr>
+        <w:t xml:space="preserve"> (fungsi) dalam satu kesatuan.</w:t>
+      </w:r>
+    </w:p>
+    <w:p>
+      <w:pPr>
+        <w:rPr>
+          <w:lang w:eastAsia="id-ID"/>
+        </w:rPr>
+      </w:pPr>
+      <w:proofErr w:type="spellStart"/>
+      <w:r>
+        <w:rPr>
+          <w:lang w:eastAsia="id-ID"/>
+        </w:rPr>
+        <w:t>Object</w:t>
+      </w:r>
+      <w:proofErr w:type="spellEnd"/>
+      <w:r>
+        <w:rPr>
+          <w:lang w:eastAsia="id-ID"/>
+        </w:rPr>
+        <w:t xml:space="preserve"> </w:t>
+      </w:r>
+      <w:r>
+        <w:rPr>
+          <w:lang w:eastAsia="id-ID"/>
+        </w:rPr>
+        <w:t xml:space="preserve">adalah </w:t>
+      </w:r>
+      <w:proofErr w:type="spellStart"/>
+      <w:r>
+        <w:rPr>
+          <w:lang w:eastAsia="id-ID"/>
+        </w:rPr>
+        <w:t>instance</w:t>
+      </w:r>
+      <w:proofErr w:type="spellEnd"/>
+      <w:r>
+        <w:rPr>
+          <w:lang w:eastAsia="id-ID"/>
+        </w:rPr>
+        <w:t xml:space="preserve"> dari </w:t>
+      </w:r>
+      <w:proofErr w:type="spellStart"/>
+      <w:r>
+        <w:rPr>
+          <w:lang w:eastAsia="id-ID"/>
+        </w:rPr>
+        <w:t>class</w:t>
+      </w:r>
+      <w:proofErr w:type="spellEnd"/>
+      <w:r>
+        <w:rPr>
+          <w:lang w:eastAsia="id-ID"/>
+        </w:rPr>
+        <w:t xml:space="preserve"> yang memiliki nilai atribut dan dapat menjalankan </w:t>
+      </w:r>
+      <w:proofErr w:type="spellStart"/>
+      <w:r>
+        <w:rPr>
+          <w:lang w:eastAsia="id-ID"/>
+        </w:rPr>
+        <w:t>method</w:t>
+      </w:r>
+      <w:proofErr w:type="spellEnd"/>
+      <w:r>
+        <w:rPr>
+          <w:lang w:eastAsia="id-ID"/>
+        </w:rPr>
+        <w:t>.</w:t>
+      </w:r>
+    </w:p>
+    <w:p>
+      <w:pPr>
+        <w:rPr>
+          <w:lang w:eastAsia="id-ID"/>
+        </w:rPr>
+      </w:pPr>
+      <w:r>
+        <w:rPr>
+          <w:lang w:eastAsia="id-ID"/>
+        </w:rPr>
+        <w:t xml:space="preserve">Hubungan </w:t>
+      </w:r>
+      <w:proofErr w:type="spellStart"/>
+      <w:r>
+        <w:rPr>
+          <w:lang w:eastAsia="id-ID"/>
+        </w:rPr>
+        <w:t>Class</w:t>
+      </w:r>
+      <w:proofErr w:type="spellEnd"/>
+      <w:r>
+        <w:rPr>
+          <w:lang w:eastAsia="id-ID"/>
+        </w:rPr>
+        <w:t xml:space="preserve"> dan </w:t>
+      </w:r>
+      <w:proofErr w:type="spellStart"/>
+      <w:r>
+        <w:rPr>
+          <w:lang w:eastAsia="id-ID"/>
+        </w:rPr>
+        <w:t>Object</w:t>
+      </w:r>
+      <w:proofErr w:type="spellEnd"/>
+      <w:r>
+        <w:rPr>
+          <w:lang w:eastAsia="id-ID"/>
+        </w:rPr>
+        <w:t xml:space="preserve"> adalah s</w:t>
+      </w:r>
+      <w:r>
+        <w:rPr>
+          <w:lang w:eastAsia="id-ID"/>
+        </w:rPr>
+        <w:t xml:space="preserve">atu </w:t>
+      </w:r>
+      <w:proofErr w:type="spellStart"/>
+      <w:r>
+        <w:rPr>
+          <w:lang w:eastAsia="id-ID"/>
+        </w:rPr>
+        <w:t>class</w:t>
+      </w:r>
+      <w:proofErr w:type="spellEnd"/>
+      <w:r>
+        <w:rPr>
+          <w:lang w:eastAsia="id-ID"/>
+        </w:rPr>
+        <w:t xml:space="preserve"> dapat menghasilkan banyak </w:t>
+      </w:r>
+      <w:proofErr w:type="spellStart"/>
+      <w:r>
+        <w:rPr>
+          <w:lang w:eastAsia="id-ID"/>
+        </w:rPr>
+        <w:t>object</w:t>
+      </w:r>
+      <w:proofErr w:type="spellEnd"/>
+      <w:r>
+        <w:rPr>
+          <w:lang w:eastAsia="id-ID"/>
+        </w:rPr>
+        <w:t xml:space="preserve"> dengan nilai atribut yang berbeda, namun tetap memiliki struktur dan perilaku yang sama.</w:t>
+      </w:r>
+    </w:p>
+    <w:p>
+      <w:pPr>
+        <w:pStyle w:val="Judul2"/>
+        <w:rPr>
+          <w:lang w:eastAsia="id-ID"/>
+        </w:rPr>
+      </w:pPr>
+      <w:r>
+        <w:rPr>
+          <w:lang w:eastAsia="id-ID"/>
+        </w:rPr>
+        <w:lastRenderedPageBreak/>
+        <w:t xml:space="preserve"> Praktikum</w:t>
+      </w:r>
+    </w:p>
+    <w:p>
+      <w:pPr>
+        <w:pStyle w:val="Judul3"/>
+        <w:rPr>
+          <w:lang w:eastAsia="id-ID"/>
+        </w:rPr>
+      </w:pPr>
+      <w:r>
+        <w:rPr>
+          <w:lang w:eastAsia="id-ID"/>
+        </w:rPr>
+        <w:t>Kode 1 (Tambang)</w:t>
+      </w:r>
+    </w:p>
+    <w:p>
+      <w:pPr>
+        <w:jc w:val="center"/>
+        <w:rPr>
+          <w:lang w:eastAsia="id-ID"/>
+        </w:rPr>
+      </w:pPr>
+      <w:r>
+        <w:rPr>
+          <w:noProof/>
+          <w:lang w:eastAsia="id-ID"/>
+        </w:rPr>
+        <w:drawing>
+          <wp:inline distT="0" distB="0" distL="0" distR="0" wp14:anchorId="17B95EF3" wp14:editId="12553C68">
+            <wp:extent cx="4488180" cy="1737611"/>
+            <wp:effectExtent l="0" t="0" r="7620" b="0"/>
+            <wp:docPr id="1376037531" name="Gambar 1"/>
+            <wp:cNvGraphicFramePr>
+              <a:graphicFrameLocks xmlns:a="http://schemas.openxmlformats.org/drawingml/2006/main" noChangeAspect="1"/>
+            </wp:cNvGraphicFramePr>
+            <a:graphic xmlns:a="http://schemas.openxmlformats.org/drawingml/2006/main">
+              <a:graphicData uri="http://schemas.openxmlformats.org/drawingml/2006/picture">
+                <pic:pic xmlns:pic="http://schemas.openxmlformats.org/drawingml/2006/picture">
+                  <pic:nvPicPr>
+                    <pic:cNvPr id="1376037531" name=""/>
+                    <pic:cNvPicPr/>
+                  </pic:nvPicPr>
+                  <pic:blipFill rotWithShape="1">
+                    <a:blip r:embed="rId15"/>
+                    <a:srcRect l="6804" t="18626" r="6110" b="13282"/>
+                    <a:stretch>
+                      <a:fillRect/>
+                    </a:stretch>
+                  </pic:blipFill>
+                  <pic:spPr bwMode="auto">
+                    <a:xfrm>
+                      <a:off x="0" y="0"/>
+                      <a:ext cx="4488828" cy="1737862"/>
+                    </a:xfrm>
+                    <a:prstGeom prst="rect">
+                      <a:avLst/>
+                    </a:prstGeom>
+                    <a:ln>
+                      <a:noFill/>
+                    </a:ln>
+                    <a:extLst>
+                      <a:ext uri="{53640926-AAD7-44D8-BBD7-CCE9431645EC}">
+                        <a14:shadowObscured xmlns:a14="http://schemas.microsoft.com/office/drawing/2010/main"/>
+                      </a:ext>
+                    </a:extLst>
+                  </pic:spPr>
+                </pic:pic>
+              </a:graphicData>
+            </a:graphic>
+          </wp:inline>
+        </w:drawing>
+      </w:r>
+    </w:p>
+    <w:p>
+      <w:pPr>
+        <w:rPr>
+          <w:lang w:eastAsia="id-ID"/>
+        </w:rPr>
+      </w:pPr>
+      <w:proofErr w:type="spellStart"/>
+      <w:r>
+        <w:rPr>
+          <w:lang w:eastAsia="id-ID"/>
+        </w:rPr>
+        <w:t>Class</w:t>
+      </w:r>
+      <w:proofErr w:type="spellEnd"/>
+      <w:r>
+        <w:rPr>
+          <w:lang w:eastAsia="id-ID"/>
+        </w:rPr>
+        <w:t xml:space="preserve"> </w:t>
+      </w:r>
+      <w:r>
+        <w:rPr>
+          <w:i/>
+          <w:iCs/>
+          <w:lang w:eastAsia="id-ID"/>
+        </w:rPr>
+        <w:t>tambang</w:t>
+      </w:r>
+      <w:r>
+        <w:rPr>
+          <w:lang w:eastAsia="id-ID"/>
+        </w:rPr>
+        <w:t xml:space="preserve"> merupakan </w:t>
+      </w:r>
+      <w:proofErr w:type="spellStart"/>
+      <w:r>
+        <w:rPr>
+          <w:lang w:eastAsia="id-ID"/>
+        </w:rPr>
+        <w:t>blueprint</w:t>
+      </w:r>
+      <w:proofErr w:type="spellEnd"/>
+      <w:r>
+        <w:rPr>
+          <w:lang w:eastAsia="id-ID"/>
+        </w:rPr>
+        <w:t xml:space="preserve"> yang digunakan untuk merepresentasikan data tambang mineral, yang mencakup nama tambang, simbol kimia, dan berat.</w:t>
+      </w:r>
+      <w:r>
+        <w:rPr>
+          <w:lang w:eastAsia="id-ID"/>
+        </w:rPr>
+        <w:t xml:space="preserve"> </w:t>
+      </w:r>
+    </w:p>
+    <w:p>
+      <w:pPr>
+        <w:rPr>
+          <w:lang w:eastAsia="id-ID"/>
+        </w:rPr>
+      </w:pPr>
+      <w:r>
+        <w:rPr>
+          <w:lang w:eastAsia="id-ID"/>
+        </w:rPr>
+        <w:t xml:space="preserve">Objek </w:t>
+      </w:r>
+      <w:r>
+        <w:rPr>
+          <w:i/>
+          <w:iCs/>
+          <w:lang w:eastAsia="id-ID"/>
+        </w:rPr>
+        <w:t>tambang1</w:t>
+      </w:r>
+      <w:r>
+        <w:rPr>
+          <w:lang w:eastAsia="id-ID"/>
+        </w:rPr>
+        <w:t xml:space="preserve"> dan </w:t>
+      </w:r>
+      <w:r>
+        <w:rPr>
+          <w:i/>
+          <w:iCs/>
+          <w:lang w:eastAsia="id-ID"/>
+        </w:rPr>
+        <w:t>tambang2</w:t>
+      </w:r>
+      <w:r>
+        <w:rPr>
+          <w:lang w:eastAsia="id-ID"/>
+        </w:rPr>
+        <w:t xml:space="preserve"> adalah hasil </w:t>
+      </w:r>
+      <w:proofErr w:type="spellStart"/>
+      <w:r>
+        <w:rPr>
+          <w:lang w:eastAsia="id-ID"/>
+        </w:rPr>
+        <w:t>instansiasi</w:t>
+      </w:r>
+      <w:proofErr w:type="spellEnd"/>
+      <w:r>
+        <w:rPr>
+          <w:lang w:eastAsia="id-ID"/>
+        </w:rPr>
+        <w:t xml:space="preserve"> dari </w:t>
+      </w:r>
+      <w:proofErr w:type="spellStart"/>
+      <w:r>
+        <w:rPr>
+          <w:lang w:eastAsia="id-ID"/>
+        </w:rPr>
+        <w:t>class</w:t>
+      </w:r>
+      <w:proofErr w:type="spellEnd"/>
+      <w:r>
+        <w:rPr>
+          <w:lang w:eastAsia="id-ID"/>
+        </w:rPr>
+        <w:t xml:space="preserve"> tambang, masing-masing menyimpan data berbeda yaitu tambang emas dan tambang perak.</w:t>
+      </w:r>
+    </w:p>
+    <w:p>
+      <w:pPr>
+        <w:rPr>
+          <w:lang w:eastAsia="id-ID"/>
+        </w:rPr>
+      </w:pPr>
+      <w:r>
+        <w:rPr>
+          <w:lang w:eastAsia="id-ID"/>
+        </w:rPr>
+        <w:t xml:space="preserve">Atribut terdiri dari </w:t>
+      </w:r>
+      <w:proofErr w:type="spellStart"/>
+      <w:r>
+        <w:rPr>
+          <w:i/>
+          <w:iCs/>
+          <w:lang w:eastAsia="id-ID"/>
+        </w:rPr>
+        <w:t>nama_tambang</w:t>
+      </w:r>
+      <w:proofErr w:type="spellEnd"/>
+      <w:r>
+        <w:rPr>
+          <w:lang w:eastAsia="id-ID"/>
+        </w:rPr>
+        <w:t xml:space="preserve">, </w:t>
+      </w:r>
+      <w:r>
+        <w:rPr>
+          <w:i/>
+          <w:iCs/>
+          <w:lang w:eastAsia="id-ID"/>
+        </w:rPr>
+        <w:t>simbol</w:t>
+      </w:r>
+      <w:r>
+        <w:rPr>
+          <w:lang w:eastAsia="id-ID"/>
+        </w:rPr>
+        <w:t xml:space="preserve">, dan </w:t>
+      </w:r>
+      <w:r>
+        <w:rPr>
+          <w:i/>
+          <w:iCs/>
+          <w:lang w:eastAsia="id-ID"/>
+        </w:rPr>
+        <w:t>berat</w:t>
+      </w:r>
+      <w:r>
+        <w:rPr>
+          <w:lang w:eastAsia="id-ID"/>
+        </w:rPr>
+        <w:t xml:space="preserve">, yang </w:t>
+      </w:r>
+      <w:proofErr w:type="spellStart"/>
+      <w:r>
+        <w:rPr>
+          <w:lang w:eastAsia="id-ID"/>
+        </w:rPr>
+        <w:t>diinisialisasi</w:t>
+      </w:r>
+      <w:proofErr w:type="spellEnd"/>
+      <w:r>
+        <w:rPr>
+          <w:lang w:eastAsia="id-ID"/>
+        </w:rPr>
+        <w:t xml:space="preserve"> melalui </w:t>
+      </w:r>
+      <w:proofErr w:type="spellStart"/>
+      <w:r>
+        <w:rPr>
+          <w:lang w:eastAsia="id-ID"/>
+        </w:rPr>
+        <w:t>constructor</w:t>
+      </w:r>
+      <w:proofErr w:type="spellEnd"/>
+      <w:r>
+        <w:rPr>
+          <w:lang w:eastAsia="id-ID"/>
+        </w:rPr>
+        <w:t xml:space="preserve"> dan digunakan untuk menyimpan karakteristik setiap objek tambang.</w:t>
+      </w:r>
+    </w:p>
+    <w:p>
+      <w:pPr>
+        <w:rPr>
+          <w:lang w:eastAsia="id-ID"/>
+        </w:rPr>
+      </w:pPr>
+      <w:proofErr w:type="spellStart"/>
+      <w:r>
+        <w:rPr>
+          <w:lang w:eastAsia="id-ID"/>
+        </w:rPr>
+        <w:t>Method</w:t>
+      </w:r>
+      <w:proofErr w:type="spellEnd"/>
+      <w:r>
+        <w:rPr>
+          <w:lang w:eastAsia="id-ID"/>
+        </w:rPr>
+        <w:t xml:space="preserve"> </w:t>
+      </w:r>
+      <w:proofErr w:type="spellStart"/>
+      <w:r>
+        <w:rPr>
+          <w:i/>
+          <w:iCs/>
+          <w:lang w:eastAsia="id-ID"/>
+        </w:rPr>
+        <w:t>tambang_mineral</w:t>
+      </w:r>
+      <w:proofErr w:type="spellEnd"/>
+      <w:r>
+        <w:rPr>
+          <w:i/>
+          <w:iCs/>
+          <w:lang w:eastAsia="id-ID"/>
+        </w:rPr>
+        <w:t>()</w:t>
+      </w:r>
+      <w:r>
+        <w:rPr>
+          <w:lang w:eastAsia="id-ID"/>
+        </w:rPr>
+        <w:t xml:space="preserve"> berfungsi untuk menampilkan informasi tambang dengan menggabungkan nilai atribut dalam format </w:t>
+      </w:r>
+      <w:proofErr w:type="spellStart"/>
+      <w:r>
+        <w:rPr>
+          <w:lang w:eastAsia="id-ID"/>
+        </w:rPr>
+        <w:t>string</w:t>
+      </w:r>
+      <w:proofErr w:type="spellEnd"/>
+      <w:r>
+        <w:rPr>
+          <w:lang w:eastAsia="id-ID"/>
+        </w:rPr>
+        <w:t xml:space="preserve"> sehingga menghasilkan </w:t>
+      </w:r>
+      <w:proofErr w:type="spellStart"/>
+      <w:r>
+        <w:rPr>
+          <w:lang w:eastAsia="id-ID"/>
+        </w:rPr>
+        <w:t>output</w:t>
+      </w:r>
+      <w:proofErr w:type="spellEnd"/>
+      <w:r>
+        <w:rPr>
+          <w:lang w:eastAsia="id-ID"/>
+        </w:rPr>
+        <w:t xml:space="preserve"> yang terstruktur.</w:t>
+      </w:r>
+    </w:p>
+    <w:p>
+      <w:pPr>
+        <w:rPr>
+          <w:lang w:eastAsia="id-ID"/>
+        </w:rPr>
+      </w:pPr>
+      <w:proofErr w:type="spellStart"/>
+      <w:r>
+        <w:rPr>
+          <w:lang w:eastAsia="id-ID"/>
+        </w:rPr>
+        <w:t>Class</w:t>
+      </w:r>
+      <w:proofErr w:type="spellEnd"/>
+      <w:r>
+        <w:rPr>
+          <w:lang w:eastAsia="id-ID"/>
+        </w:rPr>
+        <w:t xml:space="preserve"> dan </w:t>
+      </w:r>
+      <w:proofErr w:type="spellStart"/>
+      <w:r>
+        <w:rPr>
+          <w:lang w:eastAsia="id-ID"/>
+        </w:rPr>
+        <w:t>object</w:t>
+      </w:r>
+      <w:proofErr w:type="spellEnd"/>
+      <w:r>
+        <w:rPr>
+          <w:lang w:eastAsia="id-ID"/>
+        </w:rPr>
+        <w:t xml:space="preserve"> memiliki hubungan sebagai cetakan dan hasil. </w:t>
+      </w:r>
+      <w:proofErr w:type="spellStart"/>
+      <w:r>
+        <w:rPr>
+          <w:lang w:eastAsia="id-ID"/>
+        </w:rPr>
+        <w:t>Class</w:t>
+      </w:r>
+      <w:proofErr w:type="spellEnd"/>
+      <w:r>
+        <w:rPr>
+          <w:lang w:eastAsia="id-ID"/>
+        </w:rPr>
+        <w:t xml:space="preserve"> berperan sebagai </w:t>
+      </w:r>
+      <w:proofErr w:type="spellStart"/>
+      <w:r>
+        <w:rPr>
+          <w:lang w:eastAsia="id-ID"/>
+        </w:rPr>
+        <w:t>blueprint</w:t>
+      </w:r>
+      <w:proofErr w:type="spellEnd"/>
+      <w:r>
+        <w:rPr>
+          <w:lang w:eastAsia="id-ID"/>
+        </w:rPr>
+        <w:t xml:space="preserve"> yang menentukan struktur dan perilaku, sedangkan </w:t>
+      </w:r>
+      <w:proofErr w:type="spellStart"/>
+      <w:r>
+        <w:rPr>
+          <w:lang w:eastAsia="id-ID"/>
+        </w:rPr>
+        <w:t>object</w:t>
+      </w:r>
+      <w:proofErr w:type="spellEnd"/>
+      <w:r>
+        <w:rPr>
+          <w:lang w:eastAsia="id-ID"/>
+        </w:rPr>
+        <w:t xml:space="preserve"> merupakan implementasi nyata dari </w:t>
+      </w:r>
+      <w:proofErr w:type="spellStart"/>
+      <w:r>
+        <w:rPr>
+          <w:lang w:eastAsia="id-ID"/>
+        </w:rPr>
+        <w:t>class</w:t>
+      </w:r>
+      <w:proofErr w:type="spellEnd"/>
+      <w:r>
+        <w:rPr>
+          <w:lang w:eastAsia="id-ID"/>
+        </w:rPr>
+        <w:t xml:space="preserve"> tersebut. Satu </w:t>
+      </w:r>
+      <w:proofErr w:type="spellStart"/>
+      <w:r>
+        <w:rPr>
+          <w:lang w:eastAsia="id-ID"/>
+        </w:rPr>
+        <w:t>class</w:t>
+      </w:r>
+      <w:proofErr w:type="spellEnd"/>
+      <w:r>
+        <w:rPr>
+          <w:lang w:eastAsia="id-ID"/>
+        </w:rPr>
+        <w:t xml:space="preserve"> dapat menghasilkan banyak </w:t>
+      </w:r>
+      <w:proofErr w:type="spellStart"/>
+      <w:r>
+        <w:rPr>
+          <w:lang w:eastAsia="id-ID"/>
+        </w:rPr>
+        <w:t>object</w:t>
+      </w:r>
+      <w:proofErr w:type="spellEnd"/>
+      <w:r>
+        <w:rPr>
+          <w:lang w:eastAsia="id-ID"/>
+        </w:rPr>
+        <w:t xml:space="preserve"> dengan data berbeda, tetapi tetap mengikuti struktur dan </w:t>
+      </w:r>
+      <w:proofErr w:type="spellStart"/>
+      <w:r>
+        <w:rPr>
+          <w:lang w:eastAsia="id-ID"/>
+        </w:rPr>
+        <w:t>method</w:t>
+      </w:r>
+      <w:proofErr w:type="spellEnd"/>
+      <w:r>
+        <w:rPr>
+          <w:lang w:eastAsia="id-ID"/>
+        </w:rPr>
+        <w:t xml:space="preserve"> yang sama.</w:t>
+      </w:r>
+    </w:p>
+    <w:p>
+      <w:pPr>
+        <w:pStyle w:val="Judul3"/>
+        <w:rPr>
+          <w:lang w:eastAsia="id-ID"/>
+        </w:rPr>
+      </w:pPr>
+      <w:r>
+        <w:rPr>
+          <w:lang w:eastAsia="id-ID"/>
+        </w:rPr>
+        <w:lastRenderedPageBreak/>
+        <w:t>Kode 2 (jualan)</w:t>
+      </w:r>
+    </w:p>
+    <w:p>
+      <w:pPr>
         <w:ind w:firstLine="0"/>
-        <w:rPr>
-          <w:rFonts w:eastAsiaTheme="majorEastAsia" w:cstheme="majorBidi"/>
-          <w:b/>
-          <w:color w:val="000000" w:themeColor="text1"/>
-          <w:sz w:val="28"/>
-          <w:szCs w:val="40"/>
-        </w:rPr>
-      </w:pPr>
-      <w:r>
-        <w:rPr>
-          <w:rFonts w:eastAsiaTheme="majorEastAsia" w:cstheme="majorBidi"/>
-          <w:b/>
-          <w:color w:val="000000" w:themeColor="text1"/>
-          <w:sz w:val="28"/>
-          <w:szCs w:val="40"/>
-        </w:rPr>
+        <w:jc w:val="center"/>
+        <w:rPr>
+          <w:lang w:eastAsia="id-ID"/>
+        </w:rPr>
+      </w:pPr>
+      <w:r>
+        <w:rPr>
+          <w:noProof/>
+          <w:lang w:eastAsia="id-ID"/>
+        </w:rPr>
+        <w:drawing>
+          <wp:inline distT="0" distB="0" distL="0" distR="0" wp14:anchorId="59B8ABAF" wp14:editId="71486A86">
+            <wp:extent cx="5109592" cy="1995054"/>
+            <wp:effectExtent l="0" t="0" r="0" b="5715"/>
+            <wp:docPr id="1033870011" name="Gambar 1"/>
+            <wp:cNvGraphicFramePr>
+              <a:graphicFrameLocks xmlns:a="http://schemas.openxmlformats.org/drawingml/2006/main" noChangeAspect="1"/>
+            </wp:cNvGraphicFramePr>
+            <a:graphic xmlns:a="http://schemas.openxmlformats.org/drawingml/2006/main">
+              <a:graphicData uri="http://schemas.openxmlformats.org/drawingml/2006/picture">
+                <pic:pic xmlns:pic="http://schemas.openxmlformats.org/drawingml/2006/picture">
+                  <pic:nvPicPr>
+                    <pic:cNvPr id="1033870011" name=""/>
+                    <pic:cNvPicPr/>
+                  </pic:nvPicPr>
+                  <pic:blipFill rotWithShape="1">
+                    <a:blip r:embed="rId16"/>
+                    <a:srcRect l="5500" t="17613" r="5437" b="9350"/>
+                    <a:stretch>
+                      <a:fillRect/>
+                    </a:stretch>
+                  </pic:blipFill>
+                  <pic:spPr bwMode="auto">
+                    <a:xfrm>
+                      <a:off x="0" y="0"/>
+                      <a:ext cx="5120272" cy="1999224"/>
+                    </a:xfrm>
+                    <a:prstGeom prst="rect">
+                      <a:avLst/>
+                    </a:prstGeom>
+                    <a:ln>
+                      <a:noFill/>
+                    </a:ln>
+                    <a:extLst>
+                      <a:ext uri="{53640926-AAD7-44D8-BBD7-CCE9431645EC}">
+                        <a14:shadowObscured xmlns:a14="http://schemas.microsoft.com/office/drawing/2010/main"/>
+                      </a:ext>
+                    </a:extLst>
+                  </pic:spPr>
+                </pic:pic>
+              </a:graphicData>
+            </a:graphic>
+          </wp:inline>
+        </w:drawing>
+      </w:r>
+    </w:p>
+    <w:p>
+      <w:pPr>
+        <w:rPr>
+          <w:lang w:eastAsia="id-ID"/>
+        </w:rPr>
+      </w:pPr>
+      <w:proofErr w:type="spellStart"/>
+      <w:r>
+        <w:rPr>
+          <w:lang w:eastAsia="id-ID"/>
+        </w:rPr>
+        <w:t>Class</w:t>
+      </w:r>
+      <w:proofErr w:type="spellEnd"/>
+      <w:r>
+        <w:rPr>
+          <w:lang w:eastAsia="id-ID"/>
+        </w:rPr>
+        <w:t xml:space="preserve"> </w:t>
+      </w:r>
+      <w:r>
+        <w:rPr>
+          <w:i/>
+          <w:iCs/>
+          <w:lang w:eastAsia="id-ID"/>
+        </w:rPr>
+        <w:t>jualan</w:t>
+      </w:r>
+      <w:r>
+        <w:rPr>
+          <w:lang w:eastAsia="id-ID"/>
+        </w:rPr>
+        <w:t xml:space="preserve"> merupakan </w:t>
+      </w:r>
+      <w:proofErr w:type="spellStart"/>
+      <w:r>
+        <w:rPr>
+          <w:lang w:eastAsia="id-ID"/>
+        </w:rPr>
+        <w:t>blueprint</w:t>
+      </w:r>
+      <w:proofErr w:type="spellEnd"/>
+      <w:r>
+        <w:rPr>
+          <w:lang w:eastAsia="id-ID"/>
+        </w:rPr>
+        <w:t xml:space="preserve"> yang digunakan untuk merepresentasikan transaksi pembelian produk, yang mencakup data produk dan proses perhitungan total harga.</w:t>
+      </w:r>
+    </w:p>
+    <w:p>
+      <w:pPr>
+        <w:rPr>
+          <w:lang w:eastAsia="id-ID"/>
+        </w:rPr>
+      </w:pPr>
+      <w:r>
+        <w:rPr>
+          <w:lang w:eastAsia="id-ID"/>
+        </w:rPr>
+        <w:t xml:space="preserve">Objek </w:t>
+      </w:r>
+      <w:r>
+        <w:rPr>
+          <w:i/>
+          <w:iCs/>
+          <w:lang w:eastAsia="id-ID"/>
+        </w:rPr>
+        <w:t>keranjang1</w:t>
+      </w:r>
+      <w:r>
+        <w:rPr>
+          <w:lang w:eastAsia="id-ID"/>
+        </w:rPr>
+        <w:t xml:space="preserve">, </w:t>
+      </w:r>
+      <w:r>
+        <w:rPr>
+          <w:i/>
+          <w:iCs/>
+          <w:lang w:eastAsia="id-ID"/>
+        </w:rPr>
+        <w:t>keranjang2</w:t>
+      </w:r>
+      <w:r>
+        <w:rPr>
+          <w:lang w:eastAsia="id-ID"/>
+        </w:rPr>
+        <w:t xml:space="preserve">, dan </w:t>
+      </w:r>
+      <w:r>
+        <w:rPr>
+          <w:i/>
+          <w:iCs/>
+          <w:lang w:eastAsia="id-ID"/>
+        </w:rPr>
+        <w:t>keranjang3</w:t>
+      </w:r>
+      <w:r>
+        <w:rPr>
+          <w:lang w:eastAsia="id-ID"/>
+        </w:rPr>
+        <w:t xml:space="preserve"> adalah hasil </w:t>
+      </w:r>
+      <w:proofErr w:type="spellStart"/>
+      <w:r>
+        <w:rPr>
+          <w:lang w:eastAsia="id-ID"/>
+        </w:rPr>
+        <w:t>instansiasi</w:t>
+      </w:r>
+      <w:proofErr w:type="spellEnd"/>
+      <w:r>
+        <w:rPr>
+          <w:lang w:eastAsia="id-ID"/>
+        </w:rPr>
+        <w:t xml:space="preserve"> dari </w:t>
+      </w:r>
+      <w:proofErr w:type="spellStart"/>
+      <w:r>
+        <w:rPr>
+          <w:lang w:eastAsia="id-ID"/>
+        </w:rPr>
+        <w:t>class</w:t>
+      </w:r>
+      <w:proofErr w:type="spellEnd"/>
+      <w:r>
+        <w:rPr>
+          <w:lang w:eastAsia="id-ID"/>
+        </w:rPr>
+        <w:t xml:space="preserve"> jualan, masing-masing merepresentasikan item belanja yang berbeda dalam keranjang.</w:t>
+      </w:r>
+    </w:p>
+    <w:p>
+      <w:pPr>
+        <w:rPr>
+          <w:lang w:eastAsia="id-ID"/>
+        </w:rPr>
+      </w:pPr>
+      <w:r>
+        <w:rPr>
+          <w:lang w:eastAsia="id-ID"/>
+        </w:rPr>
+        <w:t xml:space="preserve">Atribut terdiri dari </w:t>
+      </w:r>
+      <w:proofErr w:type="spellStart"/>
+      <w:r>
+        <w:rPr>
+          <w:i/>
+          <w:iCs/>
+          <w:lang w:eastAsia="id-ID"/>
+        </w:rPr>
+        <w:t>nama_produk</w:t>
+      </w:r>
+      <w:proofErr w:type="spellEnd"/>
+      <w:r>
+        <w:rPr>
+          <w:lang w:eastAsia="id-ID"/>
+        </w:rPr>
+        <w:t xml:space="preserve">, </w:t>
+      </w:r>
+      <w:r>
+        <w:rPr>
+          <w:i/>
+          <w:iCs/>
+          <w:lang w:eastAsia="id-ID"/>
+        </w:rPr>
+        <w:t>harga</w:t>
+      </w:r>
+      <w:r>
+        <w:rPr>
+          <w:lang w:eastAsia="id-ID"/>
+        </w:rPr>
+        <w:t xml:space="preserve">, dan </w:t>
+      </w:r>
+      <w:r>
+        <w:rPr>
+          <w:i/>
+          <w:iCs/>
+          <w:lang w:eastAsia="id-ID"/>
+        </w:rPr>
+        <w:t>jumlah</w:t>
+      </w:r>
+      <w:r>
+        <w:rPr>
+          <w:lang w:eastAsia="id-ID"/>
+        </w:rPr>
+        <w:t xml:space="preserve">, yang </w:t>
+      </w:r>
+      <w:proofErr w:type="spellStart"/>
+      <w:r>
+        <w:rPr>
+          <w:lang w:eastAsia="id-ID"/>
+        </w:rPr>
+        <w:t>diinisialisasi</w:t>
+      </w:r>
+      <w:proofErr w:type="spellEnd"/>
+      <w:r>
+        <w:rPr>
+          <w:lang w:eastAsia="id-ID"/>
+        </w:rPr>
+        <w:t xml:space="preserve"> melalui </w:t>
+      </w:r>
+      <w:proofErr w:type="spellStart"/>
+      <w:r>
+        <w:rPr>
+          <w:lang w:eastAsia="id-ID"/>
+        </w:rPr>
+        <w:t>constructor</w:t>
+      </w:r>
+      <w:proofErr w:type="spellEnd"/>
+      <w:r>
+        <w:rPr>
+          <w:lang w:eastAsia="id-ID"/>
+        </w:rPr>
+        <w:t xml:space="preserve"> dan berfungsi untuk menyimpan informasi terkait transaksi pembelian.</w:t>
+      </w:r>
+    </w:p>
+    <w:p>
+      <w:proofErr w:type="spellStart"/>
+      <w:r>
+        <w:rPr>
+          <w:i/>
+          <w:iCs/>
+          <w:lang w:eastAsia="id-ID"/>
+        </w:rPr>
+        <w:t>Method</w:t>
+      </w:r>
+      <w:proofErr w:type="spellEnd"/>
+      <w:r>
+        <w:rPr>
+          <w:i/>
+          <w:iCs/>
+          <w:lang w:eastAsia="id-ID"/>
+        </w:rPr>
+        <w:t xml:space="preserve"> </w:t>
+      </w:r>
+      <w:proofErr w:type="spellStart"/>
+      <w:r>
+        <w:rPr>
+          <w:i/>
+          <w:iCs/>
+          <w:lang w:eastAsia="id-ID"/>
+        </w:rPr>
+        <w:t>belanjaa</w:t>
+      </w:r>
+      <w:proofErr w:type="spellEnd"/>
+      <w:r>
+        <w:rPr>
+          <w:i/>
+          <w:iCs/>
+          <w:lang w:eastAsia="id-ID"/>
+        </w:rPr>
+        <w:t>()</w:t>
+      </w:r>
+      <w:r>
+        <w:rPr>
+          <w:lang w:eastAsia="id-ID"/>
+        </w:rPr>
+        <w:t xml:space="preserve"> digunakan untuk menghitung total harga (harga × jumlah) dan menampilkan informasi produk yang dibeli</w:t>
+      </w:r>
+      <w:r>
+        <w:rPr>
+          <w:lang w:eastAsia="id-ID"/>
+        </w:rPr>
+        <w:t xml:space="preserve">, </w:t>
+      </w:r>
+      <w:r>
+        <w:t xml:space="preserve">kemudian menampilkan hasilnya dalam format yang </w:t>
+      </w:r>
+      <w:r>
+        <w:rPr>
+          <w:i/>
+          <w:iCs/>
+        </w:rPr>
+        <w:t>f-</w:t>
+      </w:r>
+      <w:proofErr w:type="spellStart"/>
+      <w:r>
+        <w:rPr>
+          <w:i/>
+          <w:iCs/>
+        </w:rPr>
+        <w:t>string</w:t>
+      </w:r>
+      <w:proofErr w:type="spellEnd"/>
+      <w:r>
+        <w:t>.</w:t>
+      </w:r>
+    </w:p>
+    <w:p>
+      <w:pPr>
+        <w:rPr>
+          <w:lang w:eastAsia="id-ID"/>
+        </w:rPr>
+      </w:pPr>
+      <w:r>
+        <w:rPr>
+          <w:lang w:eastAsia="id-ID"/>
+        </w:rPr>
+        <w:t xml:space="preserve">Perulangan </w:t>
+      </w:r>
+      <w:proofErr w:type="spellStart"/>
+      <w:r>
+        <w:rPr>
+          <w:lang w:eastAsia="id-ID"/>
+        </w:rPr>
+        <w:t>for</w:t>
+      </w:r>
+      <w:proofErr w:type="spellEnd"/>
+      <w:r>
+        <w:rPr>
+          <w:lang w:eastAsia="id-ID"/>
+        </w:rPr>
+        <w:t xml:space="preserve"> digunakan untuk mengakses setiap objek dalam </w:t>
+      </w:r>
+      <w:proofErr w:type="spellStart"/>
+      <w:r>
+        <w:rPr>
+          <w:lang w:eastAsia="id-ID"/>
+        </w:rPr>
+        <w:t>list</w:t>
+      </w:r>
+      <w:proofErr w:type="spellEnd"/>
+      <w:r>
+        <w:rPr>
+          <w:lang w:eastAsia="id-ID"/>
+        </w:rPr>
+        <w:t xml:space="preserve"> (keranjang1, keranjang2, keranjang3) dan menjalankan </w:t>
+      </w:r>
+      <w:proofErr w:type="spellStart"/>
+      <w:r>
+        <w:rPr>
+          <w:lang w:eastAsia="id-ID"/>
+        </w:rPr>
+        <w:t>method</w:t>
+      </w:r>
+      <w:proofErr w:type="spellEnd"/>
+      <w:r>
+        <w:rPr>
+          <w:lang w:eastAsia="id-ID"/>
+        </w:rPr>
+        <w:t xml:space="preserve"> </w:t>
+      </w:r>
+      <w:proofErr w:type="spellStart"/>
+      <w:r>
+        <w:rPr>
+          <w:lang w:eastAsia="id-ID"/>
+        </w:rPr>
+        <w:t>belanjaa</w:t>
+      </w:r>
+      <w:proofErr w:type="spellEnd"/>
+      <w:r>
+        <w:rPr>
+          <w:lang w:eastAsia="id-ID"/>
+        </w:rPr>
+        <w:t>() secara berulang, sehingga lebih efisien dibandingkan pemanggilan satu per satu.</w:t>
+      </w:r>
+    </w:p>
+    <w:p>
+      <w:pPr>
+        <w:rPr>
+          <w:lang w:eastAsia="id-ID"/>
+        </w:rPr>
+      </w:pPr>
+      <w:proofErr w:type="spellStart"/>
+      <w:r>
+        <w:rPr>
+          <w:lang w:eastAsia="id-ID"/>
+        </w:rPr>
+        <w:t>Class</w:t>
+      </w:r>
+      <w:proofErr w:type="spellEnd"/>
+      <w:r>
+        <w:rPr>
+          <w:lang w:eastAsia="id-ID"/>
+        </w:rPr>
+        <w:t xml:space="preserve"> jualan berperan sebagai cetakan, sedangkan objek-objek keranjang merupakan implementasi nyata yang menyimpan data berbeda. Semua objek memiliki struktur dan </w:t>
+      </w:r>
+      <w:proofErr w:type="spellStart"/>
+      <w:r>
+        <w:rPr>
+          <w:lang w:eastAsia="id-ID"/>
+        </w:rPr>
+        <w:t>method</w:t>
+      </w:r>
+      <w:proofErr w:type="spellEnd"/>
+      <w:r>
+        <w:rPr>
+          <w:lang w:eastAsia="id-ID"/>
+        </w:rPr>
+        <w:t xml:space="preserve"> yang sama, tetapi nilai atributnya dapat bervariasi.</w:t>
+      </w:r>
+    </w:p>
+    <w:p>
+      <w:pPr>
+        <w:pStyle w:val="Judul1"/>
+      </w:pPr>
+      <w:r>
+        <w:lastRenderedPageBreak/>
+        <w:br/>
+      </w:r>
+      <w:bookmarkStart w:id="3" w:name="_Toc227252101"/>
+      <w:proofErr w:type="spellStart"/>
+      <w:r>
+        <w:t>Encapsulation</w:t>
+      </w:r>
+      <w:proofErr w:type="spellEnd"/>
+      <w:r>
+        <w:t xml:space="preserve"> dan </w:t>
+      </w:r>
+      <w:proofErr w:type="spellStart"/>
+      <w:r>
+        <w:t>Abstraction</w:t>
+      </w:r>
+      <w:bookmarkEnd w:id="3"/>
+      <w:proofErr w:type="spellEnd"/>
+    </w:p>
+    <w:p>
+      <w:pPr>
+        <w:pStyle w:val="Judul2"/>
+      </w:pPr>
+      <w:r>
+        <w:t xml:space="preserve"> </w:t>
+      </w:r>
+      <w:r>
+        <w:t>Latar Belakang</w:t>
+      </w:r>
+    </w:p>
+    <w:p>
+      <w:pPr>
+        <w:pStyle w:val="Judul2"/>
+      </w:pPr>
+      <w:r>
+        <w:t xml:space="preserve"> Tujuan Praktikum</w:t>
+      </w:r>
+    </w:p>
+    <w:p>
+      <w:pPr>
+        <w:pStyle w:val="Judul2"/>
+      </w:pPr>
+      <w:r>
+        <w:t xml:space="preserve"> Dasar Teori</w:t>
+      </w:r>
+    </w:p>
+    <w:p>
+      <w:pPr>
+        <w:pStyle w:val="Judul2"/>
+      </w:pPr>
+      <w:r>
+        <w:t>Praktikum</w:t>
+      </w:r>
+    </w:p>
+    <w:p>
+      <w:pPr>
+        <w:pStyle w:val="Judul3"/>
+      </w:pPr>
+      <w:proofErr w:type="spellStart"/>
+      <w:r>
+        <w:t>Encapsulation</w:t>
+      </w:r>
+      <w:proofErr w:type="spellEnd"/>
+    </w:p>
+    <w:p>
+      <w:pPr>
+        <w:pStyle w:val="Judul3"/>
+      </w:pPr>
+      <w:proofErr w:type="spellStart"/>
+      <w:r>
+        <w:t>Abstracktion</w:t>
+      </w:r>
+      <w:proofErr w:type="spellEnd"/>
+    </w:p>
+    <w:p>
+      <w:r>
         <w:br w:type="page"/>
       </w:r>
     </w:p>
@@ -993,19 +4229,23 @@
       <w:pPr>
         <w:pStyle w:val="Judul1"/>
         <w:ind w:left="0" w:firstLine="0"/>
+        <w:rPr>
+          <w:i/>
+          <w:iCs/>
+        </w:rPr>
       </w:pPr>
       <w:r>
         <w:lastRenderedPageBreak/>
         <w:br/>
       </w:r>
-      <w:bookmarkStart w:id="3" w:name="_Toc226637613"/>
-      <w:proofErr w:type="spellStart"/>
-      <w:r>
-        <w:rPr>
-          <w:i/>
-          <w:iCs/>
-        </w:rPr>
-        <w:t>Encapsulation</w:t>
+      <w:bookmarkStart w:id="4" w:name="_Toc227252102"/>
+      <w:proofErr w:type="spellStart"/>
+      <w:r>
+        <w:rPr>
+          <w:i/>
+          <w:iCs/>
+        </w:rPr>
+        <w:t>Inharitance</w:t>
       </w:r>
       <w:proofErr w:type="spellEnd"/>
       <w:r>
@@ -1017,35 +4257,71 @@
           <w:i/>
           <w:iCs/>
         </w:rPr>
-        <w:t>Abstraction</w:t>
-      </w:r>
-      <w:bookmarkEnd w:id="3"/>
-      <w:proofErr w:type="spellEnd"/>
-    </w:p>
-    <w:p>
-      <w:pPr>
-        <w:spacing w:after="160" w:line="278" w:lineRule="auto"/>
-        <w:ind w:firstLine="0"/>
-        <w:rPr>
-          <w:rFonts w:eastAsiaTheme="majorEastAsia" w:cstheme="majorBidi"/>
-          <w:b/>
-          <w:color w:val="000000" w:themeColor="text1"/>
-          <w:sz w:val="28"/>
-          <w:szCs w:val="40"/>
-        </w:rPr>
-      </w:pPr>
-      <w:r>
-        <w:rPr>
-          <w:rFonts w:eastAsiaTheme="majorEastAsia" w:cstheme="majorBidi"/>
-          <w:b/>
-          <w:color w:val="000000" w:themeColor="text1"/>
-          <w:sz w:val="28"/>
-          <w:szCs w:val="40"/>
-        </w:rPr>
+        <w:t>Polymorphism</w:t>
+      </w:r>
+      <w:bookmarkEnd w:id="4"/>
+      <w:proofErr w:type="spellEnd"/>
+    </w:p>
+    <w:p>
+      <w:pPr>
+        <w:pStyle w:val="Judul2"/>
+      </w:pPr>
+      <w:r>
+        <w:t xml:space="preserve"> </w:t>
+      </w:r>
+      <w:r>
+        <w:t>Latar Belakang</w:t>
+      </w:r>
+    </w:p>
+    <w:p>
+      <w:pPr>
+        <w:pStyle w:val="Judul2"/>
+      </w:pPr>
+      <w:r>
+        <w:t xml:space="preserve"> Tujuan Praktikum</w:t>
+      </w:r>
+    </w:p>
+    <w:p>
+      <w:pPr>
+        <w:pStyle w:val="Judul2"/>
+      </w:pPr>
+      <w:r>
+        <w:t xml:space="preserve"> Dasar Teori</w:t>
+      </w:r>
+    </w:p>
+    <w:p>
+      <w:pPr>
+        <w:pStyle w:val="Judul2"/>
+      </w:pPr>
+      <w:r>
+        <w:t xml:space="preserve"> Praktikum</w:t>
+      </w:r>
+    </w:p>
+    <w:p>
+      <w:pPr>
+        <w:pStyle w:val="Judul3"/>
+      </w:pPr>
+      <w:proofErr w:type="spellStart"/>
+      <w:r>
+        <w:t>Inharitance</w:t>
+      </w:r>
+      <w:proofErr w:type="spellEnd"/>
+    </w:p>
+    <w:p>
+      <w:pPr>
+        <w:pStyle w:val="Judul3"/>
+      </w:pPr>
+      <w:proofErr w:type="spellStart"/>
+      <w:r>
+        <w:t>Polymorphism</w:t>
+      </w:r>
+      <w:proofErr w:type="spellEnd"/>
+    </w:p>
+    <w:p>
+      <w:r>
         <w:br w:type="page"/>
       </w:r>
     </w:p>
-    <w:p/>
     <w:sectPr>
       <w:pgSz w:w="11906" w:h="16838"/>
       <w:pgMar w:top="1701" w:right="1701" w:bottom="1701" w:left="2268" w:header="709" w:footer="709" w:gutter="0"/>
@@ -1110,6 +4386,653 @@
 <file path=word/numbering.xml><?xml version="1.0" encoding="utf-8"?>
 <w:numbering xmlns:wpc="http://schemas.microsoft.com/office/word/2010/wordprocessingCanvas" xmlns:cx="http://schemas.microsoft.com/office/drawing/2014/chartex" xmlns:cx1="http://schemas.microsoft.com/office/drawing/2015/9/8/chartex" xmlns:cx2="http://schemas.microsoft.com/office/drawing/2015/10/21/chartex" xmlns:cx3="http://schemas.microsoft.com/office/drawing/2016/5/9/chartex" xmlns:cx4="http://schemas.microsoft.com/office/drawing/2016/5/10/chartex" xmlns:cx5="http://schemas.microsoft.com/office/drawing/2016/5/11/chartex" xmlns:cx6="http://schemas.microsoft.com/office/drawing/2016/5/12/chartex" xmlns:cx7="http://schemas.microsoft.com/office/drawing/2016/5/13/chartex" xmlns:cx8="http://schemas.microsoft.com/office/drawing/2016/5/14/chartex" xmlns:mc="http://schemas.openxmlformats.org/markup-compatibility/2006" xmlns:aink="http://schemas.microsoft.com/office/drawing/2016/ink" xmlns:am3d="http://schemas.microsoft.com/office/drawing/2017/model3d" xmlns:o="urn:schemas-microsoft-com:office:office" xmlns:oel="http://schemas.microsoft.com/office/2019/extlst" xmlns:r="http://schemas.openxmlformats.org/officeDocument/2006/relationships" xmlns:m="http://schemas.openxmlformats.org/officeDocument/2006/math" xmlns:v="urn:schemas-microsoft-com:vml" xmlns:wp14="http://schemas.microsoft.com/office/word/2010/wordprocessingDrawing" xmlns:wp="http://schemas.openxmlformats.org/drawingml/2006/wordprocessingDrawing" xmlns:w10="urn:schemas-microsoft-com:office:word" xmlns:w="http://schemas.openxmlformats.org/wordprocessingml/2006/main" xmlns:w14="http://schemas.microsoft.com/office/word/2010/wordml" xmlns:w15="http://schemas.microsoft.com/office/word/2012/wordml" xmlns:w16cex="http://schemas.microsoft.com/office/word/2018/wordml/cex" xmlns:w16cid="http://schemas.microsoft.com/office/word/2016/wordml/cid" xmlns:w16="http://schemas.microsoft.com/office/word/2018/wordml" xmlns:w16du="http://schemas.microsoft.com/office/word/2023/wordml/word16du" xmlns:w16sdtdh="http://schemas.microsoft.com/office/word/2020/wordml/sdtdatahash" xmlns:w16sdtfl="http://schemas.microsoft.com/office/word/2024/wordml/sdtformatlock" xmlns:w16se="http://schemas.microsoft.com/office/word/2015/wordml/symex" xmlns:wpg="http://schemas.microsoft.com/office/word/2010/wordprocessingGroup" xmlns:wpi="http://schemas.microsoft.com/office/word/2010/wordprocessingInk" xmlns:wne="http://schemas.microsoft.com/office/word/2006/wordml" xmlns:wps="http://schemas.microsoft.com/office/word/2010/wordprocessingShape" mc:Ignorable="w14 w15 w16se w16cid w16 w16cex w16sdtdh w16sdtfl w16du wp14">
   <w:abstractNum w:abstractNumId="0" w15:restartNumberingAfterBreak="0">
+    <w:nsid w:val="03BC6861"/>
+    <w:multiLevelType w:val="multilevel"/>
+    <w:tmpl w:val="4D2E4548"/>
+    <w:lvl w:ilvl="0">
+      <w:start w:val="1"/>
+      <w:numFmt w:val="decimal"/>
+      <w:pStyle w:val="Judul1"/>
+      <w:suff w:val="nothing"/>
+      <w:lvlText w:val="PERTEMUAN %1"/>
+      <w:lvlJc w:val="left"/>
+      <w:pPr>
+        <w:ind w:left="360" w:hanging="360"/>
+      </w:pPr>
+    </w:lvl>
+    <w:lvl w:ilvl="1">
+      <w:start w:val="1"/>
+      <w:numFmt w:val="lowerLetter"/>
+      <w:pStyle w:val="Judul2"/>
+      <w:isLgl/>
+      <w:suff w:val="nothing"/>
+      <w:lvlText w:val="%1.%2"/>
+      <w:lvlJc w:val="left"/>
+      <w:pPr>
+        <w:ind w:left="720" w:hanging="360"/>
+      </w:pPr>
+      <w:rPr>
+        <w:rFonts w:ascii="Times New Roman" w:hAnsi="Times New Roman" w:hint="default"/>
+        <w:b/>
+        <w:i w:val="0"/>
+        <w:sz w:val="24"/>
+      </w:rPr>
+    </w:lvl>
+    <w:lvl w:ilvl="2">
+      <w:start w:val="1"/>
+      <w:numFmt w:val="lowerRoman"/>
+      <w:pStyle w:val="Judul3"/>
+      <w:isLgl/>
+      <w:lvlText w:val="%1.%2.%3"/>
+      <w:lvlJc w:val="left"/>
+      <w:pPr>
+        <w:ind w:left="1080" w:hanging="360"/>
+      </w:pPr>
+      <w:rPr>
+        <w:rFonts w:ascii="Times New Roman" w:hAnsi="Times New Roman" w:hint="default"/>
+        <w:b/>
+        <w:i w:val="0"/>
+        <w:sz w:val="24"/>
+      </w:rPr>
+    </w:lvl>
+    <w:lvl w:ilvl="3">
+      <w:start w:val="1"/>
+      <w:numFmt w:val="decimal"/>
+      <w:lvlText w:val="(%4)"/>
+      <w:lvlJc w:val="left"/>
+      <w:pPr>
+        <w:ind w:left="1440" w:hanging="360"/>
+      </w:pPr>
+      <w:rPr>
+        <w:rFonts w:hint="default"/>
+      </w:rPr>
+    </w:lvl>
+    <w:lvl w:ilvl="4">
+      <w:start w:val="1"/>
+      <w:numFmt w:val="lowerLetter"/>
+      <w:lvlText w:val="(%5)"/>
+      <w:lvlJc w:val="left"/>
+      <w:pPr>
+        <w:ind w:left="1800" w:hanging="360"/>
+      </w:pPr>
+      <w:rPr>
+        <w:rFonts w:hint="default"/>
+      </w:rPr>
+    </w:lvl>
+    <w:lvl w:ilvl="5">
+      <w:start w:val="1"/>
+      <w:numFmt w:val="lowerRoman"/>
+      <w:lvlText w:val="(%6)"/>
+      <w:lvlJc w:val="left"/>
+      <w:pPr>
+        <w:ind w:left="2160" w:hanging="360"/>
+      </w:pPr>
+      <w:rPr>
+        <w:rFonts w:hint="default"/>
+      </w:rPr>
+    </w:lvl>
+    <w:lvl w:ilvl="6">
+      <w:start w:val="1"/>
+      <w:numFmt w:val="decimal"/>
+      <w:lvlText w:val="%7."/>
+      <w:lvlJc w:val="left"/>
+      <w:pPr>
+        <w:ind w:left="2520" w:hanging="360"/>
+      </w:pPr>
+      <w:rPr>
+        <w:rFonts w:hint="default"/>
+      </w:rPr>
+    </w:lvl>
+    <w:lvl w:ilvl="7">
+      <w:start w:val="1"/>
+      <w:numFmt w:val="lowerLetter"/>
+      <w:lvlText w:val="%8."/>
+      <w:lvlJc w:val="left"/>
+      <w:pPr>
+        <w:ind w:left="2880" w:hanging="360"/>
+      </w:pPr>
+      <w:rPr>
+        <w:rFonts w:hint="default"/>
+      </w:rPr>
+    </w:lvl>
+    <w:lvl w:ilvl="8">
+      <w:start w:val="1"/>
+      <w:numFmt w:val="lowerRoman"/>
+      <w:lvlText w:val="%9."/>
+      <w:lvlJc w:val="left"/>
+      <w:pPr>
+        <w:ind w:left="3240" w:hanging="360"/>
+      </w:pPr>
+      <w:rPr>
+        <w:rFonts w:hint="default"/>
+      </w:rPr>
+    </w:lvl>
+  </w:abstractNum>
+  <w:abstractNum w:abstractNumId="1" w15:restartNumberingAfterBreak="0">
+    <w:nsid w:val="19CE297E"/>
+    <w:multiLevelType w:val="multilevel"/>
+    <w:tmpl w:val="F6000EEC"/>
+    <w:lvl w:ilvl="0">
+      <w:start w:val="1"/>
+      <w:numFmt w:val="decimal"/>
+      <w:lvlText w:val="%1."/>
+      <w:lvlJc w:val="left"/>
+      <w:pPr>
+        <w:tabs>
+          <w:tab w:val="num" w:pos="720"/>
+        </w:tabs>
+        <w:ind w:left="720" w:hanging="360"/>
+      </w:pPr>
+    </w:lvl>
+    <w:lvl w:ilvl="1" w:tentative="1">
+      <w:start w:val="1"/>
+      <w:numFmt w:val="decimal"/>
+      <w:lvlText w:val="%2."/>
+      <w:lvlJc w:val="left"/>
+      <w:pPr>
+        <w:tabs>
+          <w:tab w:val="num" w:pos="1440"/>
+        </w:tabs>
+        <w:ind w:left="1440" w:hanging="360"/>
+      </w:pPr>
+    </w:lvl>
+    <w:lvl w:ilvl="2" w:tentative="1">
+      <w:start w:val="1"/>
+      <w:numFmt w:val="decimal"/>
+      <w:lvlText w:val="%3."/>
+      <w:lvlJc w:val="left"/>
+      <w:pPr>
+        <w:tabs>
+          <w:tab w:val="num" w:pos="2160"/>
+        </w:tabs>
+        <w:ind w:left="2160" w:hanging="360"/>
+      </w:pPr>
+    </w:lvl>
+    <w:lvl w:ilvl="3" w:tentative="1">
+      <w:start w:val="1"/>
+      <w:numFmt w:val="decimal"/>
+      <w:lvlText w:val="%4."/>
+      <w:lvlJc w:val="left"/>
+      <w:pPr>
+        <w:tabs>
+          <w:tab w:val="num" w:pos="2880"/>
+        </w:tabs>
+        <w:ind w:left="2880" w:hanging="360"/>
+      </w:pPr>
+    </w:lvl>
+    <w:lvl w:ilvl="4" w:tentative="1">
+      <w:start w:val="1"/>
+      <w:numFmt w:val="decimal"/>
+      <w:lvlText w:val="%5."/>
+      <w:lvlJc w:val="left"/>
+      <w:pPr>
+        <w:tabs>
+          <w:tab w:val="num" w:pos="3600"/>
+        </w:tabs>
+        <w:ind w:left="3600" w:hanging="360"/>
+      </w:pPr>
+    </w:lvl>
+    <w:lvl w:ilvl="5" w:tentative="1">
+      <w:start w:val="1"/>
+      <w:numFmt w:val="decimal"/>
+      <w:lvlText w:val="%6."/>
+      <w:lvlJc w:val="left"/>
+      <w:pPr>
+        <w:tabs>
+          <w:tab w:val="num" w:pos="4320"/>
+        </w:tabs>
+        <w:ind w:left="4320" w:hanging="360"/>
+      </w:pPr>
+    </w:lvl>
+    <w:lvl w:ilvl="6" w:tentative="1">
+      <w:start w:val="1"/>
+      <w:numFmt w:val="decimal"/>
+      <w:lvlText w:val="%7."/>
+      <w:lvlJc w:val="left"/>
+      <w:pPr>
+        <w:tabs>
+          <w:tab w:val="num" w:pos="5040"/>
+        </w:tabs>
+        <w:ind w:left="5040" w:hanging="360"/>
+      </w:pPr>
+    </w:lvl>
+    <w:lvl w:ilvl="7" w:tentative="1">
+      <w:start w:val="1"/>
+      <w:numFmt w:val="decimal"/>
+      <w:lvlText w:val="%8."/>
+      <w:lvlJc w:val="left"/>
+      <w:pPr>
+        <w:tabs>
+          <w:tab w:val="num" w:pos="5760"/>
+        </w:tabs>
+        <w:ind w:left="5760" w:hanging="360"/>
+      </w:pPr>
+    </w:lvl>
+    <w:lvl w:ilvl="8" w:tentative="1">
+      <w:start w:val="1"/>
+      <w:numFmt w:val="decimal"/>
+      <w:lvlText w:val="%9."/>
+      <w:lvlJc w:val="left"/>
+      <w:pPr>
+        <w:tabs>
+          <w:tab w:val="num" w:pos="6480"/>
+        </w:tabs>
+        <w:ind w:left="6480" w:hanging="360"/>
+      </w:pPr>
+    </w:lvl>
+  </w:abstractNum>
+  <w:abstractNum w:abstractNumId="2" w15:restartNumberingAfterBreak="0">
+    <w:nsid w:val="23885036"/>
+    <w:multiLevelType w:val="multilevel"/>
+    <w:tmpl w:val="CFE03E54"/>
+    <w:lvl w:ilvl="0">
+      <w:start w:val="1"/>
+      <w:numFmt w:val="bullet"/>
+      <w:lvlText w:val=""/>
+      <w:lvlJc w:val="left"/>
+      <w:pPr>
+        <w:tabs>
+          <w:tab w:val="num" w:pos="720"/>
+        </w:tabs>
+        <w:ind w:left="720" w:hanging="360"/>
+      </w:pPr>
+      <w:rPr>
+        <w:rFonts w:ascii="Symbol" w:hAnsi="Symbol" w:hint="default"/>
+        <w:sz w:val="20"/>
+      </w:rPr>
+    </w:lvl>
+    <w:lvl w:ilvl="1" w:tentative="1">
+      <w:start w:val="1"/>
+      <w:numFmt w:val="bullet"/>
+      <w:lvlText w:val="o"/>
+      <w:lvlJc w:val="left"/>
+      <w:pPr>
+        <w:tabs>
+          <w:tab w:val="num" w:pos="1440"/>
+        </w:tabs>
+        <w:ind w:left="1440" w:hanging="360"/>
+      </w:pPr>
+      <w:rPr>
+        <w:rFonts w:ascii="Courier New" w:hAnsi="Courier New" w:hint="default"/>
+        <w:sz w:val="20"/>
+      </w:rPr>
+    </w:lvl>
+    <w:lvl w:ilvl="2" w:tentative="1">
+      <w:start w:val="1"/>
+      <w:numFmt w:val="bullet"/>
+      <w:lvlText w:val=""/>
+      <w:lvlJc w:val="left"/>
+      <w:pPr>
+        <w:tabs>
+          <w:tab w:val="num" w:pos="2160"/>
+        </w:tabs>
+        <w:ind w:left="2160" w:hanging="360"/>
+      </w:pPr>
+      <w:rPr>
+        <w:rFonts w:ascii="Wingdings" w:hAnsi="Wingdings" w:hint="default"/>
+        <w:sz w:val="20"/>
+      </w:rPr>
+    </w:lvl>
+    <w:lvl w:ilvl="3" w:tentative="1">
+      <w:start w:val="1"/>
+      <w:numFmt w:val="bullet"/>
+      <w:lvlText w:val=""/>
+      <w:lvlJc w:val="left"/>
+      <w:pPr>
+        <w:tabs>
+          <w:tab w:val="num" w:pos="2880"/>
+        </w:tabs>
+        <w:ind w:left="2880" w:hanging="360"/>
+      </w:pPr>
+      <w:rPr>
+        <w:rFonts w:ascii="Wingdings" w:hAnsi="Wingdings" w:hint="default"/>
+        <w:sz w:val="20"/>
+      </w:rPr>
+    </w:lvl>
+    <w:lvl w:ilvl="4" w:tentative="1">
+      <w:start w:val="1"/>
+      <w:numFmt w:val="bullet"/>
+      <w:lvlText w:val=""/>
+      <w:lvlJc w:val="left"/>
+      <w:pPr>
+        <w:tabs>
+          <w:tab w:val="num" w:pos="3600"/>
+        </w:tabs>
+        <w:ind w:left="3600" w:hanging="360"/>
+      </w:pPr>
+      <w:rPr>
+        <w:rFonts w:ascii="Wingdings" w:hAnsi="Wingdings" w:hint="default"/>
+        <w:sz w:val="20"/>
+      </w:rPr>
+    </w:lvl>
+    <w:lvl w:ilvl="5" w:tentative="1">
+      <w:start w:val="1"/>
+      <w:numFmt w:val="bullet"/>
+      <w:lvlText w:val=""/>
+      <w:lvlJc w:val="left"/>
+      <w:pPr>
+        <w:tabs>
+          <w:tab w:val="num" w:pos="4320"/>
+        </w:tabs>
+        <w:ind w:left="4320" w:hanging="360"/>
+      </w:pPr>
+      <w:rPr>
+        <w:rFonts w:ascii="Wingdings" w:hAnsi="Wingdings" w:hint="default"/>
+        <w:sz w:val="20"/>
+      </w:rPr>
+    </w:lvl>
+    <w:lvl w:ilvl="6" w:tentative="1">
+      <w:start w:val="1"/>
+      <w:numFmt w:val="bullet"/>
+      <w:lvlText w:val=""/>
+      <w:lvlJc w:val="left"/>
+      <w:pPr>
+        <w:tabs>
+          <w:tab w:val="num" w:pos="5040"/>
+        </w:tabs>
+        <w:ind w:left="5040" w:hanging="360"/>
+      </w:pPr>
+      <w:rPr>
+        <w:rFonts w:ascii="Wingdings" w:hAnsi="Wingdings" w:hint="default"/>
+        <w:sz w:val="20"/>
+      </w:rPr>
+    </w:lvl>
+    <w:lvl w:ilvl="7" w:tentative="1">
+      <w:start w:val="1"/>
+      <w:numFmt w:val="bullet"/>
+      <w:lvlText w:val=""/>
+      <w:lvlJc w:val="left"/>
+      <w:pPr>
+        <w:tabs>
+          <w:tab w:val="num" w:pos="5760"/>
+        </w:tabs>
+        <w:ind w:left="5760" w:hanging="360"/>
+      </w:pPr>
+      <w:rPr>
+        <w:rFonts w:ascii="Wingdings" w:hAnsi="Wingdings" w:hint="default"/>
+        <w:sz w:val="20"/>
+      </w:rPr>
+    </w:lvl>
+    <w:lvl w:ilvl="8" w:tentative="1">
+      <w:start w:val="1"/>
+      <w:numFmt w:val="bullet"/>
+      <w:lvlText w:val=""/>
+      <w:lvlJc w:val="left"/>
+      <w:pPr>
+        <w:tabs>
+          <w:tab w:val="num" w:pos="6480"/>
+        </w:tabs>
+        <w:ind w:left="6480" w:hanging="360"/>
+      </w:pPr>
+      <w:rPr>
+        <w:rFonts w:ascii="Wingdings" w:hAnsi="Wingdings" w:hint="default"/>
+        <w:sz w:val="20"/>
+      </w:rPr>
+    </w:lvl>
+  </w:abstractNum>
+  <w:abstractNum w:abstractNumId="3" w15:restartNumberingAfterBreak="0">
+    <w:nsid w:val="2CE457A3"/>
+    <w:multiLevelType w:val="multilevel"/>
+    <w:tmpl w:val="98DEFCE8"/>
+    <w:lvl w:ilvl="0">
+      <w:start w:val="1"/>
+      <w:numFmt w:val="decimal"/>
+      <w:lvlText w:val="%1."/>
+      <w:lvlJc w:val="left"/>
+      <w:pPr>
+        <w:tabs>
+          <w:tab w:val="num" w:pos="720"/>
+        </w:tabs>
+        <w:ind w:left="720" w:hanging="360"/>
+      </w:pPr>
+    </w:lvl>
+    <w:lvl w:ilvl="1" w:tentative="1">
+      <w:start w:val="1"/>
+      <w:numFmt w:val="decimal"/>
+      <w:lvlText w:val="%2."/>
+      <w:lvlJc w:val="left"/>
+      <w:pPr>
+        <w:tabs>
+          <w:tab w:val="num" w:pos="1440"/>
+        </w:tabs>
+        <w:ind w:left="1440" w:hanging="360"/>
+      </w:pPr>
+    </w:lvl>
+    <w:lvl w:ilvl="2" w:tentative="1">
+      <w:start w:val="1"/>
+      <w:numFmt w:val="decimal"/>
+      <w:lvlText w:val="%3."/>
+      <w:lvlJc w:val="left"/>
+      <w:pPr>
+        <w:tabs>
+          <w:tab w:val="num" w:pos="2160"/>
+        </w:tabs>
+        <w:ind w:left="2160" w:hanging="360"/>
+      </w:pPr>
+    </w:lvl>
+    <w:lvl w:ilvl="3" w:tentative="1">
+      <w:start w:val="1"/>
+      <w:numFmt w:val="decimal"/>
+      <w:lvlText w:val="%4."/>
+      <w:lvlJc w:val="left"/>
+      <w:pPr>
+        <w:tabs>
+          <w:tab w:val="num" w:pos="2880"/>
+        </w:tabs>
+        <w:ind w:left="2880" w:hanging="360"/>
+      </w:pPr>
+    </w:lvl>
+    <w:lvl w:ilvl="4" w:tentative="1">
+      <w:start w:val="1"/>
+      <w:numFmt w:val="decimal"/>
+      <w:lvlText w:val="%5."/>
+      <w:lvlJc w:val="left"/>
+      <w:pPr>
+        <w:tabs>
+          <w:tab w:val="num" w:pos="3600"/>
+        </w:tabs>
+        <w:ind w:left="3600" w:hanging="360"/>
+      </w:pPr>
+    </w:lvl>
+    <w:lvl w:ilvl="5" w:tentative="1">
+      <w:start w:val="1"/>
+      <w:numFmt w:val="decimal"/>
+      <w:lvlText w:val="%6."/>
+      <w:lvlJc w:val="left"/>
+      <w:pPr>
+        <w:tabs>
+          <w:tab w:val="num" w:pos="4320"/>
+        </w:tabs>
+        <w:ind w:left="4320" w:hanging="360"/>
+      </w:pPr>
+    </w:lvl>
+    <w:lvl w:ilvl="6" w:tentative="1">
+      <w:start w:val="1"/>
+      <w:numFmt w:val="decimal"/>
+      <w:lvlText w:val="%7."/>
+      <w:lvlJc w:val="left"/>
+      <w:pPr>
+        <w:tabs>
+          <w:tab w:val="num" w:pos="5040"/>
+        </w:tabs>
+        <w:ind w:left="5040" w:hanging="360"/>
+      </w:pPr>
+    </w:lvl>
+    <w:lvl w:ilvl="7" w:tentative="1">
+      <w:start w:val="1"/>
+      <w:numFmt w:val="decimal"/>
+      <w:lvlText w:val="%8."/>
+      <w:lvlJc w:val="left"/>
+      <w:pPr>
+        <w:tabs>
+          <w:tab w:val="num" w:pos="5760"/>
+        </w:tabs>
+        <w:ind w:left="5760" w:hanging="360"/>
+      </w:pPr>
+    </w:lvl>
+    <w:lvl w:ilvl="8" w:tentative="1">
+      <w:start w:val="1"/>
+      <w:numFmt w:val="decimal"/>
+      <w:lvlText w:val="%9."/>
+      <w:lvlJc w:val="left"/>
+      <w:pPr>
+        <w:tabs>
+          <w:tab w:val="num" w:pos="6480"/>
+        </w:tabs>
+        <w:ind w:left="6480" w:hanging="360"/>
+      </w:pPr>
+    </w:lvl>
+  </w:abstractNum>
+  <w:abstractNum w:abstractNumId="4" w15:restartNumberingAfterBreak="0">
+    <w:nsid w:val="35DB6335"/>
+    <w:multiLevelType w:val="multilevel"/>
+    <w:tmpl w:val="6A968784"/>
+    <w:lvl w:ilvl="0">
+      <w:start w:val="1"/>
+      <w:numFmt w:val="bullet"/>
+      <w:lvlText w:val=""/>
+      <w:lvlJc w:val="left"/>
+      <w:pPr>
+        <w:tabs>
+          <w:tab w:val="num" w:pos="720"/>
+        </w:tabs>
+        <w:ind w:left="720" w:hanging="360"/>
+      </w:pPr>
+      <w:rPr>
+        <w:rFonts w:ascii="Symbol" w:hAnsi="Symbol" w:hint="default"/>
+        <w:sz w:val="20"/>
+      </w:rPr>
+    </w:lvl>
+    <w:lvl w:ilvl="1" w:tentative="1">
+      <w:start w:val="1"/>
+      <w:numFmt w:val="bullet"/>
+      <w:lvlText w:val="o"/>
+      <w:lvlJc w:val="left"/>
+      <w:pPr>
+        <w:tabs>
+          <w:tab w:val="num" w:pos="1440"/>
+        </w:tabs>
+        <w:ind w:left="1440" w:hanging="360"/>
+      </w:pPr>
+      <w:rPr>
+        <w:rFonts w:ascii="Courier New" w:hAnsi="Courier New" w:hint="default"/>
+        <w:sz w:val="20"/>
+      </w:rPr>
+    </w:lvl>
+    <w:lvl w:ilvl="2" w:tentative="1">
+      <w:start w:val="1"/>
+      <w:numFmt w:val="bullet"/>
+      <w:lvlText w:val=""/>
+      <w:lvlJc w:val="left"/>
+      <w:pPr>
+        <w:tabs>
+          <w:tab w:val="num" w:pos="2160"/>
+        </w:tabs>
+        <w:ind w:left="2160" w:hanging="360"/>
+      </w:pPr>
+      <w:rPr>
+        <w:rFonts w:ascii="Wingdings" w:hAnsi="Wingdings" w:hint="default"/>
+        <w:sz w:val="20"/>
+      </w:rPr>
+    </w:lvl>
+    <w:lvl w:ilvl="3" w:tentative="1">
+      <w:start w:val="1"/>
+      <w:numFmt w:val="bullet"/>
+      <w:lvlText w:val=""/>
+      <w:lvlJc w:val="left"/>
+      <w:pPr>
+        <w:tabs>
+          <w:tab w:val="num" w:pos="2880"/>
+        </w:tabs>
+        <w:ind w:left="2880" w:hanging="360"/>
+      </w:pPr>
+      <w:rPr>
+        <w:rFonts w:ascii="Wingdings" w:hAnsi="Wingdings" w:hint="default"/>
+        <w:sz w:val="20"/>
+      </w:rPr>
+    </w:lvl>
+    <w:lvl w:ilvl="4" w:tentative="1">
+      <w:start w:val="1"/>
+      <w:numFmt w:val="bullet"/>
+      <w:lvlText w:val=""/>
+      <w:lvlJc w:val="left"/>
+      <w:pPr>
+        <w:tabs>
+          <w:tab w:val="num" w:pos="3600"/>
+        </w:tabs>
+        <w:ind w:left="3600" w:hanging="360"/>
+      </w:pPr>
+      <w:rPr>
+        <w:rFonts w:ascii="Wingdings" w:hAnsi="Wingdings" w:hint="default"/>
+        <w:sz w:val="20"/>
+      </w:rPr>
+    </w:lvl>
+    <w:lvl w:ilvl="5" w:tentative="1">
+      <w:start w:val="1"/>
+      <w:numFmt w:val="bullet"/>
+      <w:lvlText w:val=""/>
+      <w:lvlJc w:val="left"/>
+      <w:pPr>
+        <w:tabs>
+          <w:tab w:val="num" w:pos="4320"/>
+        </w:tabs>
+        <w:ind w:left="4320" w:hanging="360"/>
+      </w:pPr>
+      <w:rPr>
+        <w:rFonts w:ascii="Wingdings" w:hAnsi="Wingdings" w:hint="default"/>
+        <w:sz w:val="20"/>
+      </w:rPr>
+    </w:lvl>
+    <w:lvl w:ilvl="6" w:tentative="1">
+      <w:start w:val="1"/>
+      <w:numFmt w:val="bullet"/>
+      <w:lvlText w:val=""/>
+      <w:lvlJc w:val="left"/>
+      <w:pPr>
+        <w:tabs>
+          <w:tab w:val="num" w:pos="5040"/>
+        </w:tabs>
+        <w:ind w:left="5040" w:hanging="360"/>
+      </w:pPr>
+      <w:rPr>
+        <w:rFonts w:ascii="Wingdings" w:hAnsi="Wingdings" w:hint="default"/>
+        <w:sz w:val="20"/>
+      </w:rPr>
+    </w:lvl>
+    <w:lvl w:ilvl="7" w:tentative="1">
+      <w:start w:val="1"/>
+      <w:numFmt w:val="bullet"/>
+      <w:lvlText w:val=""/>
+      <w:lvlJc w:val="left"/>
+      <w:pPr>
+        <w:tabs>
+          <w:tab w:val="num" w:pos="5760"/>
+        </w:tabs>
+        <w:ind w:left="5760" w:hanging="360"/>
+      </w:pPr>
+      <w:rPr>
+        <w:rFonts w:ascii="Wingdings" w:hAnsi="Wingdings" w:hint="default"/>
+        <w:sz w:val="20"/>
+      </w:rPr>
+    </w:lvl>
+    <w:lvl w:ilvl="8" w:tentative="1">
+      <w:start w:val="1"/>
+      <w:numFmt w:val="bullet"/>
+      <w:lvlText w:val=""/>
+      <w:lvlJc w:val="left"/>
+      <w:pPr>
+        <w:tabs>
+          <w:tab w:val="num" w:pos="6480"/>
+        </w:tabs>
+        <w:ind w:left="6480" w:hanging="360"/>
+      </w:pPr>
+      <w:rPr>
+        <w:rFonts w:ascii="Wingdings" w:hAnsi="Wingdings" w:hint="default"/>
+        <w:sz w:val="20"/>
+      </w:rPr>
+    </w:lvl>
+  </w:abstractNum>
+  <w:abstractNum w:abstractNumId="5" w15:restartNumberingAfterBreak="0">
     <w:nsid w:val="62B058E9"/>
     <w:multiLevelType w:val="multilevel"/>
     <w:tmpl w:val="0421001D"/>
@@ -1195,14 +5118,13 @@
       </w:pPr>
     </w:lvl>
   </w:abstractNum>
-  <w:abstractNum w:abstractNumId="1" w15:restartNumberingAfterBreak="0">
+  <w:abstractNum w:abstractNumId="6" w15:restartNumberingAfterBreak="0">
     <w:nsid w:val="7DE225CA"/>
     <w:multiLevelType w:val="multilevel"/>
-    <w:tmpl w:val="8B384BE0"/>
+    <w:tmpl w:val="EF5C1C9E"/>
     <w:lvl w:ilvl="0">
       <w:start w:val="1"/>
       <w:numFmt w:val="decimal"/>
-      <w:pStyle w:val="Judul1"/>
       <w:suff w:val="nothing"/>
       <w:lvlText w:val="PERTEMUAN %1"/>
       <w:lvlJc w:val="left"/>
@@ -1318,10 +5240,55 @@
     </w:lvl>
   </w:abstractNum>
   <w:num w:numId="1" w16cid:durableId="435977835">
+    <w:abstractNumId w:val="5"/>
+  </w:num>
+  <w:num w:numId="2" w16cid:durableId="430779734">
+    <w:abstractNumId w:val="6"/>
+  </w:num>
+  <w:num w:numId="3" w16cid:durableId="1799684492">
+    <w:abstractNumId w:val="5"/>
+    <w:lvlOverride w:ilvl="0">
+      <w:startOverride w:val="1"/>
+    </w:lvlOverride>
+    <w:lvlOverride w:ilvl="1">
+      <w:startOverride w:val="1"/>
+    </w:lvlOverride>
+    <w:lvlOverride w:ilvl="2">
+      <w:startOverride w:val="1"/>
+    </w:lvlOverride>
+    <w:lvlOverride w:ilvl="3">
+      <w:startOverride w:val="1"/>
+    </w:lvlOverride>
+    <w:lvlOverride w:ilvl="4">
+      <w:startOverride w:val="1"/>
+    </w:lvlOverride>
+    <w:lvlOverride w:ilvl="5">
+      <w:startOverride w:val="1"/>
+    </w:lvlOverride>
+    <w:lvlOverride w:ilvl="6">
+      <w:startOverride w:val="1"/>
+    </w:lvlOverride>
+    <w:lvlOverride w:ilvl="7">
+      <w:startOverride w:val="1"/>
+    </w:lvlOverride>
+    <w:lvlOverride w:ilvl="8">
+      <w:startOverride w:val="1"/>
+    </w:lvlOverride>
+  </w:num>
+  <w:num w:numId="4" w16cid:durableId="1879584797">
     <w:abstractNumId w:val="0"/>
   </w:num>
-  <w:num w:numId="2" w16cid:durableId="430779734">
+  <w:num w:numId="5" w16cid:durableId="1945961542">
     <w:abstractNumId w:val="1"/>
+  </w:num>
+  <w:num w:numId="6" w16cid:durableId="1967075811">
+    <w:abstractNumId w:val="3"/>
+  </w:num>
+  <w:num w:numId="7" w16cid:durableId="1330213808">
+    <w:abstractNumId w:val="2"/>
+  </w:num>
+  <w:num w:numId="8" w16cid:durableId="970742755">
+    <w:abstractNumId w:val="4"/>
   </w:num>
 </w:numbering>
 </file>
@@ -1726,10 +5693,11 @@
   <w:style w:type="paragraph" w:default="1" w:styleId="Normal">
     <w:name w:val="Normal"/>
     <w:qFormat/>
-    <w:rsid w:val="00EA2414"/>
+    <w:rsid w:val="00BD5642"/>
     <w:pPr>
       <w:spacing w:after="120" w:line="360" w:lineRule="auto"/>
       <w:ind w:firstLine="720"/>
+      <w:jc w:val="both"/>
     </w:pPr>
     <w:rPr>
       <w:rFonts w:ascii="Times New Roman" w:hAnsi="Times New Roman"/>
@@ -1747,7 +5715,7 @@
       <w:keepNext/>
       <w:keepLines/>
       <w:numPr>
-        <w:numId w:val="2"/>
+        <w:numId w:val="4"/>
       </w:numPr>
       <w:spacing w:before="360" w:after="80"/>
       <w:jc w:val="center"/>
@@ -1767,14 +5735,18 @@
     <w:next w:val="Normal"/>
     <w:link w:val="Judul2KAR"/>
     <w:uiPriority w:val="9"/>
-    <w:semiHidden/>
     <w:unhideWhenUsed/>
     <w:qFormat/>
-    <w:rsid w:val="00846721"/>
+    <w:rsid w:val="00556ED2"/>
     <w:pPr>
       <w:keepNext/>
       <w:keepLines/>
+      <w:numPr>
+        <w:ilvl w:val="1"/>
+        <w:numId w:val="4"/>
+      </w:numPr>
       <w:spacing w:before="160" w:after="80"/>
+      <w:ind w:left="0" w:firstLine="0"/>
       <w:outlineLvl w:val="1"/>
     </w:pPr>
     <w:rPr>
@@ -1790,20 +5762,24 @@
     <w:next w:val="Normal"/>
     <w:link w:val="Judul3KAR"/>
     <w:uiPriority w:val="9"/>
-    <w:semiHidden/>
     <w:unhideWhenUsed/>
     <w:qFormat/>
-    <w:rsid w:val="00EA2414"/>
+    <w:rsid w:val="000247BE"/>
     <w:pPr>
       <w:keepNext/>
       <w:keepLines/>
+      <w:numPr>
+        <w:ilvl w:val="2"/>
+        <w:numId w:val="4"/>
+      </w:numPr>
       <w:spacing w:before="160" w:after="80"/>
+      <w:ind w:left="1105" w:hanging="680"/>
       <w:outlineLvl w:val="2"/>
     </w:pPr>
     <w:rPr>
       <w:rFonts w:eastAsiaTheme="majorEastAsia" w:cstheme="majorBidi"/>
-      <w:color w:val="0F4761" w:themeColor="accent1" w:themeShade="BF"/>
-      <w:sz w:val="28"/>
+      <w:b/>
+      <w:color w:val="000000" w:themeColor="text1"/>
       <w:szCs w:val="28"/>
     </w:rPr>
   </w:style>
@@ -1942,6 +5918,7 @@
   <w:style w:type="character" w:default="1" w:styleId="FontParagrafDefault">
     <w:name w:val="Default Paragraph Font"/>
     <w:uiPriority w:val="1"/>
+    <w:semiHidden/>
     <w:unhideWhenUsed/>
   </w:style>
   <w:style w:type="table" w:default="1" w:styleId="TabelNormal">
@@ -1984,8 +5961,7 @@
     <w:basedOn w:val="FontParagrafDefault"/>
     <w:link w:val="Judul2"/>
     <w:uiPriority w:val="9"/>
-    <w:semiHidden/>
-    <w:rsid w:val="00846721"/>
+    <w:rsid w:val="00556ED2"/>
     <w:rPr>
       <w:rFonts w:ascii="Times New Roman" w:eastAsiaTheme="majorEastAsia" w:hAnsi="Times New Roman" w:cstheme="majorBidi"/>
       <w:b/>
@@ -1998,12 +5974,11 @@
     <w:basedOn w:val="FontParagrafDefault"/>
     <w:link w:val="Judul3"/>
     <w:uiPriority w:val="9"/>
-    <w:semiHidden/>
-    <w:rsid w:val="00EA2414"/>
+    <w:rsid w:val="000247BE"/>
     <w:rPr>
-      <w:rFonts w:eastAsiaTheme="majorEastAsia" w:cstheme="majorBidi"/>
-      <w:color w:val="0F4761" w:themeColor="accent1" w:themeShade="BF"/>
-      <w:sz w:val="28"/>
+      <w:rFonts w:ascii="Times New Roman" w:eastAsiaTheme="majorEastAsia" w:hAnsi="Times New Roman" w:cstheme="majorBidi"/>
+      <w:b/>
+      <w:color w:val="000000" w:themeColor="text1"/>
       <w:szCs w:val="28"/>
     </w:rPr>
   </w:style>
@@ -2131,6 +6106,7 @@
       <w:numPr>
         <w:ilvl w:val="1"/>
       </w:numPr>
+      <w:ind w:firstLine="720"/>
     </w:pPr>
     <w:rPr>
       <w:rFonts w:eastAsiaTheme="majorEastAsia" w:cstheme="majorBidi"/>
@@ -2343,6 +6319,79 @@
     <w:rPr>
       <w:rFonts w:ascii="Times New Roman" w:hAnsi="Times New Roman"/>
     </w:rPr>
+  </w:style>
+  <w:style w:type="paragraph" w:styleId="NormalWeb">
+    <w:name w:val="Normal (Web)"/>
+    <w:basedOn w:val="Normal"/>
+    <w:uiPriority w:val="99"/>
+    <w:semiHidden/>
+    <w:unhideWhenUsed/>
+    <w:rsid w:val="00556ED2"/>
+    <w:pPr>
+      <w:spacing w:before="100" w:beforeAutospacing="1" w:after="100" w:afterAutospacing="1" w:line="240" w:lineRule="auto"/>
+      <w:ind w:firstLine="0"/>
+    </w:pPr>
+    <w:rPr>
+      <w:rFonts w:eastAsia="Times New Roman" w:cs="Times New Roman"/>
+      <w:kern w:val="0"/>
+      <w:lang w:eastAsia="id-ID"/>
+      <w14:ligatures w14:val="none"/>
+    </w:rPr>
+  </w:style>
+  <w:style w:type="character" w:styleId="Kuat">
+    <w:name w:val="Strong"/>
+    <w:basedOn w:val="FontParagrafDefault"/>
+    <w:uiPriority w:val="22"/>
+    <w:qFormat/>
+    <w:rsid w:val="00556ED2"/>
+    <w:rPr>
+      <w:b/>
+      <w:bCs/>
+    </w:rPr>
+  </w:style>
+  <w:style w:type="character" w:styleId="Penekanan">
+    <w:name w:val="Emphasis"/>
+    <w:basedOn w:val="FontParagrafDefault"/>
+    <w:uiPriority w:val="20"/>
+    <w:qFormat/>
+    <w:rsid w:val="00D35511"/>
+    <w:rPr>
+      <w:i/>
+      <w:iCs/>
+    </w:rPr>
+  </w:style>
+  <w:style w:type="paragraph" w:styleId="TOC2">
+    <w:name w:val="toc 2"/>
+    <w:basedOn w:val="Normal"/>
+    <w:next w:val="Normal"/>
+    <w:autoRedefine/>
+    <w:uiPriority w:val="39"/>
+    <w:unhideWhenUsed/>
+    <w:rsid w:val="009418AF"/>
+    <w:pPr>
+      <w:tabs>
+        <w:tab w:val="right" w:leader="dot" w:pos="7927"/>
+      </w:tabs>
+      <w:spacing w:after="100"/>
+      <w:ind w:firstLine="426"/>
+    </w:pPr>
+  </w:style>
+  <w:style w:type="paragraph" w:styleId="TOC3">
+    <w:name w:val="toc 3"/>
+    <w:basedOn w:val="Normal"/>
+    <w:next w:val="Normal"/>
+    <w:autoRedefine/>
+    <w:uiPriority w:val="39"/>
+    <w:unhideWhenUsed/>
+    <w:rsid w:val="009418AF"/>
+    <w:pPr>
+      <w:tabs>
+        <w:tab w:val="left" w:pos="1440"/>
+        <w:tab w:val="right" w:leader="dot" w:pos="7927"/>
+      </w:tabs>
+      <w:spacing w:after="100"/>
+      <w:ind w:left="284" w:firstLine="425"/>
+    </w:pPr>
   </w:style>
 </w:styles>
 </file>

</xml_diff>

<commit_message>
ringkasan setengah semester (2)
</commit_message>
<xml_diff>
--- a/LAPORAN PRAKTIKUM.docx
+++ b/LAPORAN PRAKTIKUM.docx
@@ -4178,6 +4178,148 @@
     </w:p>
     <w:p>
       <w:pPr>
+        <w:rPr>
+          <w:lang w:eastAsia="id-ID"/>
+        </w:rPr>
+      </w:pPr>
+      <w:r>
+        <w:rPr>
+          <w:lang w:eastAsia="id-ID"/>
+        </w:rPr>
+        <w:t xml:space="preserve">Dalam pengembangan perangkat lunak berbasis </w:t>
+      </w:r>
+      <w:proofErr w:type="spellStart"/>
+      <w:r>
+        <w:rPr>
+          <w:lang w:eastAsia="id-ID"/>
+        </w:rPr>
+        <w:t>Object-Oriented</w:t>
+      </w:r>
+      <w:proofErr w:type="spellEnd"/>
+      <w:r>
+        <w:rPr>
+          <w:lang w:eastAsia="id-ID"/>
+        </w:rPr>
+        <w:t xml:space="preserve"> </w:t>
+      </w:r>
+      <w:proofErr w:type="spellStart"/>
+      <w:r>
+        <w:rPr>
+          <w:lang w:eastAsia="id-ID"/>
+        </w:rPr>
+        <w:t>Programming</w:t>
+      </w:r>
+      <w:proofErr w:type="spellEnd"/>
+      <w:r>
+        <w:rPr>
+          <w:lang w:eastAsia="id-ID"/>
+        </w:rPr>
+        <w:t xml:space="preserve"> (OOP), diperlukan mekanisme untuk menjaga keamanan data serta mengurangi kompleksitas sistem. Dua konsep utama yang mendukung hal tersebut adalah </w:t>
+      </w:r>
+      <w:proofErr w:type="spellStart"/>
+      <w:r>
+        <w:rPr>
+          <w:i/>
+          <w:iCs/>
+          <w:lang w:eastAsia="id-ID"/>
+        </w:rPr>
+        <w:t>encapsulation</w:t>
+      </w:r>
+      <w:proofErr w:type="spellEnd"/>
+      <w:r>
+        <w:rPr>
+          <w:lang w:eastAsia="id-ID"/>
+        </w:rPr>
+        <w:t xml:space="preserve"> dan </w:t>
+      </w:r>
+      <w:proofErr w:type="spellStart"/>
+      <w:r>
+        <w:rPr>
+          <w:i/>
+          <w:iCs/>
+          <w:lang w:eastAsia="id-ID"/>
+        </w:rPr>
+        <w:t>abstraction</w:t>
+      </w:r>
+      <w:proofErr w:type="spellEnd"/>
+      <w:r>
+        <w:rPr>
+          <w:lang w:eastAsia="id-ID"/>
+        </w:rPr>
+        <w:t xml:space="preserve">. </w:t>
+      </w:r>
+      <w:proofErr w:type="spellStart"/>
+      <w:r>
+        <w:rPr>
+          <w:lang w:eastAsia="id-ID"/>
+        </w:rPr>
+        <w:t>Encapsulation</w:t>
+      </w:r>
+      <w:proofErr w:type="spellEnd"/>
+      <w:r>
+        <w:rPr>
+          <w:lang w:eastAsia="id-ID"/>
+        </w:rPr>
+        <w:t xml:space="preserve"> memungkinkan pembatasan akses terhadap atribut sehingga data tidak dapat diubah secara langsung tanpa melalui kontrol tertentu. Sementara itu, </w:t>
+      </w:r>
+      <w:proofErr w:type="spellStart"/>
+      <w:r>
+        <w:rPr>
+          <w:lang w:eastAsia="id-ID"/>
+        </w:rPr>
+        <w:t>abstraction</w:t>
+      </w:r>
+      <w:proofErr w:type="spellEnd"/>
+      <w:r>
+        <w:rPr>
+          <w:lang w:eastAsia="id-ID"/>
+        </w:rPr>
+        <w:t xml:space="preserve"> berfungsi untuk menyederhanakan sistem dengan hanya menampilkan fitur-fitur penting kepada pengguna tanpa memperlihatkan detail implementasi.</w:t>
+      </w:r>
+    </w:p>
+    <w:p>
+      <w:pPr>
+        <w:rPr>
+          <w:lang w:eastAsia="id-ID"/>
+        </w:rPr>
+      </w:pPr>
+      <w:r>
+        <w:rPr>
+          <w:lang w:eastAsia="id-ID"/>
+        </w:rPr>
+        <w:t xml:space="preserve">Penerapan kedua konsep ini sangat penting dalam membangun sistem yang modular, aman, dan mudah dipelihara. Dengan </w:t>
+      </w:r>
+      <w:proofErr w:type="spellStart"/>
+      <w:r>
+        <w:rPr>
+          <w:lang w:eastAsia="id-ID"/>
+        </w:rPr>
+        <w:t>encapsulation</w:t>
+      </w:r>
+      <w:proofErr w:type="spellEnd"/>
+      <w:r>
+        <w:rPr>
+          <w:lang w:eastAsia="id-ID"/>
+        </w:rPr>
+        <w:t xml:space="preserve">, integritas data dapat terjaga, sedangkan </w:t>
+      </w:r>
+      <w:proofErr w:type="spellStart"/>
+      <w:r>
+        <w:rPr>
+          <w:lang w:eastAsia="id-ID"/>
+        </w:rPr>
+        <w:t>abstraction</w:t>
+      </w:r>
+      <w:proofErr w:type="spellEnd"/>
+      <w:r>
+        <w:rPr>
+          <w:lang w:eastAsia="id-ID"/>
+        </w:rPr>
+        <w:t xml:space="preserve"> membantu pengguna dalam memahami dan menggunakan sistem tanpa harus mengetahui seluruh proses internal yang kompleks.</w:t>
+      </w:r>
+    </w:p>
+    <w:p>
+      <w:pPr>
         <w:pStyle w:val="Judul2"/>
       </w:pPr>
       <w:r>
@@ -4186,6 +4328,414 @@
     </w:p>
     <w:p>
       <w:pPr>
+        <w:pStyle w:val="DaftarParagraf"/>
+        <w:numPr>
+          <w:ilvl w:val="0"/>
+          <w:numId w:val="9"/>
+        </w:numPr>
+        <w:spacing w:after="0" w:line="240" w:lineRule="auto"/>
+        <w:jc w:val="left"/>
+        <w:rPr>
+          <w:rFonts w:eastAsia="Times New Roman" w:cs="Times New Roman"/>
+          <w:kern w:val="0"/>
+          <w:lang w:eastAsia="id-ID"/>
+          <w14:ligatures w14:val="none"/>
+        </w:rPr>
+      </w:pPr>
+      <w:r>
+        <w:rPr>
+          <w:rFonts w:eastAsia="Times New Roman" w:cs="Times New Roman"/>
+          <w:kern w:val="0"/>
+          <w:lang w:eastAsia="id-ID"/>
+          <w14:ligatures w14:val="none"/>
+        </w:rPr>
+        <w:t xml:space="preserve">Memahami konsep </w:t>
+      </w:r>
+      <w:proofErr w:type="spellStart"/>
+      <w:r>
+        <w:rPr>
+          <w:rFonts w:eastAsia="Times New Roman" w:cs="Times New Roman"/>
+          <w:kern w:val="0"/>
+          <w:lang w:eastAsia="id-ID"/>
+          <w14:ligatures w14:val="none"/>
+        </w:rPr>
+        <w:t>encapsulation</w:t>
+      </w:r>
+      <w:proofErr w:type="spellEnd"/>
+      <w:r>
+        <w:rPr>
+          <w:rFonts w:eastAsia="Times New Roman" w:cs="Times New Roman"/>
+          <w:kern w:val="0"/>
+          <w:lang w:eastAsia="id-ID"/>
+          <w14:ligatures w14:val="none"/>
+        </w:rPr>
+        <w:t xml:space="preserve"> dalam OOP. </w:t>
+      </w:r>
+    </w:p>
+    <w:p>
+      <w:pPr>
+        <w:pStyle w:val="DaftarParagraf"/>
+        <w:numPr>
+          <w:ilvl w:val="0"/>
+          <w:numId w:val="9"/>
+        </w:numPr>
+        <w:spacing w:after="0" w:line="240" w:lineRule="auto"/>
+        <w:jc w:val="left"/>
+        <w:rPr>
+          <w:rFonts w:eastAsia="Times New Roman" w:cs="Times New Roman"/>
+          <w:kern w:val="0"/>
+          <w:lang w:eastAsia="id-ID"/>
+          <w14:ligatures w14:val="none"/>
+        </w:rPr>
+      </w:pPr>
+      <w:r>
+        <w:rPr>
+          <w:rFonts w:eastAsia="Times New Roman" w:cs="Times New Roman"/>
+          <w:kern w:val="0"/>
+          <w:lang w:eastAsia="id-ID"/>
+          <w14:ligatures w14:val="none"/>
+        </w:rPr>
+        <w:t xml:space="preserve">Memahami konsep </w:t>
+      </w:r>
+      <w:proofErr w:type="spellStart"/>
+      <w:r>
+        <w:rPr>
+          <w:rFonts w:eastAsia="Times New Roman" w:cs="Times New Roman"/>
+          <w:kern w:val="0"/>
+          <w:lang w:eastAsia="id-ID"/>
+          <w14:ligatures w14:val="none"/>
+        </w:rPr>
+        <w:t>abstraction</w:t>
+      </w:r>
+      <w:proofErr w:type="spellEnd"/>
+      <w:r>
+        <w:rPr>
+          <w:rFonts w:eastAsia="Times New Roman" w:cs="Times New Roman"/>
+          <w:kern w:val="0"/>
+          <w:lang w:eastAsia="id-ID"/>
+          <w14:ligatures w14:val="none"/>
+        </w:rPr>
+        <w:t xml:space="preserve"> dalam OOP. </w:t>
+      </w:r>
+    </w:p>
+    <w:p>
+      <w:pPr>
+        <w:pStyle w:val="DaftarParagraf"/>
+        <w:numPr>
+          <w:ilvl w:val="0"/>
+          <w:numId w:val="9"/>
+        </w:numPr>
+        <w:spacing w:after="0" w:line="240" w:lineRule="auto"/>
+        <w:jc w:val="left"/>
+        <w:rPr>
+          <w:rFonts w:eastAsia="Times New Roman" w:cs="Times New Roman"/>
+          <w:kern w:val="0"/>
+          <w:lang w:eastAsia="id-ID"/>
+          <w14:ligatures w14:val="none"/>
+        </w:rPr>
+      </w:pPr>
+      <w:r>
+        <w:rPr>
+          <w:rFonts w:eastAsia="Times New Roman" w:cs="Times New Roman"/>
+          <w:kern w:val="0"/>
+          <w:lang w:eastAsia="id-ID"/>
+          <w14:ligatures w14:val="none"/>
+        </w:rPr>
+        <w:t xml:space="preserve">Mengetahui cara membatasi akses atribut menggunakan </w:t>
+      </w:r>
+      <w:proofErr w:type="spellStart"/>
+      <w:r>
+        <w:rPr>
+          <w:rFonts w:eastAsia="Times New Roman" w:cs="Times New Roman"/>
+          <w:kern w:val="0"/>
+          <w:lang w:eastAsia="id-ID"/>
+          <w14:ligatures w14:val="none"/>
+        </w:rPr>
+        <w:t>modifier</w:t>
+      </w:r>
+      <w:proofErr w:type="spellEnd"/>
+      <w:r>
+        <w:rPr>
+          <w:rFonts w:eastAsia="Times New Roman" w:cs="Times New Roman"/>
+          <w:kern w:val="0"/>
+          <w:lang w:eastAsia="id-ID"/>
+          <w14:ligatures w14:val="none"/>
+        </w:rPr>
+        <w:t xml:space="preserve"> (</w:t>
+      </w:r>
+      <w:proofErr w:type="spellStart"/>
+      <w:r>
+        <w:rPr>
+          <w:rFonts w:eastAsia="Times New Roman" w:cs="Times New Roman"/>
+          <w:kern w:val="0"/>
+          <w:lang w:eastAsia="id-ID"/>
+          <w14:ligatures w14:val="none"/>
+        </w:rPr>
+        <w:t>public</w:t>
+      </w:r>
+      <w:proofErr w:type="spellEnd"/>
+      <w:r>
+        <w:rPr>
+          <w:rFonts w:eastAsia="Times New Roman" w:cs="Times New Roman"/>
+          <w:kern w:val="0"/>
+          <w:lang w:eastAsia="id-ID"/>
+          <w14:ligatures w14:val="none"/>
+        </w:rPr>
+        <w:t xml:space="preserve">, </w:t>
+      </w:r>
+      <w:proofErr w:type="spellStart"/>
+      <w:r>
+        <w:rPr>
+          <w:rFonts w:eastAsia="Times New Roman" w:cs="Times New Roman"/>
+          <w:kern w:val="0"/>
+          <w:lang w:eastAsia="id-ID"/>
+          <w14:ligatures w14:val="none"/>
+        </w:rPr>
+        <w:t>protected</w:t>
+      </w:r>
+      <w:proofErr w:type="spellEnd"/>
+      <w:r>
+        <w:rPr>
+          <w:rFonts w:eastAsia="Times New Roman" w:cs="Times New Roman"/>
+          <w:kern w:val="0"/>
+          <w:lang w:eastAsia="id-ID"/>
+          <w14:ligatures w14:val="none"/>
+        </w:rPr>
+        <w:t xml:space="preserve">, </w:t>
+      </w:r>
+      <w:proofErr w:type="spellStart"/>
+      <w:r>
+        <w:rPr>
+          <w:rFonts w:eastAsia="Times New Roman" w:cs="Times New Roman"/>
+          <w:kern w:val="0"/>
+          <w:lang w:eastAsia="id-ID"/>
+          <w14:ligatures w14:val="none"/>
+        </w:rPr>
+        <w:t>private</w:t>
+      </w:r>
+      <w:proofErr w:type="spellEnd"/>
+      <w:r>
+        <w:rPr>
+          <w:rFonts w:eastAsia="Times New Roman" w:cs="Times New Roman"/>
+          <w:kern w:val="0"/>
+          <w:lang w:eastAsia="id-ID"/>
+          <w14:ligatures w14:val="none"/>
+        </w:rPr>
+        <w:t xml:space="preserve">). </w:t>
+      </w:r>
+    </w:p>
+    <w:p>
+      <w:pPr>
+        <w:pStyle w:val="DaftarParagraf"/>
+        <w:numPr>
+          <w:ilvl w:val="0"/>
+          <w:numId w:val="9"/>
+        </w:numPr>
+        <w:spacing w:after="0" w:line="240" w:lineRule="auto"/>
+        <w:jc w:val="left"/>
+        <w:rPr>
+          <w:rFonts w:eastAsia="Times New Roman" w:cs="Times New Roman"/>
+          <w:kern w:val="0"/>
+          <w:lang w:eastAsia="id-ID"/>
+          <w14:ligatures w14:val="none"/>
+        </w:rPr>
+      </w:pPr>
+      <w:r>
+        <w:rPr>
+          <w:rFonts w:eastAsia="Times New Roman" w:cs="Times New Roman"/>
+          <w:kern w:val="0"/>
+          <w:lang w:eastAsia="id-ID"/>
+          <w14:ligatures w14:val="none"/>
+        </w:rPr>
+        <w:t xml:space="preserve">Mampu mengimplementasikan </w:t>
+      </w:r>
+      <w:proofErr w:type="spellStart"/>
+      <w:r>
+        <w:rPr>
+          <w:rFonts w:eastAsia="Times New Roman" w:cs="Times New Roman"/>
+          <w:kern w:val="0"/>
+          <w:lang w:eastAsia="id-ID"/>
+          <w14:ligatures w14:val="none"/>
+        </w:rPr>
+        <w:t>getter</w:t>
+      </w:r>
+      <w:proofErr w:type="spellEnd"/>
+      <w:r>
+        <w:rPr>
+          <w:rFonts w:eastAsia="Times New Roman" w:cs="Times New Roman"/>
+          <w:kern w:val="0"/>
+          <w:lang w:eastAsia="id-ID"/>
+          <w14:ligatures w14:val="none"/>
+        </w:rPr>
+        <w:t xml:space="preserve"> dan </w:t>
+      </w:r>
+      <w:proofErr w:type="spellStart"/>
+      <w:r>
+        <w:rPr>
+          <w:rFonts w:eastAsia="Times New Roman" w:cs="Times New Roman"/>
+          <w:kern w:val="0"/>
+          <w:lang w:eastAsia="id-ID"/>
+          <w14:ligatures w14:val="none"/>
+        </w:rPr>
+        <w:t>setter</w:t>
+      </w:r>
+      <w:proofErr w:type="spellEnd"/>
+      <w:r>
+        <w:rPr>
+          <w:rFonts w:eastAsia="Times New Roman" w:cs="Times New Roman"/>
+          <w:kern w:val="0"/>
+          <w:lang w:eastAsia="id-ID"/>
+          <w14:ligatures w14:val="none"/>
+        </w:rPr>
+        <w:t xml:space="preserve"> sebagai kontrol akses data. </w:t>
+      </w:r>
+    </w:p>
+    <w:p>
+      <w:pPr>
+        <w:pStyle w:val="DaftarParagraf"/>
+        <w:numPr>
+          <w:ilvl w:val="0"/>
+          <w:numId w:val="9"/>
+        </w:numPr>
+        <w:spacing w:after="0" w:line="240" w:lineRule="auto"/>
+        <w:jc w:val="left"/>
+        <w:rPr>
+          <w:rFonts w:eastAsia="Times New Roman" w:cs="Times New Roman"/>
+          <w:kern w:val="0"/>
+          <w:lang w:eastAsia="id-ID"/>
+          <w14:ligatures w14:val="none"/>
+        </w:rPr>
+      </w:pPr>
+      <w:r>
+        <w:rPr>
+          <w:rFonts w:eastAsia="Times New Roman" w:cs="Times New Roman"/>
+          <w:kern w:val="0"/>
+          <w:lang w:eastAsia="id-ID"/>
+          <w14:ligatures w14:val="none"/>
+        </w:rPr>
+        <w:t xml:space="preserve">Memahami penerapan </w:t>
+      </w:r>
+      <w:proofErr w:type="spellStart"/>
+      <w:r>
+        <w:rPr>
+          <w:rFonts w:eastAsia="Times New Roman" w:cs="Times New Roman"/>
+          <w:kern w:val="0"/>
+          <w:lang w:eastAsia="id-ID"/>
+          <w14:ligatures w14:val="none"/>
+        </w:rPr>
+        <w:t>abstraction</w:t>
+      </w:r>
+      <w:proofErr w:type="spellEnd"/>
+      <w:r>
+        <w:rPr>
+          <w:rFonts w:eastAsia="Times New Roman" w:cs="Times New Roman"/>
+          <w:kern w:val="0"/>
+          <w:lang w:eastAsia="id-ID"/>
+          <w14:ligatures w14:val="none"/>
+        </w:rPr>
+        <w:t xml:space="preserve"> dalam menyederhanakan penggunaan </w:t>
+      </w:r>
+      <w:proofErr w:type="spellStart"/>
+      <w:r>
+        <w:rPr>
+          <w:rFonts w:eastAsia="Times New Roman" w:cs="Times New Roman"/>
+          <w:kern w:val="0"/>
+          <w:lang w:eastAsia="id-ID"/>
+          <w14:ligatures w14:val="none"/>
+        </w:rPr>
+        <w:t>class</w:t>
+      </w:r>
+      <w:proofErr w:type="spellEnd"/>
+      <w:r>
+        <w:rPr>
+          <w:rFonts w:eastAsia="Times New Roman" w:cs="Times New Roman"/>
+          <w:kern w:val="0"/>
+          <w:lang w:eastAsia="id-ID"/>
+          <w14:ligatures w14:val="none"/>
+        </w:rPr>
+        <w:t xml:space="preserve">. </w:t>
+      </w:r>
+    </w:p>
+    <w:p>
+      <w:pPr>
+        <w:pStyle w:val="DaftarParagraf"/>
+        <w:numPr>
+          <w:ilvl w:val="0"/>
+          <w:numId w:val="9"/>
+        </w:numPr>
+      </w:pPr>
+      <w:r>
+        <w:rPr>
+          <w:rFonts w:eastAsia="Times New Roman" w:cs="Times New Roman"/>
+          <w:kern w:val="0"/>
+          <w:lang w:eastAsia="id-ID"/>
+          <w14:ligatures w14:val="none"/>
+        </w:rPr>
+        <w:t xml:space="preserve">Mengimplementasikan </w:t>
+      </w:r>
+      <w:proofErr w:type="spellStart"/>
+      <w:r>
+        <w:rPr>
+          <w:rFonts w:eastAsia="Times New Roman" w:cs="Times New Roman"/>
+          <w:kern w:val="0"/>
+          <w:lang w:eastAsia="id-ID"/>
+          <w14:ligatures w14:val="none"/>
+        </w:rPr>
+        <w:t>encapsulation</w:t>
+      </w:r>
+      <w:proofErr w:type="spellEnd"/>
+      <w:r>
+        <w:rPr>
+          <w:rFonts w:eastAsia="Times New Roman" w:cs="Times New Roman"/>
+          <w:kern w:val="0"/>
+          <w:lang w:eastAsia="id-ID"/>
+          <w14:ligatures w14:val="none"/>
+        </w:rPr>
+        <w:t xml:space="preserve"> dan </w:t>
+      </w:r>
+      <w:proofErr w:type="spellStart"/>
+      <w:r>
+        <w:rPr>
+          <w:rFonts w:eastAsia="Times New Roman" w:cs="Times New Roman"/>
+          <w:kern w:val="0"/>
+          <w:lang w:eastAsia="id-ID"/>
+          <w14:ligatures w14:val="none"/>
+        </w:rPr>
+        <w:t>abstraction</w:t>
+      </w:r>
+      <w:proofErr w:type="spellEnd"/>
+      <w:r>
+        <w:rPr>
+          <w:rFonts w:eastAsia="Times New Roman" w:cs="Times New Roman"/>
+          <w:kern w:val="0"/>
+          <w:lang w:eastAsia="id-ID"/>
+          <w14:ligatures w14:val="none"/>
+        </w:rPr>
+        <w:t xml:space="preserve"> menggunakan </w:t>
+      </w:r>
+      <w:proofErr w:type="spellStart"/>
+      <w:r>
+        <w:rPr>
+          <w:rFonts w:eastAsia="Times New Roman" w:cs="Times New Roman"/>
+          <w:kern w:val="0"/>
+          <w:lang w:eastAsia="id-ID"/>
+          <w14:ligatures w14:val="none"/>
+        </w:rPr>
+        <w:t>Python</w:t>
+      </w:r>
+      <w:proofErr w:type="spellEnd"/>
+      <w:r>
+        <w:rPr>
+          <w:rFonts w:eastAsia="Times New Roman" w:cs="Times New Roman"/>
+          <w:kern w:val="0"/>
+          <w:lang w:eastAsia="id-ID"/>
+          <w14:ligatures w14:val="none"/>
+        </w:rPr>
+        <w:t>.</w:t>
+      </w:r>
+    </w:p>
+    <w:p>
+      <w:pPr>
         <w:pStyle w:val="Judul2"/>
       </w:pPr>
       <w:r>
@@ -4194,9 +4744,379 @@
     </w:p>
     <w:p>
       <w:pPr>
+        <w:rPr>
+          <w:lang w:eastAsia="id-ID"/>
+        </w:rPr>
+      </w:pPr>
+      <w:proofErr w:type="spellStart"/>
+      <w:r>
+        <w:rPr>
+          <w:b/>
+          <w:bCs/>
+          <w:lang w:eastAsia="id-ID"/>
+        </w:rPr>
+        <w:t>Encapsulation</w:t>
+      </w:r>
+      <w:proofErr w:type="spellEnd"/>
+      <w:r>
+        <w:rPr>
+          <w:lang w:eastAsia="id-ID"/>
+        </w:rPr>
+        <w:t xml:space="preserve"> merupakan konsep dalam OOP yang bertujuan untuk menyembunyikan data (</w:t>
+      </w:r>
+      <w:r>
+        <w:rPr>
+          <w:i/>
+          <w:iCs/>
+          <w:lang w:eastAsia="id-ID"/>
+        </w:rPr>
+        <w:t xml:space="preserve">data </w:t>
+      </w:r>
+      <w:proofErr w:type="spellStart"/>
+      <w:r>
+        <w:rPr>
+          <w:i/>
+          <w:iCs/>
+          <w:lang w:eastAsia="id-ID"/>
+        </w:rPr>
+        <w:t>hiding</w:t>
+      </w:r>
+      <w:proofErr w:type="spellEnd"/>
+      <w:r>
+        <w:rPr>
+          <w:lang w:eastAsia="id-ID"/>
+        </w:rPr>
+        <w:t xml:space="preserve">) dengan membatasi akses langsung terhadap atribut. Dalam </w:t>
+      </w:r>
+      <w:proofErr w:type="spellStart"/>
+      <w:r>
+        <w:rPr>
+          <w:lang w:eastAsia="id-ID"/>
+        </w:rPr>
+        <w:t>Python</w:t>
+      </w:r>
+      <w:proofErr w:type="spellEnd"/>
+      <w:r>
+        <w:rPr>
+          <w:lang w:eastAsia="id-ID"/>
+        </w:rPr>
+        <w:t xml:space="preserve">, </w:t>
+      </w:r>
+      <w:proofErr w:type="spellStart"/>
+      <w:r>
+        <w:rPr>
+          <w:lang w:eastAsia="id-ID"/>
+        </w:rPr>
+        <w:t>encapsulation</w:t>
+      </w:r>
+      <w:proofErr w:type="spellEnd"/>
+      <w:r>
+        <w:rPr>
+          <w:lang w:eastAsia="id-ID"/>
+        </w:rPr>
+        <w:t xml:space="preserve"> dapat diterapkan dengan menggunakan penamaan atribut seperti </w:t>
+      </w:r>
+      <w:r>
+        <w:rPr>
+          <w:rFonts w:ascii="Courier New" w:hAnsi="Courier New" w:cs="Courier New"/>
+          <w:sz w:val="20"/>
+          <w:szCs w:val="20"/>
+          <w:lang w:eastAsia="id-ID"/>
+        </w:rPr>
+        <w:t>_atribut</w:t>
+      </w:r>
+      <w:r>
+        <w:rPr>
+          <w:lang w:eastAsia="id-ID"/>
+        </w:rPr>
+        <w:t xml:space="preserve"> (</w:t>
+      </w:r>
+      <w:proofErr w:type="spellStart"/>
+      <w:r>
+        <w:rPr>
+          <w:lang w:eastAsia="id-ID"/>
+        </w:rPr>
+        <w:t>protected</w:t>
+      </w:r>
+      <w:proofErr w:type="spellEnd"/>
+      <w:r>
+        <w:rPr>
+          <w:lang w:eastAsia="id-ID"/>
+        </w:rPr>
+        <w:t xml:space="preserve">) dan </w:t>
+      </w:r>
+      <w:r>
+        <w:rPr>
+          <w:rFonts w:ascii="Courier New" w:hAnsi="Courier New" w:cs="Courier New"/>
+          <w:sz w:val="20"/>
+          <w:szCs w:val="20"/>
+          <w:lang w:eastAsia="id-ID"/>
+        </w:rPr>
+        <w:t>__atribut</w:t>
+      </w:r>
+      <w:r>
+        <w:rPr>
+          <w:lang w:eastAsia="id-ID"/>
+        </w:rPr>
+        <w:t xml:space="preserve"> (</w:t>
+      </w:r>
+      <w:proofErr w:type="spellStart"/>
+      <w:r>
+        <w:rPr>
+          <w:lang w:eastAsia="id-ID"/>
+        </w:rPr>
+        <w:t>private</w:t>
+      </w:r>
+      <w:proofErr w:type="spellEnd"/>
+      <w:r>
+        <w:rPr>
+          <w:lang w:eastAsia="id-ID"/>
+        </w:rPr>
+        <w:t xml:space="preserve">). Akses </w:t>
+      </w:r>
+      <w:r>
+        <w:rPr>
+          <w:lang w:eastAsia="id-ID"/>
+        </w:rPr>
+        <w:lastRenderedPageBreak/>
+        <w:t xml:space="preserve">terhadap atribut </w:t>
+      </w:r>
+      <w:proofErr w:type="spellStart"/>
+      <w:r>
+        <w:rPr>
+          <w:lang w:eastAsia="id-ID"/>
+        </w:rPr>
+        <w:t>private</w:t>
+      </w:r>
+      <w:proofErr w:type="spellEnd"/>
+      <w:r>
+        <w:rPr>
+          <w:lang w:eastAsia="id-ID"/>
+        </w:rPr>
+        <w:t xml:space="preserve"> umumnya dilakukan melalui </w:t>
+      </w:r>
+      <w:proofErr w:type="spellStart"/>
+      <w:r>
+        <w:rPr>
+          <w:lang w:eastAsia="id-ID"/>
+        </w:rPr>
+        <w:t>method</w:t>
+      </w:r>
+      <w:proofErr w:type="spellEnd"/>
+      <w:r>
+        <w:rPr>
+          <w:lang w:eastAsia="id-ID"/>
+        </w:rPr>
+        <w:t xml:space="preserve"> seperti </w:t>
+      </w:r>
+      <w:proofErr w:type="spellStart"/>
+      <w:r>
+        <w:rPr>
+          <w:i/>
+          <w:iCs/>
+          <w:lang w:eastAsia="id-ID"/>
+        </w:rPr>
+        <w:t>getter</w:t>
+      </w:r>
+      <w:proofErr w:type="spellEnd"/>
+      <w:r>
+        <w:rPr>
+          <w:lang w:eastAsia="id-ID"/>
+        </w:rPr>
+        <w:t xml:space="preserve"> dan </w:t>
+      </w:r>
+      <w:proofErr w:type="spellStart"/>
+      <w:r>
+        <w:rPr>
+          <w:i/>
+          <w:iCs/>
+          <w:lang w:eastAsia="id-ID"/>
+        </w:rPr>
+        <w:t>setter</w:t>
+      </w:r>
+      <w:proofErr w:type="spellEnd"/>
+      <w:r>
+        <w:rPr>
+          <w:lang w:eastAsia="id-ID"/>
+        </w:rPr>
+        <w:t>, sehingga perubahan data dapat dikontrol dan divalidasi.</w:t>
+      </w:r>
+    </w:p>
+    <w:p>
+      <w:pPr>
+        <w:rPr>
+          <w:lang w:eastAsia="id-ID"/>
+        </w:rPr>
+      </w:pPr>
+      <w:proofErr w:type="spellStart"/>
+      <w:r>
+        <w:rPr>
+          <w:b/>
+          <w:bCs/>
+          <w:lang w:eastAsia="id-ID"/>
+        </w:rPr>
+        <w:t>Abstraction</w:t>
+      </w:r>
+      <w:proofErr w:type="spellEnd"/>
+      <w:r>
+        <w:rPr>
+          <w:lang w:eastAsia="id-ID"/>
+        </w:rPr>
+        <w:t xml:space="preserve"> adalah proses penyederhanaan sistem dengan cara menyembunyikan detail implementasi dan hanya menampilkan fungsi utama kepada pengguna. Dalam </w:t>
+      </w:r>
+      <w:proofErr w:type="spellStart"/>
+      <w:r>
+        <w:rPr>
+          <w:lang w:eastAsia="id-ID"/>
+        </w:rPr>
+        <w:t>Python</w:t>
+      </w:r>
+      <w:proofErr w:type="spellEnd"/>
+      <w:r>
+        <w:rPr>
+          <w:lang w:eastAsia="id-ID"/>
+        </w:rPr>
+        <w:t xml:space="preserve">, </w:t>
+      </w:r>
+      <w:proofErr w:type="spellStart"/>
+      <w:r>
+        <w:rPr>
+          <w:lang w:eastAsia="id-ID"/>
+        </w:rPr>
+        <w:t>abstraction</w:t>
+      </w:r>
+      <w:proofErr w:type="spellEnd"/>
+      <w:r>
+        <w:rPr>
+          <w:lang w:eastAsia="id-ID"/>
+        </w:rPr>
+        <w:t xml:space="preserve"> dapat diterapkan melalui pembuatan </w:t>
+      </w:r>
+      <w:proofErr w:type="spellStart"/>
+      <w:r>
+        <w:rPr>
+          <w:lang w:eastAsia="id-ID"/>
+        </w:rPr>
+        <w:t>method</w:t>
+      </w:r>
+      <w:proofErr w:type="spellEnd"/>
+      <w:r>
+        <w:rPr>
+          <w:lang w:eastAsia="id-ID"/>
+        </w:rPr>
+        <w:t xml:space="preserve"> yang merepresentasikan aksi tertentu tanpa memperlihatkan proses internalnya. Selain itu, konsep </w:t>
+      </w:r>
+      <w:proofErr w:type="spellStart"/>
+      <w:r>
+        <w:rPr>
+          <w:lang w:eastAsia="id-ID"/>
+        </w:rPr>
+        <w:t>abstraction</w:t>
+      </w:r>
+      <w:proofErr w:type="spellEnd"/>
+      <w:r>
+        <w:rPr>
+          <w:lang w:eastAsia="id-ID"/>
+        </w:rPr>
+        <w:t xml:space="preserve"> juga dapat diperkuat dengan penggunaan </w:t>
+      </w:r>
+      <w:proofErr w:type="spellStart"/>
+      <w:r>
+        <w:rPr>
+          <w:i/>
+          <w:iCs/>
+          <w:lang w:eastAsia="id-ID"/>
+        </w:rPr>
+        <w:t>abstract</w:t>
+      </w:r>
+      <w:proofErr w:type="spellEnd"/>
+      <w:r>
+        <w:rPr>
+          <w:i/>
+          <w:iCs/>
+          <w:lang w:eastAsia="id-ID"/>
+        </w:rPr>
+        <w:t xml:space="preserve"> </w:t>
+      </w:r>
+      <w:proofErr w:type="spellStart"/>
+      <w:r>
+        <w:rPr>
+          <w:i/>
+          <w:iCs/>
+          <w:lang w:eastAsia="id-ID"/>
+        </w:rPr>
+        <w:t>class</w:t>
+      </w:r>
+      <w:proofErr w:type="spellEnd"/>
+      <w:r>
+        <w:rPr>
+          <w:lang w:eastAsia="id-ID"/>
+        </w:rPr>
+        <w:t xml:space="preserve"> melalui modul </w:t>
+      </w:r>
+      <w:r>
+        <w:rPr>
+          <w:rFonts w:ascii="Courier New" w:hAnsi="Courier New" w:cs="Courier New"/>
+          <w:sz w:val="20"/>
+          <w:szCs w:val="20"/>
+          <w:lang w:eastAsia="id-ID"/>
+        </w:rPr>
+        <w:t>abc</w:t>
+      </w:r>
+      <w:r>
+        <w:rPr>
+          <w:lang w:eastAsia="id-ID"/>
+        </w:rPr>
+        <w:t>.</w:t>
+      </w:r>
+    </w:p>
+    <w:p>
+      <w:pPr>
+        <w:rPr>
+          <w:lang w:eastAsia="id-ID"/>
+        </w:rPr>
+      </w:pPr>
+      <w:r>
+        <w:rPr>
+          <w:lang w:eastAsia="id-ID"/>
+        </w:rPr>
+        <w:t xml:space="preserve">Secara konseptual, </w:t>
+      </w:r>
+      <w:proofErr w:type="spellStart"/>
+      <w:r>
+        <w:rPr>
+          <w:lang w:eastAsia="id-ID"/>
+        </w:rPr>
+        <w:t>encapsulation</w:t>
+      </w:r>
+      <w:proofErr w:type="spellEnd"/>
+      <w:r>
+        <w:rPr>
+          <w:lang w:eastAsia="id-ID"/>
+        </w:rPr>
+        <w:t xml:space="preserve"> berfokus pada perlindungan data, sedangkan </w:t>
+      </w:r>
+      <w:proofErr w:type="spellStart"/>
+      <w:r>
+        <w:rPr>
+          <w:lang w:eastAsia="id-ID"/>
+        </w:rPr>
+        <w:t>abstraction</w:t>
+      </w:r>
+      <w:proofErr w:type="spellEnd"/>
+      <w:r>
+        <w:rPr>
+          <w:lang w:eastAsia="id-ID"/>
+        </w:rPr>
+        <w:t xml:space="preserve"> berfokus pada penyederhanaan interaksi dengan sistem. Keduanya saling melengkapi dalam membangun program yang efisien, aman, dan mudah dikembangkan.</w:t>
+      </w:r>
+    </w:p>
+    <w:p>
+      <w:pPr>
         <w:pStyle w:val="Judul2"/>
       </w:pPr>
       <w:r>
+        <w:lastRenderedPageBreak/>
         <w:t>Praktikum</w:t>
       </w:r>
     </w:p>
@@ -4211,15 +5131,607 @@
       <w:proofErr w:type="spellEnd"/>
     </w:p>
     <w:p>
+      <w:r>
+        <w:drawing>
+          <wp:inline distT="0" distB="0" distL="0" distR="0" wp14:anchorId="7218E273" wp14:editId="588107FC">
+            <wp:extent cx="3934691" cy="5250815"/>
+            <wp:effectExtent l="0" t="0" r="8890" b="6985"/>
+            <wp:docPr id="1420786004" name="Gambar 1"/>
+            <wp:cNvGraphicFramePr>
+              <a:graphicFrameLocks xmlns:a="http://schemas.openxmlformats.org/drawingml/2006/main" noChangeAspect="1"/>
+            </wp:cNvGraphicFramePr>
+            <a:graphic xmlns:a="http://schemas.openxmlformats.org/drawingml/2006/main">
+              <a:graphicData uri="http://schemas.openxmlformats.org/drawingml/2006/picture">
+                <pic:pic xmlns:pic="http://schemas.openxmlformats.org/drawingml/2006/picture">
+                  <pic:nvPicPr>
+                    <pic:cNvPr id="1420786004" name=""/>
+                    <pic:cNvPicPr/>
+                  </pic:nvPicPr>
+                  <pic:blipFill rotWithShape="1">
+                    <a:blip r:embed="rId17"/>
+                    <a:srcRect l="12919" t="9218" r="9005" b="11381"/>
+                    <a:stretch>
+                      <a:fillRect/>
+                    </a:stretch>
+                  </pic:blipFill>
+                  <pic:spPr bwMode="auto">
+                    <a:xfrm>
+                      <a:off x="0" y="0"/>
+                      <a:ext cx="3935045" cy="5251288"/>
+                    </a:xfrm>
+                    <a:prstGeom prst="rect">
+                      <a:avLst/>
+                    </a:prstGeom>
+                    <a:ln>
+                      <a:noFill/>
+                    </a:ln>
+                    <a:extLst>
+                      <a:ext uri="{53640926-AAD7-44D8-BBD7-CCE9431645EC}">
+                        <a14:shadowObscured xmlns:a14="http://schemas.microsoft.com/office/drawing/2010/main"/>
+                      </a:ext>
+                    </a:extLst>
+                  </pic:spPr>
+                </pic:pic>
+              </a:graphicData>
+            </a:graphic>
+          </wp:inline>
+        </w:drawing>
+      </w:r>
+    </w:p>
+    <w:p>
+      <w:proofErr w:type="spellStart"/>
+      <w:r>
+        <w:t>Class</w:t>
+      </w:r>
+      <w:proofErr w:type="spellEnd"/>
+      <w:r>
+        <w:t xml:space="preserve"> </w:t>
+      </w:r>
+      <w:proofErr w:type="spellStart"/>
+      <w:r>
+        <w:t>RekeningBank</w:t>
+      </w:r>
+      <w:proofErr w:type="spellEnd"/>
+      <w:r>
+        <w:t xml:space="preserve"> merupakan </w:t>
+      </w:r>
+      <w:proofErr w:type="spellStart"/>
+      <w:r>
+        <w:t>blueprint</w:t>
+      </w:r>
+      <w:proofErr w:type="spellEnd"/>
+      <w:r>
+        <w:t xml:space="preserve"> yang digunakan untuk merepresentasikan sistem rekening bank dengan menyimpan data nasabah serta menyediakan fungsi transaksi. Objek nasabah1 adalah hasil </w:t>
+      </w:r>
+      <w:proofErr w:type="spellStart"/>
+      <w:r>
+        <w:t>instansiasi</w:t>
+      </w:r>
+      <w:proofErr w:type="spellEnd"/>
+      <w:r>
+        <w:t xml:space="preserve"> dari </w:t>
+      </w:r>
+      <w:proofErr w:type="spellStart"/>
+      <w:r>
+        <w:t>class</w:t>
+      </w:r>
+      <w:proofErr w:type="spellEnd"/>
+      <w:r>
+        <w:t xml:space="preserve"> tersebut yang memuat data nama, nomor rekening, dan saldo awal, kemudian digunakan untuk menjalankan berbagai operasi. Atribut dalam </w:t>
+      </w:r>
+      <w:proofErr w:type="spellStart"/>
+      <w:r>
+        <w:t>class</w:t>
+      </w:r>
+      <w:proofErr w:type="spellEnd"/>
+      <w:r>
+        <w:t xml:space="preserve"> terdiri dari nama sebagai </w:t>
+      </w:r>
+      <w:proofErr w:type="spellStart"/>
+      <w:r>
+        <w:t>public</w:t>
+      </w:r>
+      <w:proofErr w:type="spellEnd"/>
+      <w:r>
+        <w:t>, _</w:t>
+      </w:r>
+      <w:proofErr w:type="spellStart"/>
+      <w:r>
+        <w:t>nomor_rekening</w:t>
+      </w:r>
+      <w:proofErr w:type="spellEnd"/>
+      <w:r>
+        <w:t xml:space="preserve"> sebagai </w:t>
+      </w:r>
+      <w:proofErr w:type="spellStart"/>
+      <w:r>
+        <w:t>protected</w:t>
+      </w:r>
+      <w:proofErr w:type="spellEnd"/>
+      <w:r>
+        <w:t xml:space="preserve">, dan __saldo sebagai </w:t>
+      </w:r>
+      <w:proofErr w:type="spellStart"/>
+      <w:r>
+        <w:t>private</w:t>
+      </w:r>
+      <w:proofErr w:type="spellEnd"/>
+      <w:r>
+        <w:t xml:space="preserve">, yang menunjukkan penerapan </w:t>
+      </w:r>
+      <w:proofErr w:type="spellStart"/>
+      <w:r>
+        <w:t>encapsulation</w:t>
+      </w:r>
+      <w:proofErr w:type="spellEnd"/>
+      <w:r>
+        <w:t xml:space="preserve"> dengan pembatasan akses data. Interaksi terhadap saldo tidak dilakukan secara langsung, melainkan melalui </w:t>
+      </w:r>
+      <w:proofErr w:type="spellStart"/>
+      <w:r>
+        <w:t>method</w:t>
+      </w:r>
+      <w:proofErr w:type="spellEnd"/>
+      <w:r>
+        <w:t xml:space="preserve"> seperti </w:t>
+      </w:r>
+      <w:proofErr w:type="spellStart"/>
+      <w:r>
+        <w:t>get_saldo</w:t>
+      </w:r>
+      <w:proofErr w:type="spellEnd"/>
+      <w:r>
+        <w:t xml:space="preserve">(), </w:t>
+      </w:r>
+      <w:proofErr w:type="spellStart"/>
+      <w:r>
+        <w:t>set_saldo</w:t>
+      </w:r>
+      <w:proofErr w:type="spellEnd"/>
+      <w:r>
+        <w:t xml:space="preserve">(), </w:t>
+      </w:r>
+      <w:proofErr w:type="spellStart"/>
+      <w:r>
+        <w:t>setor_uang</w:t>
+      </w:r>
+      <w:proofErr w:type="spellEnd"/>
+      <w:r>
+        <w:t xml:space="preserve">(), dan </w:t>
+      </w:r>
+      <w:proofErr w:type="spellStart"/>
+      <w:r>
+        <w:t>tarik_uang</w:t>
+      </w:r>
+      <w:proofErr w:type="spellEnd"/>
+      <w:r>
+        <w:t xml:space="preserve">(), sehingga </w:t>
+      </w:r>
+      <w:r>
+        <w:lastRenderedPageBreak/>
+        <w:t xml:space="preserve">data lebih terkontrol. Alur program dimulai dari pembuatan objek, penampilan data awal, kemudian dilakukan transaksi setor dan tarik uang yang mengubah nilai saldo. Secara konsep, kode ini menerapkan </w:t>
+      </w:r>
+      <w:proofErr w:type="spellStart"/>
+      <w:r>
+        <w:t>encapsulation</w:t>
+      </w:r>
+      <w:proofErr w:type="spellEnd"/>
+      <w:r>
+        <w:t xml:space="preserve"> melalui penggunaan akses atribut serta </w:t>
+      </w:r>
+      <w:proofErr w:type="spellStart"/>
+      <w:r>
+        <w:t>abstraction</w:t>
+      </w:r>
+      <w:proofErr w:type="spellEnd"/>
+      <w:r>
+        <w:t xml:space="preserve"> karena pengguna cukup berinteraksi melalui </w:t>
+      </w:r>
+      <w:proofErr w:type="spellStart"/>
+      <w:r>
+        <w:t>method</w:t>
+      </w:r>
+      <w:proofErr w:type="spellEnd"/>
+      <w:r>
+        <w:t xml:space="preserve"> tanpa mengetahui proses internal pengolahan data.</w:t>
+      </w:r>
+    </w:p>
+    <w:p>
       <w:pPr>
         <w:pStyle w:val="Judul3"/>
       </w:pPr>
       <w:proofErr w:type="spellStart"/>
       <w:r>
-        <w:t>Abstracktion</w:t>
-      </w:r>
-      <w:proofErr w:type="spellEnd"/>
-    </w:p>
+        <w:t>Abstraction</w:t>
+      </w:r>
+      <w:proofErr w:type="spellEnd"/>
+    </w:p>
+    <w:p>
+      <w:r>
+        <w:drawing>
+          <wp:inline distT="0" distB="0" distL="0" distR="0" wp14:anchorId="5E3068C8" wp14:editId="652791F7">
+            <wp:extent cx="4038600" cy="4191000"/>
+            <wp:effectExtent l="0" t="0" r="0" b="0"/>
+            <wp:docPr id="30994588" name="Gambar 1"/>
+            <wp:cNvGraphicFramePr>
+              <a:graphicFrameLocks xmlns:a="http://schemas.openxmlformats.org/drawingml/2006/main" noChangeAspect="1"/>
+            </wp:cNvGraphicFramePr>
+            <a:graphic xmlns:a="http://schemas.openxmlformats.org/drawingml/2006/main">
+              <a:graphicData uri="http://schemas.openxmlformats.org/drawingml/2006/picture">
+                <pic:pic xmlns:pic="http://schemas.openxmlformats.org/drawingml/2006/picture">
+                  <pic:nvPicPr>
+                    <pic:cNvPr id="30994588" name=""/>
+                    <pic:cNvPicPr/>
+                  </pic:nvPicPr>
+                  <pic:blipFill rotWithShape="1">
+                    <a:blip r:embed="rId18"/>
+                    <a:srcRect l="11958" t="11829" r="7901" b="6850"/>
+                    <a:stretch>
+                      <a:fillRect/>
+                    </a:stretch>
+                  </pic:blipFill>
+                  <pic:spPr bwMode="auto">
+                    <a:xfrm>
+                      <a:off x="0" y="0"/>
+                      <a:ext cx="4039126" cy="4191546"/>
+                    </a:xfrm>
+                    <a:prstGeom prst="rect">
+                      <a:avLst/>
+                    </a:prstGeom>
+                    <a:ln>
+                      <a:noFill/>
+                    </a:ln>
+                    <a:extLst>
+                      <a:ext uri="{53640926-AAD7-44D8-BBD7-CCE9431645EC}">
+                        <a14:shadowObscured xmlns:a14="http://schemas.microsoft.com/office/drawing/2010/main"/>
+                      </a:ext>
+                    </a:extLst>
+                  </pic:spPr>
+                </pic:pic>
+              </a:graphicData>
+            </a:graphic>
+          </wp:inline>
+        </w:drawing>
+      </w:r>
+    </w:p>
+    <w:p>
+      <w:r>
+        <w:drawing>
+          <wp:inline distT="0" distB="0" distL="0" distR="0" wp14:anchorId="3C102FF0" wp14:editId="3D6801DD">
+            <wp:extent cx="3532495" cy="1849581"/>
+            <wp:effectExtent l="0" t="0" r="0" b="0"/>
+            <wp:docPr id="1258357059" name="Gambar 1"/>
+            <wp:cNvGraphicFramePr>
+              <a:graphicFrameLocks xmlns:a="http://schemas.openxmlformats.org/drawingml/2006/main" noChangeAspect="1"/>
+            </wp:cNvGraphicFramePr>
+            <a:graphic xmlns:a="http://schemas.openxmlformats.org/drawingml/2006/main">
+              <a:graphicData uri="http://schemas.openxmlformats.org/drawingml/2006/picture">
+                <pic:pic xmlns:pic="http://schemas.openxmlformats.org/drawingml/2006/picture">
+                  <pic:nvPicPr>
+                    <pic:cNvPr id="1258357059" name=""/>
+                    <pic:cNvPicPr/>
+                  </pic:nvPicPr>
+                  <pic:blipFill rotWithShape="1">
+                    <a:blip r:embed="rId19"/>
+                    <a:srcRect l="18281" t="28761" r="11611" b="17897"/>
+                    <a:stretch>
+                      <a:fillRect/>
+                    </a:stretch>
+                  </pic:blipFill>
+                  <pic:spPr bwMode="auto">
+                    <a:xfrm>
+                      <a:off x="0" y="0"/>
+                      <a:ext cx="3533486" cy="1850100"/>
+                    </a:xfrm>
+                    <a:prstGeom prst="rect">
+                      <a:avLst/>
+                    </a:prstGeom>
+                    <a:ln>
+                      <a:noFill/>
+                    </a:ln>
+                    <a:extLst>
+                      <a:ext uri="{53640926-AAD7-44D8-BBD7-CCE9431645EC}">
+                        <a14:shadowObscured xmlns:a14="http://schemas.microsoft.com/office/drawing/2010/main"/>
+                      </a:ext>
+                    </a:extLst>
+                  </pic:spPr>
+                </pic:pic>
+              </a:graphicData>
+            </a:graphic>
+          </wp:inline>
+        </w:drawing>
+      </w:r>
+    </w:p>
+    <w:p>
+      <w:proofErr w:type="spellStart"/>
+      <w:r>
+        <w:lastRenderedPageBreak/>
+        <w:t>Class</w:t>
+      </w:r>
+      <w:proofErr w:type="spellEnd"/>
+      <w:r>
+        <w:t xml:space="preserve"> </w:t>
+      </w:r>
+      <w:proofErr w:type="spellStart"/>
+      <w:r>
+        <w:t>AkunBank</w:t>
+      </w:r>
+      <w:proofErr w:type="spellEnd"/>
+      <w:r>
+        <w:t xml:space="preserve"> merupakan </w:t>
+      </w:r>
+      <w:proofErr w:type="spellStart"/>
+      <w:r>
+        <w:rPr>
+          <w:i/>
+          <w:iCs/>
+        </w:rPr>
+        <w:t>abstract</w:t>
+      </w:r>
+      <w:proofErr w:type="spellEnd"/>
+      <w:r>
+        <w:rPr>
+          <w:i/>
+          <w:iCs/>
+        </w:rPr>
+        <w:t xml:space="preserve"> </w:t>
+      </w:r>
+      <w:proofErr w:type="spellStart"/>
+      <w:r>
+        <w:rPr>
+          <w:i/>
+          <w:iCs/>
+        </w:rPr>
+        <w:t>class</w:t>
+      </w:r>
+      <w:proofErr w:type="spellEnd"/>
+      <w:r>
+        <w:t xml:space="preserve"> yang didefinisikan menggunakan modul abc dengan mewarisi ABC. </w:t>
+      </w:r>
+      <w:proofErr w:type="spellStart"/>
+      <w:r>
+        <w:t>Class</w:t>
+      </w:r>
+      <w:proofErr w:type="spellEnd"/>
+      <w:r>
+        <w:t xml:space="preserve"> ini berfungsi sebagai kerangka dasar untuk berbagai jenis akun bank dengan atribut nama dan saldo. Di dalamnya terdapat dua </w:t>
+      </w:r>
+      <w:proofErr w:type="spellStart"/>
+      <w:r>
+        <w:t>method</w:t>
+      </w:r>
+      <w:proofErr w:type="spellEnd"/>
+      <w:r>
+        <w:t xml:space="preserve"> abstrak, yaitu </w:t>
+      </w:r>
+      <w:proofErr w:type="spellStart"/>
+      <w:r>
+        <w:t>hitung_bunga</w:t>
+      </w:r>
+      <w:proofErr w:type="spellEnd"/>
+      <w:r>
+        <w:t xml:space="preserve">() dan </w:t>
+      </w:r>
+      <w:proofErr w:type="spellStart"/>
+      <w:r>
+        <w:t>info_akun</w:t>
+      </w:r>
+      <w:proofErr w:type="spellEnd"/>
+      <w:r>
+        <w:t xml:space="preserve">(), yang dideklarasikan menggunakan dekorator @abstractmethod. </w:t>
+      </w:r>
+      <w:proofErr w:type="spellStart"/>
+      <w:r>
+        <w:t>Method</w:t>
+      </w:r>
+      <w:proofErr w:type="spellEnd"/>
+      <w:r>
+        <w:t xml:space="preserve"> abstrak ini tidak memiliki implementasi, sehingga wajib </w:t>
+      </w:r>
+      <w:proofErr w:type="spellStart"/>
+      <w:r>
+        <w:t>di-</w:t>
+      </w:r>
+      <w:r>
+        <w:rPr>
+          <w:i/>
+          <w:iCs/>
+        </w:rPr>
+        <w:t>override</w:t>
+      </w:r>
+      <w:proofErr w:type="spellEnd"/>
+      <w:r>
+        <w:t xml:space="preserve"> oleh </w:t>
+      </w:r>
+      <w:proofErr w:type="spellStart"/>
+      <w:r>
+        <w:t>subclass</w:t>
+      </w:r>
+      <w:proofErr w:type="spellEnd"/>
+      <w:r>
+        <w:t xml:space="preserve">. Hal ini mencerminkan konsep </w:t>
+      </w:r>
+      <w:proofErr w:type="spellStart"/>
+      <w:r>
+        <w:t>abstraction</w:t>
+      </w:r>
+      <w:proofErr w:type="spellEnd"/>
+      <w:r>
+        <w:t>, di mana hanya struktur umum yang ditentukan tanpa detail implementasi.</w:t>
+      </w:r>
+    </w:p>
+    <w:p>
+      <w:proofErr w:type="spellStart"/>
+      <w:r>
+        <w:t>Class</w:t>
+      </w:r>
+      <w:proofErr w:type="spellEnd"/>
+      <w:r>
+        <w:t xml:space="preserve"> Tabungan dan Deposito merupakan turunan (</w:t>
+      </w:r>
+      <w:proofErr w:type="spellStart"/>
+      <w:r>
+        <w:rPr>
+          <w:i/>
+          <w:iCs/>
+        </w:rPr>
+        <w:t>subclass</w:t>
+      </w:r>
+      <w:proofErr w:type="spellEnd"/>
+      <w:r>
+        <w:t xml:space="preserve">) dari </w:t>
+      </w:r>
+      <w:proofErr w:type="spellStart"/>
+      <w:r>
+        <w:t>AkunBank</w:t>
+      </w:r>
+      <w:proofErr w:type="spellEnd"/>
+      <w:r>
+        <w:t xml:space="preserve"> yang mengimplementasikan </w:t>
+      </w:r>
+      <w:proofErr w:type="spellStart"/>
+      <w:r>
+        <w:t>method</w:t>
+      </w:r>
+      <w:proofErr w:type="spellEnd"/>
+      <w:r>
+        <w:t xml:space="preserve"> abstrak sesuai kebutuhannya. Pada </w:t>
+      </w:r>
+      <w:proofErr w:type="spellStart"/>
+      <w:r>
+        <w:t>class</w:t>
+      </w:r>
+      <w:proofErr w:type="spellEnd"/>
+      <w:r>
+        <w:t xml:space="preserve"> Tabungan, </w:t>
+      </w:r>
+      <w:proofErr w:type="spellStart"/>
+      <w:r>
+        <w:t>method</w:t>
+      </w:r>
+      <w:proofErr w:type="spellEnd"/>
+      <w:r>
+        <w:t xml:space="preserve"> </w:t>
+      </w:r>
+      <w:proofErr w:type="spellStart"/>
+      <w:r>
+        <w:t>hitung_bunga</w:t>
+      </w:r>
+      <w:proofErr w:type="spellEnd"/>
+      <w:r>
+        <w:t xml:space="preserve">() mengembalikan bunga sebesar 2% dari saldo, sedangkan pada </w:t>
+      </w:r>
+      <w:proofErr w:type="spellStart"/>
+      <w:r>
+        <w:t>class</w:t>
+      </w:r>
+      <w:proofErr w:type="spellEnd"/>
+      <w:r>
+        <w:t xml:space="preserve"> Deposito sebesar 5%. </w:t>
+      </w:r>
+      <w:proofErr w:type="spellStart"/>
+      <w:r>
+        <w:t>Method</w:t>
+      </w:r>
+      <w:proofErr w:type="spellEnd"/>
+      <w:r>
+        <w:t xml:space="preserve"> </w:t>
+      </w:r>
+      <w:proofErr w:type="spellStart"/>
+      <w:r>
+        <w:t>info_akun</w:t>
+      </w:r>
+      <w:proofErr w:type="spellEnd"/>
+      <w:r>
+        <w:t xml:space="preserve">() pada masing-masing </w:t>
+      </w:r>
+      <w:proofErr w:type="spellStart"/>
+      <w:r>
+        <w:t>class</w:t>
+      </w:r>
+      <w:proofErr w:type="spellEnd"/>
+      <w:r>
+        <w:t xml:space="preserve"> digunakan untuk menampilkan informasi akun dengan format yang berbeda sesuai jenisnya. Ini menunjukkan bahwa meskipun berasal dari </w:t>
+      </w:r>
+      <w:proofErr w:type="spellStart"/>
+      <w:r>
+        <w:t>class</w:t>
+      </w:r>
+      <w:proofErr w:type="spellEnd"/>
+      <w:r>
+        <w:t xml:space="preserve"> induk yang sama, setiap </w:t>
+      </w:r>
+      <w:proofErr w:type="spellStart"/>
+      <w:r>
+        <w:t>subclass</w:t>
+      </w:r>
+      <w:proofErr w:type="spellEnd"/>
+      <w:r>
+        <w:t xml:space="preserve"> dapat memiliki perilaku yang berbeda.</w:t>
+      </w:r>
+    </w:p>
+    <w:p>
+      <w:r>
+        <w:t xml:space="preserve">Objek akun1 dan akun2 merupakan </w:t>
+      </w:r>
+      <w:proofErr w:type="spellStart"/>
+      <w:r>
+        <w:t>instansiasi</w:t>
+      </w:r>
+      <w:proofErr w:type="spellEnd"/>
+      <w:r>
+        <w:t xml:space="preserve"> dari </w:t>
+      </w:r>
+      <w:proofErr w:type="spellStart"/>
+      <w:r>
+        <w:t>class</w:t>
+      </w:r>
+      <w:proofErr w:type="spellEnd"/>
+      <w:r>
+        <w:t xml:space="preserve"> Tabungan dan Deposito. Keduanya memiliki data yang sama, tetapi menghasilkan </w:t>
+      </w:r>
+      <w:proofErr w:type="spellStart"/>
+      <w:r>
+        <w:t>output</w:t>
+      </w:r>
+      <w:proofErr w:type="spellEnd"/>
+      <w:r>
+        <w:t xml:space="preserve"> berbeda karena implementasi </w:t>
+      </w:r>
+      <w:proofErr w:type="spellStart"/>
+      <w:r>
+        <w:t>method</w:t>
+      </w:r>
+      <w:proofErr w:type="spellEnd"/>
+      <w:r>
+        <w:t xml:space="preserve"> yang berbeda. Pemanggilan </w:t>
+      </w:r>
+      <w:proofErr w:type="spellStart"/>
+      <w:r>
+        <w:t>info_akun</w:t>
+      </w:r>
+      <w:proofErr w:type="spellEnd"/>
+      <w:r>
+        <w:t xml:space="preserve">() menampilkan jenis akun beserta saldo, sedangkan </w:t>
+      </w:r>
+      <w:proofErr w:type="spellStart"/>
+      <w:r>
+        <w:t>hitung_bunga</w:t>
+      </w:r>
+      <w:proofErr w:type="spellEnd"/>
+      <w:r>
+        <w:t xml:space="preserve">() menghitung bunga sesuai aturan masing-masing </w:t>
+      </w:r>
+      <w:proofErr w:type="spellStart"/>
+      <w:r>
+        <w:t>class</w:t>
+      </w:r>
+      <w:proofErr w:type="spellEnd"/>
+      <w:r>
+        <w:t>.</w:t>
+      </w:r>
+    </w:p>
+    <w:p/>
     <w:p>
       <w:r>
         <w:br w:type="page"/>
@@ -4275,6 +5787,232 @@
     </w:p>
     <w:p>
       <w:pPr>
+        <w:rPr>
+          <w:lang w:eastAsia="id-ID"/>
+        </w:rPr>
+      </w:pPr>
+      <w:r>
+        <w:rPr>
+          <w:lang w:eastAsia="id-ID"/>
+        </w:rPr>
+        <w:t xml:space="preserve">Dalam pengembangan perangkat lunak berbasis </w:t>
+      </w:r>
+      <w:proofErr w:type="spellStart"/>
+      <w:r>
+        <w:rPr>
+          <w:lang w:eastAsia="id-ID"/>
+        </w:rPr>
+        <w:t>Object-Oriented</w:t>
+      </w:r>
+      <w:proofErr w:type="spellEnd"/>
+      <w:r>
+        <w:rPr>
+          <w:lang w:eastAsia="id-ID"/>
+        </w:rPr>
+        <w:t xml:space="preserve"> </w:t>
+      </w:r>
+      <w:proofErr w:type="spellStart"/>
+      <w:r>
+        <w:rPr>
+          <w:lang w:eastAsia="id-ID"/>
+        </w:rPr>
+        <w:t>Programming</w:t>
+      </w:r>
+      <w:proofErr w:type="spellEnd"/>
+      <w:r>
+        <w:rPr>
+          <w:lang w:eastAsia="id-ID"/>
+        </w:rPr>
+        <w:t xml:space="preserve"> (OOP), efisiensi dan fleksibilitas kode menjadi aspek penting. Untuk mencapai hal tersebut, digunakan konsep </w:t>
+      </w:r>
+      <w:proofErr w:type="spellStart"/>
+      <w:r>
+        <w:rPr>
+          <w:i/>
+          <w:iCs/>
+          <w:lang w:eastAsia="id-ID"/>
+        </w:rPr>
+        <w:t>inheritance</w:t>
+      </w:r>
+      <w:proofErr w:type="spellEnd"/>
+      <w:r>
+        <w:rPr>
+          <w:lang w:eastAsia="id-ID"/>
+        </w:rPr>
+        <w:t xml:space="preserve"> (pewarisan) dan </w:t>
+      </w:r>
+      <w:proofErr w:type="spellStart"/>
+      <w:r>
+        <w:rPr>
+          <w:i/>
+          <w:iCs/>
+          <w:lang w:eastAsia="id-ID"/>
+        </w:rPr>
+        <w:t>polymorphism</w:t>
+      </w:r>
+      <w:proofErr w:type="spellEnd"/>
+      <w:r>
+        <w:rPr>
+          <w:lang w:eastAsia="id-ID"/>
+        </w:rPr>
+        <w:t xml:space="preserve"> (banyak bentuk). </w:t>
+      </w:r>
+      <w:proofErr w:type="spellStart"/>
+      <w:r>
+        <w:rPr>
+          <w:lang w:eastAsia="id-ID"/>
+        </w:rPr>
+        <w:t>Inheritance</w:t>
+      </w:r>
+      <w:proofErr w:type="spellEnd"/>
+      <w:r>
+        <w:rPr>
+          <w:lang w:eastAsia="id-ID"/>
+        </w:rPr>
+        <w:t xml:space="preserve"> memungkinkan suatu </w:t>
+      </w:r>
+      <w:proofErr w:type="spellStart"/>
+      <w:r>
+        <w:rPr>
+          <w:lang w:eastAsia="id-ID"/>
+        </w:rPr>
+        <w:t>class</w:t>
+      </w:r>
+      <w:proofErr w:type="spellEnd"/>
+      <w:r>
+        <w:rPr>
+          <w:lang w:eastAsia="id-ID"/>
+        </w:rPr>
+        <w:t xml:space="preserve"> mewarisi atribut dan </w:t>
+      </w:r>
+      <w:proofErr w:type="spellStart"/>
+      <w:r>
+        <w:rPr>
+          <w:lang w:eastAsia="id-ID"/>
+        </w:rPr>
+        <w:t>method</w:t>
+      </w:r>
+      <w:proofErr w:type="spellEnd"/>
+      <w:r>
+        <w:rPr>
+          <w:lang w:eastAsia="id-ID"/>
+        </w:rPr>
+        <w:t xml:space="preserve"> dari </w:t>
+      </w:r>
+      <w:proofErr w:type="spellStart"/>
+      <w:r>
+        <w:rPr>
+          <w:lang w:eastAsia="id-ID"/>
+        </w:rPr>
+        <w:t>class</w:t>
+      </w:r>
+      <w:proofErr w:type="spellEnd"/>
+      <w:r>
+        <w:rPr>
+          <w:lang w:eastAsia="id-ID"/>
+        </w:rPr>
+        <w:t xml:space="preserve"> lain, sehingga mengurangi duplikasi kode dan meningkatkan </w:t>
+      </w:r>
+      <w:proofErr w:type="spellStart"/>
+      <w:r>
+        <w:rPr>
+          <w:lang w:eastAsia="id-ID"/>
+        </w:rPr>
+        <w:t>reusabilitas</w:t>
+      </w:r>
+      <w:proofErr w:type="spellEnd"/>
+      <w:r>
+        <w:rPr>
+          <w:lang w:eastAsia="id-ID"/>
+        </w:rPr>
+        <w:t xml:space="preserve">. Sementara itu, </w:t>
+      </w:r>
+      <w:proofErr w:type="spellStart"/>
+      <w:r>
+        <w:rPr>
+          <w:lang w:eastAsia="id-ID"/>
+        </w:rPr>
+        <w:t>polymorphism</w:t>
+      </w:r>
+      <w:proofErr w:type="spellEnd"/>
+      <w:r>
+        <w:rPr>
+          <w:lang w:eastAsia="id-ID"/>
+        </w:rPr>
+        <w:t xml:space="preserve"> memungkinkan satu </w:t>
+      </w:r>
+      <w:proofErr w:type="spellStart"/>
+      <w:r>
+        <w:rPr>
+          <w:lang w:eastAsia="id-ID"/>
+        </w:rPr>
+        <w:t>method</w:t>
+      </w:r>
+      <w:proofErr w:type="spellEnd"/>
+      <w:r>
+        <w:rPr>
+          <w:lang w:eastAsia="id-ID"/>
+        </w:rPr>
+        <w:t xml:space="preserve"> memiliki perilaku yang berbeda tergantung pada objek yang memanggilnya.</w:t>
+      </w:r>
+    </w:p>
+    <w:p>
+      <w:pPr>
+        <w:rPr>
+          <w:lang w:eastAsia="id-ID"/>
+        </w:rPr>
+      </w:pPr>
+      <w:r>
+        <w:rPr>
+          <w:lang w:eastAsia="id-ID"/>
+        </w:rPr>
+        <w:t xml:space="preserve">Penerapan kedua konsep ini sangat penting dalam membangun sistem yang dinamis dan mudah dikembangkan. Dengan </w:t>
+      </w:r>
+      <w:proofErr w:type="spellStart"/>
+      <w:r>
+        <w:rPr>
+          <w:lang w:eastAsia="id-ID"/>
+        </w:rPr>
+        <w:t>inheritance</w:t>
+      </w:r>
+      <w:proofErr w:type="spellEnd"/>
+      <w:r>
+        <w:rPr>
+          <w:lang w:eastAsia="id-ID"/>
+        </w:rPr>
+        <w:t xml:space="preserve">, struktur program menjadi lebih terorganisir, sedangkan </w:t>
+      </w:r>
+      <w:proofErr w:type="spellStart"/>
+      <w:r>
+        <w:rPr>
+          <w:lang w:eastAsia="id-ID"/>
+        </w:rPr>
+        <w:t>polymorphism</w:t>
+      </w:r>
+      <w:proofErr w:type="spellEnd"/>
+      <w:r>
+        <w:rPr>
+          <w:lang w:eastAsia="id-ID"/>
+        </w:rPr>
+        <w:t xml:space="preserve"> memungkinkan fleksibilitas dalam penggunaan </w:t>
+      </w:r>
+      <w:proofErr w:type="spellStart"/>
+      <w:r>
+        <w:rPr>
+          <w:lang w:eastAsia="id-ID"/>
+        </w:rPr>
+        <w:t>method</w:t>
+      </w:r>
+      <w:proofErr w:type="spellEnd"/>
+      <w:r>
+        <w:rPr>
+          <w:lang w:eastAsia="id-ID"/>
+        </w:rPr>
+        <w:t xml:space="preserve"> yang sama untuk berbagai objek dengan implementasi berbeda.</w:t>
+      </w:r>
+    </w:p>
+    <w:p>
+      <w:pPr>
         <w:pStyle w:val="Judul2"/>
       </w:pPr>
       <w:r>
@@ -4283,6 +6021,274 @@
     </w:p>
     <w:p>
       <w:pPr>
+        <w:pStyle w:val="DaftarParagraf"/>
+        <w:numPr>
+          <w:ilvl w:val="0"/>
+          <w:numId w:val="13"/>
+        </w:numPr>
+        <w:ind w:left="709"/>
+        <w:rPr>
+          <w:lang w:eastAsia="id-ID"/>
+        </w:rPr>
+      </w:pPr>
+      <w:r>
+        <w:rPr>
+          <w:lang w:eastAsia="id-ID"/>
+        </w:rPr>
+        <w:t xml:space="preserve">Memahami konsep </w:t>
+      </w:r>
+      <w:proofErr w:type="spellStart"/>
+      <w:r>
+        <w:rPr>
+          <w:lang w:eastAsia="id-ID"/>
+        </w:rPr>
+        <w:t>inheritance</w:t>
+      </w:r>
+      <w:proofErr w:type="spellEnd"/>
+      <w:r>
+        <w:rPr>
+          <w:lang w:eastAsia="id-ID"/>
+        </w:rPr>
+        <w:t xml:space="preserve"> dalam OOP. </w:t>
+      </w:r>
+    </w:p>
+    <w:p>
+      <w:pPr>
+        <w:pStyle w:val="DaftarParagraf"/>
+        <w:numPr>
+          <w:ilvl w:val="0"/>
+          <w:numId w:val="13"/>
+        </w:numPr>
+        <w:ind w:left="709"/>
+        <w:rPr>
+          <w:lang w:eastAsia="id-ID"/>
+        </w:rPr>
+      </w:pPr>
+      <w:r>
+        <w:rPr>
+          <w:lang w:eastAsia="id-ID"/>
+        </w:rPr>
+        <w:t xml:space="preserve">Memahami konsep </w:t>
+      </w:r>
+      <w:proofErr w:type="spellStart"/>
+      <w:r>
+        <w:rPr>
+          <w:lang w:eastAsia="id-ID"/>
+        </w:rPr>
+        <w:t>polymorphism</w:t>
+      </w:r>
+      <w:proofErr w:type="spellEnd"/>
+      <w:r>
+        <w:rPr>
+          <w:lang w:eastAsia="id-ID"/>
+        </w:rPr>
+        <w:t xml:space="preserve"> dalam OOP. </w:t>
+      </w:r>
+    </w:p>
+    <w:p>
+      <w:pPr>
+        <w:pStyle w:val="DaftarParagraf"/>
+        <w:numPr>
+          <w:ilvl w:val="0"/>
+          <w:numId w:val="13"/>
+        </w:numPr>
+        <w:ind w:left="709"/>
+        <w:rPr>
+          <w:lang w:eastAsia="id-ID"/>
+        </w:rPr>
+      </w:pPr>
+      <w:r>
+        <w:rPr>
+          <w:lang w:eastAsia="id-ID"/>
+        </w:rPr>
+        <w:t xml:space="preserve">Mengetahui cara membuat </w:t>
+      </w:r>
+      <w:proofErr w:type="spellStart"/>
+      <w:r>
+        <w:rPr>
+          <w:lang w:eastAsia="id-ID"/>
+        </w:rPr>
+        <w:t>class</w:t>
+      </w:r>
+      <w:proofErr w:type="spellEnd"/>
+      <w:r>
+        <w:rPr>
+          <w:lang w:eastAsia="id-ID"/>
+        </w:rPr>
+        <w:t xml:space="preserve"> turunan dari </w:t>
+      </w:r>
+      <w:proofErr w:type="spellStart"/>
+      <w:r>
+        <w:rPr>
+          <w:lang w:eastAsia="id-ID"/>
+        </w:rPr>
+        <w:t>class</w:t>
+      </w:r>
+      <w:proofErr w:type="spellEnd"/>
+      <w:r>
+        <w:rPr>
+          <w:lang w:eastAsia="id-ID"/>
+        </w:rPr>
+        <w:t xml:space="preserve"> induk. </w:t>
+      </w:r>
+    </w:p>
+    <w:p>
+      <w:pPr>
+        <w:pStyle w:val="DaftarParagraf"/>
+        <w:numPr>
+          <w:ilvl w:val="0"/>
+          <w:numId w:val="13"/>
+        </w:numPr>
+        <w:ind w:left="709"/>
+        <w:rPr>
+          <w:lang w:eastAsia="id-ID"/>
+        </w:rPr>
+      </w:pPr>
+      <w:r>
+        <w:rPr>
+          <w:lang w:eastAsia="id-ID"/>
+        </w:rPr>
+        <w:t xml:space="preserve">Mampu mengimplementasikan </w:t>
+      </w:r>
+      <w:proofErr w:type="spellStart"/>
+      <w:r>
+        <w:rPr>
+          <w:lang w:eastAsia="id-ID"/>
+        </w:rPr>
+        <w:t>method</w:t>
+      </w:r>
+      <w:proofErr w:type="spellEnd"/>
+      <w:r>
+        <w:rPr>
+          <w:lang w:eastAsia="id-ID"/>
+        </w:rPr>
+        <w:t xml:space="preserve"> </w:t>
+      </w:r>
+      <w:proofErr w:type="spellStart"/>
+      <w:r>
+        <w:rPr>
+          <w:lang w:eastAsia="id-ID"/>
+        </w:rPr>
+        <w:t>overriding</w:t>
+      </w:r>
+      <w:proofErr w:type="spellEnd"/>
+      <w:r>
+        <w:rPr>
+          <w:lang w:eastAsia="id-ID"/>
+        </w:rPr>
+        <w:t xml:space="preserve"> pada </w:t>
+      </w:r>
+      <w:proofErr w:type="spellStart"/>
+      <w:r>
+        <w:rPr>
+          <w:lang w:eastAsia="id-ID"/>
+        </w:rPr>
+        <w:t>subclass</w:t>
+      </w:r>
+      <w:proofErr w:type="spellEnd"/>
+      <w:r>
+        <w:rPr>
+          <w:lang w:eastAsia="id-ID"/>
+        </w:rPr>
+        <w:t xml:space="preserve">. </w:t>
+      </w:r>
+    </w:p>
+    <w:p>
+      <w:pPr>
+        <w:pStyle w:val="DaftarParagraf"/>
+        <w:numPr>
+          <w:ilvl w:val="0"/>
+          <w:numId w:val="13"/>
+        </w:numPr>
+        <w:ind w:left="709"/>
+        <w:rPr>
+          <w:lang w:eastAsia="id-ID"/>
+        </w:rPr>
+      </w:pPr>
+      <w:r>
+        <w:rPr>
+          <w:lang w:eastAsia="id-ID"/>
+        </w:rPr>
+        <w:t xml:space="preserve">Memahami bagaimana satu </w:t>
+      </w:r>
+      <w:proofErr w:type="spellStart"/>
+      <w:r>
+        <w:rPr>
+          <w:lang w:eastAsia="id-ID"/>
+        </w:rPr>
+        <w:t>method</w:t>
+      </w:r>
+      <w:proofErr w:type="spellEnd"/>
+      <w:r>
+        <w:rPr>
+          <w:lang w:eastAsia="id-ID"/>
+        </w:rPr>
+        <w:t xml:space="preserve"> dapat memiliki perilaku berbeda pada objek yang berbeda. </w:t>
+      </w:r>
+    </w:p>
+    <w:p>
+      <w:pPr>
+        <w:pStyle w:val="DaftarParagraf"/>
+        <w:numPr>
+          <w:ilvl w:val="0"/>
+          <w:numId w:val="13"/>
+        </w:numPr>
+        <w:ind w:left="709"/>
+        <w:rPr>
+          <w:lang w:eastAsia="id-ID"/>
+        </w:rPr>
+      </w:pPr>
+      <w:r>
+        <w:rPr>
+          <w:lang w:eastAsia="id-ID"/>
+        </w:rPr>
+        <w:t xml:space="preserve">Mengimplementasikan </w:t>
+      </w:r>
+      <w:proofErr w:type="spellStart"/>
+      <w:r>
+        <w:rPr>
+          <w:lang w:eastAsia="id-ID"/>
+        </w:rPr>
+        <w:t>inheritance</w:t>
+      </w:r>
+      <w:proofErr w:type="spellEnd"/>
+      <w:r>
+        <w:rPr>
+          <w:lang w:eastAsia="id-ID"/>
+        </w:rPr>
+        <w:t xml:space="preserve"> dan </w:t>
+      </w:r>
+      <w:proofErr w:type="spellStart"/>
+      <w:r>
+        <w:rPr>
+          <w:lang w:eastAsia="id-ID"/>
+        </w:rPr>
+        <w:t>polymorphism</w:t>
+      </w:r>
+      <w:proofErr w:type="spellEnd"/>
+      <w:r>
+        <w:rPr>
+          <w:lang w:eastAsia="id-ID"/>
+        </w:rPr>
+        <w:t xml:space="preserve"> menggunakan </w:t>
+      </w:r>
+      <w:proofErr w:type="spellStart"/>
+      <w:r>
+        <w:rPr>
+          <w:lang w:eastAsia="id-ID"/>
+        </w:rPr>
+        <w:t>Python</w:t>
+      </w:r>
+      <w:proofErr w:type="spellEnd"/>
+      <w:r>
+        <w:rPr>
+          <w:lang w:eastAsia="id-ID"/>
+        </w:rPr>
+        <w:t xml:space="preserve">. </w:t>
+      </w:r>
+    </w:p>
+    <w:p>
+      <w:pPr>
         <w:pStyle w:val="Judul2"/>
       </w:pPr>
       <w:r>
@@ -4291,6 +6297,331 @@
     </w:p>
     <w:p>
       <w:pPr>
+        <w:rPr>
+          <w:lang w:eastAsia="id-ID"/>
+        </w:rPr>
+      </w:pPr>
+      <w:proofErr w:type="spellStart"/>
+      <w:r>
+        <w:rPr>
+          <w:lang w:eastAsia="id-ID"/>
+        </w:rPr>
+        <w:t>Inheritance</w:t>
+      </w:r>
+      <w:proofErr w:type="spellEnd"/>
+      <w:r>
+        <w:rPr>
+          <w:lang w:eastAsia="id-ID"/>
+        </w:rPr>
+        <w:t xml:space="preserve"> adalah konsep dalam OOP yang memungkinkan suatu </w:t>
+      </w:r>
+      <w:proofErr w:type="spellStart"/>
+      <w:r>
+        <w:rPr>
+          <w:lang w:eastAsia="id-ID"/>
+        </w:rPr>
+        <w:t>class</w:t>
+      </w:r>
+      <w:proofErr w:type="spellEnd"/>
+      <w:r>
+        <w:rPr>
+          <w:lang w:eastAsia="id-ID"/>
+        </w:rPr>
+        <w:t xml:space="preserve"> (</w:t>
+      </w:r>
+      <w:proofErr w:type="spellStart"/>
+      <w:r>
+        <w:rPr>
+          <w:i/>
+          <w:iCs/>
+          <w:lang w:eastAsia="id-ID"/>
+        </w:rPr>
+        <w:t>subclass</w:t>
+      </w:r>
+      <w:proofErr w:type="spellEnd"/>
+      <w:r>
+        <w:rPr>
+          <w:lang w:eastAsia="id-ID"/>
+        </w:rPr>
+        <w:t xml:space="preserve">) mewarisi atribut dan </w:t>
+      </w:r>
+      <w:proofErr w:type="spellStart"/>
+      <w:r>
+        <w:rPr>
+          <w:lang w:eastAsia="id-ID"/>
+        </w:rPr>
+        <w:t>method</w:t>
+      </w:r>
+      <w:proofErr w:type="spellEnd"/>
+      <w:r>
+        <w:rPr>
+          <w:lang w:eastAsia="id-ID"/>
+        </w:rPr>
+        <w:t xml:space="preserve"> dari </w:t>
+      </w:r>
+      <w:proofErr w:type="spellStart"/>
+      <w:r>
+        <w:rPr>
+          <w:lang w:eastAsia="id-ID"/>
+        </w:rPr>
+        <w:t>class</w:t>
+      </w:r>
+      <w:proofErr w:type="spellEnd"/>
+      <w:r>
+        <w:rPr>
+          <w:lang w:eastAsia="id-ID"/>
+        </w:rPr>
+        <w:t xml:space="preserve"> lain (</w:t>
+      </w:r>
+      <w:proofErr w:type="spellStart"/>
+      <w:r>
+        <w:rPr>
+          <w:i/>
+          <w:iCs/>
+          <w:lang w:eastAsia="id-ID"/>
+        </w:rPr>
+        <w:t>superclass</w:t>
+      </w:r>
+      <w:proofErr w:type="spellEnd"/>
+      <w:r>
+        <w:rPr>
+          <w:lang w:eastAsia="id-ID"/>
+        </w:rPr>
+        <w:t xml:space="preserve">). Dengan </w:t>
+      </w:r>
+      <w:proofErr w:type="spellStart"/>
+      <w:r>
+        <w:rPr>
+          <w:lang w:eastAsia="id-ID"/>
+        </w:rPr>
+        <w:t>inheritance</w:t>
+      </w:r>
+      <w:proofErr w:type="spellEnd"/>
+      <w:r>
+        <w:rPr>
+          <w:lang w:eastAsia="id-ID"/>
+        </w:rPr>
+        <w:t xml:space="preserve">, </w:t>
+      </w:r>
+      <w:proofErr w:type="spellStart"/>
+      <w:r>
+        <w:rPr>
+          <w:lang w:eastAsia="id-ID"/>
+        </w:rPr>
+        <w:t>class</w:t>
+      </w:r>
+      <w:proofErr w:type="spellEnd"/>
+      <w:r>
+        <w:rPr>
+          <w:lang w:eastAsia="id-ID"/>
+        </w:rPr>
+        <w:t xml:space="preserve"> turunan tidak perlu menuliskan ulang kode yang sama, sehingga program menjadi lebih efisien dan mudah dipelihara. Dalam </w:t>
+      </w:r>
+      <w:proofErr w:type="spellStart"/>
+      <w:r>
+        <w:rPr>
+          <w:lang w:eastAsia="id-ID"/>
+        </w:rPr>
+        <w:t>Python</w:t>
+      </w:r>
+      <w:proofErr w:type="spellEnd"/>
+      <w:r>
+        <w:rPr>
+          <w:lang w:eastAsia="id-ID"/>
+        </w:rPr>
+        <w:t xml:space="preserve">, </w:t>
+      </w:r>
+      <w:proofErr w:type="spellStart"/>
+      <w:r>
+        <w:rPr>
+          <w:lang w:eastAsia="id-ID"/>
+        </w:rPr>
+        <w:t>inheritance</w:t>
+      </w:r>
+      <w:proofErr w:type="spellEnd"/>
+      <w:r>
+        <w:rPr>
+          <w:lang w:eastAsia="id-ID"/>
+        </w:rPr>
+        <w:t xml:space="preserve"> </w:t>
+      </w:r>
+      <w:r>
+        <w:rPr>
+          <w:lang w:eastAsia="id-ID"/>
+        </w:rPr>
+        <w:lastRenderedPageBreak/>
+        <w:t xml:space="preserve">dilakukan dengan menuliskan nama </w:t>
+      </w:r>
+      <w:proofErr w:type="spellStart"/>
+      <w:r>
+        <w:rPr>
+          <w:lang w:eastAsia="id-ID"/>
+        </w:rPr>
+        <w:t>class</w:t>
+      </w:r>
+      <w:proofErr w:type="spellEnd"/>
+      <w:r>
+        <w:rPr>
+          <w:lang w:eastAsia="id-ID"/>
+        </w:rPr>
+        <w:t xml:space="preserve"> induk di dalam tanda kurung saat mendefinisikan </w:t>
+      </w:r>
+      <w:proofErr w:type="spellStart"/>
+      <w:r>
+        <w:rPr>
+          <w:lang w:eastAsia="id-ID"/>
+        </w:rPr>
+        <w:t>class</w:t>
+      </w:r>
+      <w:proofErr w:type="spellEnd"/>
+      <w:r>
+        <w:rPr>
+          <w:lang w:eastAsia="id-ID"/>
+        </w:rPr>
+        <w:t xml:space="preserve"> turunan.</w:t>
+      </w:r>
+    </w:p>
+    <w:p>
+      <w:pPr>
+        <w:rPr>
+          <w:lang w:eastAsia="id-ID"/>
+        </w:rPr>
+      </w:pPr>
+      <w:proofErr w:type="spellStart"/>
+      <w:r>
+        <w:rPr>
+          <w:lang w:eastAsia="id-ID"/>
+        </w:rPr>
+        <w:t>Polymorphism</w:t>
+      </w:r>
+      <w:proofErr w:type="spellEnd"/>
+      <w:r>
+        <w:rPr>
+          <w:lang w:eastAsia="id-ID"/>
+        </w:rPr>
+        <w:t xml:space="preserve"> adalah konsep yang memungkinkan satu nama </w:t>
+      </w:r>
+      <w:proofErr w:type="spellStart"/>
+      <w:r>
+        <w:rPr>
+          <w:lang w:eastAsia="id-ID"/>
+        </w:rPr>
+        <w:t>method</w:t>
+      </w:r>
+      <w:proofErr w:type="spellEnd"/>
+      <w:r>
+        <w:rPr>
+          <w:lang w:eastAsia="id-ID"/>
+        </w:rPr>
+        <w:t xml:space="preserve"> digunakan untuk berbagai perilaku yang berbeda, tergantung pada objek yang menggunakannya. Salah satu bentuk </w:t>
+      </w:r>
+      <w:proofErr w:type="spellStart"/>
+      <w:r>
+        <w:rPr>
+          <w:lang w:eastAsia="id-ID"/>
+        </w:rPr>
+        <w:t>polymorphism</w:t>
+      </w:r>
+      <w:proofErr w:type="spellEnd"/>
+      <w:r>
+        <w:rPr>
+          <w:lang w:eastAsia="id-ID"/>
+        </w:rPr>
+        <w:t xml:space="preserve"> dalam </w:t>
+      </w:r>
+      <w:proofErr w:type="spellStart"/>
+      <w:r>
+        <w:rPr>
+          <w:lang w:eastAsia="id-ID"/>
+        </w:rPr>
+        <w:t>Python</w:t>
+      </w:r>
+      <w:proofErr w:type="spellEnd"/>
+      <w:r>
+        <w:rPr>
+          <w:lang w:eastAsia="id-ID"/>
+        </w:rPr>
+        <w:t xml:space="preserve"> adalah </w:t>
+      </w:r>
+      <w:proofErr w:type="spellStart"/>
+      <w:r>
+        <w:rPr>
+          <w:i/>
+          <w:iCs/>
+          <w:lang w:eastAsia="id-ID"/>
+        </w:rPr>
+        <w:t>method</w:t>
+      </w:r>
+      <w:proofErr w:type="spellEnd"/>
+      <w:r>
+        <w:rPr>
+          <w:i/>
+          <w:iCs/>
+          <w:lang w:eastAsia="id-ID"/>
+        </w:rPr>
+        <w:t xml:space="preserve"> </w:t>
+      </w:r>
+      <w:proofErr w:type="spellStart"/>
+      <w:r>
+        <w:rPr>
+          <w:i/>
+          <w:iCs/>
+          <w:lang w:eastAsia="id-ID"/>
+        </w:rPr>
+        <w:t>overriding</w:t>
+      </w:r>
+      <w:proofErr w:type="spellEnd"/>
+      <w:r>
+        <w:rPr>
+          <w:lang w:eastAsia="id-ID"/>
+        </w:rPr>
+        <w:t xml:space="preserve">, yaitu ketika </w:t>
+      </w:r>
+      <w:proofErr w:type="spellStart"/>
+      <w:r>
+        <w:rPr>
+          <w:lang w:eastAsia="id-ID"/>
+        </w:rPr>
+        <w:t>subclass</w:t>
+      </w:r>
+      <w:proofErr w:type="spellEnd"/>
+      <w:r>
+        <w:rPr>
+          <w:lang w:eastAsia="id-ID"/>
+        </w:rPr>
+        <w:t xml:space="preserve"> mendefinisikan ulang </w:t>
+      </w:r>
+      <w:proofErr w:type="spellStart"/>
+      <w:r>
+        <w:rPr>
+          <w:lang w:eastAsia="id-ID"/>
+        </w:rPr>
+        <w:t>method</w:t>
+      </w:r>
+      <w:proofErr w:type="spellEnd"/>
+      <w:r>
+        <w:rPr>
+          <w:lang w:eastAsia="id-ID"/>
+        </w:rPr>
+        <w:t xml:space="preserve"> yang sudah ada di </w:t>
+      </w:r>
+      <w:proofErr w:type="spellStart"/>
+      <w:r>
+        <w:rPr>
+          <w:lang w:eastAsia="id-ID"/>
+        </w:rPr>
+        <w:t>superclass</w:t>
+      </w:r>
+      <w:proofErr w:type="spellEnd"/>
+      <w:r>
+        <w:rPr>
+          <w:lang w:eastAsia="id-ID"/>
+        </w:rPr>
+        <w:t xml:space="preserve"> dengan implementasi yang berbeda.</w:t>
+      </w:r>
+    </w:p>
+    <w:p>
+      <w:pPr>
         <w:pStyle w:val="Judul2"/>
       </w:pPr>
       <w:r>
@@ -4308,6 +6639,259 @@
       <w:proofErr w:type="spellEnd"/>
     </w:p>
     <w:p>
+      <w:r>
+        <w:drawing>
+          <wp:inline distT="0" distB="0" distL="0" distR="0" wp14:anchorId="22B14BC2" wp14:editId="0D184363">
+            <wp:extent cx="3712845" cy="3996523"/>
+            <wp:effectExtent l="0" t="0" r="1905" b="4445"/>
+            <wp:docPr id="1452583606" name="Gambar 1"/>
+            <wp:cNvGraphicFramePr>
+              <a:graphicFrameLocks xmlns:a="http://schemas.openxmlformats.org/drawingml/2006/main" noChangeAspect="1"/>
+            </wp:cNvGraphicFramePr>
+            <a:graphic xmlns:a="http://schemas.openxmlformats.org/drawingml/2006/main">
+              <a:graphicData uri="http://schemas.openxmlformats.org/drawingml/2006/picture">
+                <pic:pic xmlns:pic="http://schemas.openxmlformats.org/drawingml/2006/picture">
+                  <pic:nvPicPr>
+                    <pic:cNvPr id="1452583606" name=""/>
+                    <pic:cNvPicPr/>
+                  </pic:nvPicPr>
+                  <pic:blipFill rotWithShape="1">
+                    <a:blip r:embed="rId20"/>
+                    <a:srcRect l="15944" t="15720" r="10375" b="9942"/>
+                    <a:stretch>
+                      <a:fillRect/>
+                    </a:stretch>
+                  </pic:blipFill>
+                  <pic:spPr bwMode="auto">
+                    <a:xfrm>
+                      <a:off x="0" y="0"/>
+                      <a:ext cx="3713543" cy="3997274"/>
+                    </a:xfrm>
+                    <a:prstGeom prst="rect">
+                      <a:avLst/>
+                    </a:prstGeom>
+                    <a:ln>
+                      <a:noFill/>
+                    </a:ln>
+                    <a:extLst>
+                      <a:ext uri="{53640926-AAD7-44D8-BBD7-CCE9431645EC}">
+                        <a14:shadowObscured xmlns:a14="http://schemas.microsoft.com/office/drawing/2010/main"/>
+                      </a:ext>
+                    </a:extLst>
+                  </pic:spPr>
+                </pic:pic>
+              </a:graphicData>
+            </a:graphic>
+          </wp:inline>
+        </w:drawing>
+      </w:r>
+    </w:p>
+    <w:p>
+      <w:r>
+        <w:t xml:space="preserve">Kode tersebut mengimplementasikan konsep </w:t>
+      </w:r>
+      <w:proofErr w:type="spellStart"/>
+      <w:r>
+        <w:t>inheritance</w:t>
+      </w:r>
+      <w:proofErr w:type="spellEnd"/>
+      <w:r>
+        <w:t xml:space="preserve"> dalam O</w:t>
+      </w:r>
+      <w:proofErr w:type="spellStart"/>
+      <w:r>
+        <w:t>bject-Oriented</w:t>
+      </w:r>
+      <w:proofErr w:type="spellEnd"/>
+      <w:r>
+        <w:t xml:space="preserve"> </w:t>
+      </w:r>
+      <w:proofErr w:type="spellStart"/>
+      <w:r>
+        <w:t>Programming</w:t>
+      </w:r>
+      <w:proofErr w:type="spellEnd"/>
+      <w:r>
+        <w:t xml:space="preserve">. </w:t>
+      </w:r>
+      <w:proofErr w:type="spellStart"/>
+      <w:r>
+        <w:t>Class</w:t>
+      </w:r>
+      <w:proofErr w:type="spellEnd"/>
+      <w:r>
+        <w:t xml:space="preserve"> employe berperan sebagai </w:t>
+      </w:r>
+      <w:proofErr w:type="spellStart"/>
+      <w:r>
+        <w:t>superclass</w:t>
+      </w:r>
+      <w:proofErr w:type="spellEnd"/>
+      <w:r>
+        <w:t xml:space="preserve"> yang mendefinisikan atribut </w:t>
+      </w:r>
+      <w:proofErr w:type="spellStart"/>
+      <w:r>
+        <w:t>name</w:t>
+      </w:r>
+      <w:proofErr w:type="spellEnd"/>
+      <w:r>
+        <w:t xml:space="preserve"> serta </w:t>
+      </w:r>
+      <w:proofErr w:type="spellStart"/>
+      <w:r>
+        <w:t>method</w:t>
+      </w:r>
+      <w:proofErr w:type="spellEnd"/>
+      <w:r>
+        <w:t xml:space="preserve"> </w:t>
+      </w:r>
+      <w:proofErr w:type="spellStart"/>
+      <w:r>
+        <w:t>work</w:t>
+      </w:r>
+      <w:proofErr w:type="spellEnd"/>
+      <w:r>
+        <w:t xml:space="preserve">() sebagai perilaku umum karyawan. </w:t>
+      </w:r>
+      <w:proofErr w:type="spellStart"/>
+      <w:r>
+        <w:t>Class</w:t>
+      </w:r>
+      <w:proofErr w:type="spellEnd"/>
+      <w:r>
+        <w:t xml:space="preserve"> </w:t>
+      </w:r>
+      <w:proofErr w:type="spellStart"/>
+      <w:r>
+        <w:t>dataanalyst</w:t>
+      </w:r>
+      <w:proofErr w:type="spellEnd"/>
+      <w:r>
+        <w:t xml:space="preserve"> dan </w:t>
+      </w:r>
+      <w:proofErr w:type="spellStart"/>
+      <w:r>
+        <w:t>manager</w:t>
+      </w:r>
+      <w:proofErr w:type="spellEnd"/>
+      <w:r>
+        <w:t xml:space="preserve"> merupakan </w:t>
+      </w:r>
+      <w:proofErr w:type="spellStart"/>
+      <w:r>
+        <w:t>subclass</w:t>
+      </w:r>
+      <w:proofErr w:type="spellEnd"/>
+      <w:r>
+        <w:t xml:space="preserve"> yang mewarisi atribut dari </w:t>
+      </w:r>
+      <w:proofErr w:type="spellStart"/>
+      <w:r>
+        <w:t>class</w:t>
+      </w:r>
+      <w:proofErr w:type="spellEnd"/>
+      <w:r>
+        <w:t xml:space="preserve"> employe, namun masing-masing melakukan </w:t>
+      </w:r>
+      <w:proofErr w:type="spellStart"/>
+      <w:r>
+        <w:rPr>
+          <w:i/>
+          <w:iCs/>
+        </w:rPr>
+        <w:t>method</w:t>
+      </w:r>
+      <w:proofErr w:type="spellEnd"/>
+      <w:r>
+        <w:rPr>
+          <w:i/>
+          <w:iCs/>
+        </w:rPr>
+        <w:t xml:space="preserve"> </w:t>
+      </w:r>
+      <w:proofErr w:type="spellStart"/>
+      <w:r>
+        <w:rPr>
+          <w:i/>
+          <w:iCs/>
+        </w:rPr>
+        <w:t>overriding</w:t>
+      </w:r>
+      <w:proofErr w:type="spellEnd"/>
+      <w:r>
+        <w:t xml:space="preserve"> terhadap </w:t>
+      </w:r>
+      <w:proofErr w:type="spellStart"/>
+      <w:r>
+        <w:t>method</w:t>
+      </w:r>
+      <w:proofErr w:type="spellEnd"/>
+      <w:r>
+        <w:t xml:space="preserve"> </w:t>
+      </w:r>
+      <w:proofErr w:type="spellStart"/>
+      <w:r>
+        <w:t>work</w:t>
+      </w:r>
+      <w:proofErr w:type="spellEnd"/>
+      <w:r>
+        <w:t xml:space="preserve">() dengan perilaku yang berbeda. Objek A dan B dibuat dari </w:t>
+      </w:r>
+      <w:r>
+        <w:lastRenderedPageBreak/>
+        <w:t xml:space="preserve">kedua </w:t>
+      </w:r>
+      <w:proofErr w:type="spellStart"/>
+      <w:r>
+        <w:t>subclass</w:t>
+      </w:r>
+      <w:proofErr w:type="spellEnd"/>
+      <w:r>
+        <w:t xml:space="preserve"> tersebut dengan nama yang berbeda, sehingga meskipun memiliki struktur yang sama, hasil yang ditampilkan berbeda saat </w:t>
+      </w:r>
+      <w:proofErr w:type="spellStart"/>
+      <w:r>
+        <w:t>method</w:t>
+      </w:r>
+      <w:proofErr w:type="spellEnd"/>
+      <w:r>
+        <w:t xml:space="preserve"> dipanggil. Hal ini menunjukkan konsep </w:t>
+      </w:r>
+      <w:proofErr w:type="spellStart"/>
+      <w:r>
+        <w:t>polymorphism</w:t>
+      </w:r>
+      <w:proofErr w:type="spellEnd"/>
+      <w:r>
+        <w:t xml:space="preserve">, di mana satu </w:t>
+      </w:r>
+      <w:proofErr w:type="spellStart"/>
+      <w:r>
+        <w:t>method</w:t>
+      </w:r>
+      <w:proofErr w:type="spellEnd"/>
+      <w:r>
+        <w:t xml:space="preserve"> yang sama dapat memiliki implementasi berbeda tergantung pada objek yang menggunakannya, sementara </w:t>
+      </w:r>
+      <w:proofErr w:type="spellStart"/>
+      <w:r>
+        <w:t>inheritance</w:t>
+      </w:r>
+      <w:proofErr w:type="spellEnd"/>
+      <w:r>
+        <w:t xml:space="preserve"> memungkinkan penggunaan kembali struktur dari </w:t>
+      </w:r>
+      <w:proofErr w:type="spellStart"/>
+      <w:r>
+        <w:t>class</w:t>
+      </w:r>
+      <w:proofErr w:type="spellEnd"/>
+      <w:r>
+        <w:t xml:space="preserve"> induk.</w:t>
+      </w:r>
+    </w:p>
+    <w:p>
       <w:pPr>
         <w:pStyle w:val="Judul3"/>
       </w:pPr>
@@ -4317,6 +6901,1139 @@
       </w:r>
       <w:proofErr w:type="spellEnd"/>
     </w:p>
+    <w:p>
+      <w:pPr>
+        <w:rPr>
+          <w:lang w:eastAsia="id-ID"/>
+        </w:rPr>
+      </w:pPr>
+      <w:r>
+        <w:rPr>
+          <w:lang w:eastAsia="id-ID"/>
+        </w:rPr>
+        <w:drawing>
+          <wp:inline distT="0" distB="0" distL="0" distR="0" wp14:anchorId="02858C73" wp14:editId="01482200">
+            <wp:extent cx="3865164" cy="4695825"/>
+            <wp:effectExtent l="0" t="0" r="2540" b="0"/>
+            <wp:docPr id="1418057737" name="Gambar 1"/>
+            <wp:cNvGraphicFramePr>
+              <a:graphicFrameLocks xmlns:a="http://schemas.openxmlformats.org/drawingml/2006/main" noChangeAspect="1"/>
+            </wp:cNvGraphicFramePr>
+            <a:graphic xmlns:a="http://schemas.openxmlformats.org/drawingml/2006/main">
+              <a:graphicData uri="http://schemas.openxmlformats.org/drawingml/2006/picture">
+                <pic:pic xmlns:pic="http://schemas.openxmlformats.org/drawingml/2006/picture">
+                  <pic:nvPicPr>
+                    <pic:cNvPr id="1418057737" name=""/>
+                    <pic:cNvPicPr/>
+                  </pic:nvPicPr>
+                  <pic:blipFill rotWithShape="1">
+                    <a:blip r:embed="rId21"/>
+                    <a:srcRect l="14157" t="12825" r="9133" b="7724"/>
+                    <a:stretch>
+                      <a:fillRect/>
+                    </a:stretch>
+                  </pic:blipFill>
+                  <pic:spPr bwMode="auto">
+                    <a:xfrm>
+                      <a:off x="0" y="0"/>
+                      <a:ext cx="3866192" cy="4697074"/>
+                    </a:xfrm>
+                    <a:prstGeom prst="rect">
+                      <a:avLst/>
+                    </a:prstGeom>
+                    <a:ln>
+                      <a:noFill/>
+                    </a:ln>
+                    <a:extLst>
+                      <a:ext uri="{53640926-AAD7-44D8-BBD7-CCE9431645EC}">
+                        <a14:shadowObscured xmlns:a14="http://schemas.microsoft.com/office/drawing/2010/main"/>
+                      </a:ext>
+                    </a:extLst>
+                  </pic:spPr>
+                </pic:pic>
+              </a:graphicData>
+            </a:graphic>
+          </wp:inline>
+        </w:drawing>
+      </w:r>
+    </w:p>
+    <w:p>
+      <w:pPr>
+        <w:rPr>
+          <w:lang w:eastAsia="id-ID"/>
+        </w:rPr>
+      </w:pPr>
+      <w:r>
+        <w:rPr>
+          <w:lang w:eastAsia="id-ID"/>
+        </w:rPr>
+        <w:t xml:space="preserve">Kode tersebut mengimplementasikan konsep </w:t>
+      </w:r>
+      <w:proofErr w:type="spellStart"/>
+      <w:r>
+        <w:rPr>
+          <w:lang w:eastAsia="id-ID"/>
+        </w:rPr>
+        <w:t>inheritance</w:t>
+      </w:r>
+      <w:proofErr w:type="spellEnd"/>
+      <w:r>
+        <w:rPr>
+          <w:lang w:eastAsia="id-ID"/>
+        </w:rPr>
+        <w:t xml:space="preserve"> dan </w:t>
+      </w:r>
+      <w:proofErr w:type="spellStart"/>
+      <w:r>
+        <w:rPr>
+          <w:lang w:eastAsia="id-ID"/>
+        </w:rPr>
+        <w:t>polymorphism</w:t>
+      </w:r>
+      <w:proofErr w:type="spellEnd"/>
+      <w:r>
+        <w:rPr>
+          <w:lang w:eastAsia="id-ID"/>
+        </w:rPr>
+        <w:t xml:space="preserve"> dalam OOP melalui perhitungan luas bangun datar. </w:t>
+      </w:r>
+      <w:proofErr w:type="spellStart"/>
+      <w:r>
+        <w:rPr>
+          <w:lang w:eastAsia="id-ID"/>
+        </w:rPr>
+        <w:t>Class</w:t>
+      </w:r>
+      <w:proofErr w:type="spellEnd"/>
+      <w:r>
+        <w:rPr>
+          <w:lang w:eastAsia="id-ID"/>
+        </w:rPr>
+        <w:t xml:space="preserve"> </w:t>
+      </w:r>
+      <w:proofErr w:type="spellStart"/>
+      <w:r>
+        <w:rPr>
+          <w:rFonts w:ascii="Courier New" w:hAnsi="Courier New" w:cs="Courier New"/>
+          <w:sz w:val="20"/>
+          <w:szCs w:val="20"/>
+          <w:lang w:eastAsia="id-ID"/>
+        </w:rPr>
+        <w:t>shape</w:t>
+      </w:r>
+      <w:proofErr w:type="spellEnd"/>
+      <w:r>
+        <w:rPr>
+          <w:lang w:eastAsia="id-ID"/>
+        </w:rPr>
+        <w:t xml:space="preserve"> berperan sebagai </w:t>
+      </w:r>
+      <w:proofErr w:type="spellStart"/>
+      <w:r>
+        <w:rPr>
+          <w:lang w:eastAsia="id-ID"/>
+        </w:rPr>
+        <w:t>superclass</w:t>
+      </w:r>
+      <w:proofErr w:type="spellEnd"/>
+      <w:r>
+        <w:rPr>
+          <w:lang w:eastAsia="id-ID"/>
+        </w:rPr>
+        <w:t xml:space="preserve"> yang mendefinisikan </w:t>
+      </w:r>
+      <w:proofErr w:type="spellStart"/>
+      <w:r>
+        <w:rPr>
+          <w:lang w:eastAsia="id-ID"/>
+        </w:rPr>
+        <w:t>method</w:t>
+      </w:r>
+      <w:proofErr w:type="spellEnd"/>
+      <w:r>
+        <w:rPr>
+          <w:lang w:eastAsia="id-ID"/>
+        </w:rPr>
+        <w:t xml:space="preserve"> </w:t>
+      </w:r>
+      <w:r>
+        <w:rPr>
+          <w:rFonts w:ascii="Courier New" w:hAnsi="Courier New" w:cs="Courier New"/>
+          <w:sz w:val="20"/>
+          <w:szCs w:val="20"/>
+          <w:lang w:eastAsia="id-ID"/>
+        </w:rPr>
+        <w:t>area()</w:t>
+      </w:r>
+      <w:r>
+        <w:rPr>
+          <w:lang w:eastAsia="id-ID"/>
+        </w:rPr>
+        <w:t xml:space="preserve"> tanpa implementasi (sebagai kerangka umum). </w:t>
+      </w:r>
+      <w:proofErr w:type="spellStart"/>
+      <w:r>
+        <w:rPr>
+          <w:lang w:eastAsia="id-ID"/>
+        </w:rPr>
+        <w:t>Class</w:t>
+      </w:r>
+      <w:proofErr w:type="spellEnd"/>
+      <w:r>
+        <w:rPr>
+          <w:lang w:eastAsia="id-ID"/>
+        </w:rPr>
+        <w:t xml:space="preserve"> </w:t>
+      </w:r>
+      <w:proofErr w:type="spellStart"/>
+      <w:r>
+        <w:rPr>
+          <w:rFonts w:ascii="Courier New" w:hAnsi="Courier New" w:cs="Courier New"/>
+          <w:sz w:val="20"/>
+          <w:szCs w:val="20"/>
+          <w:lang w:eastAsia="id-ID"/>
+        </w:rPr>
+        <w:t>circle</w:t>
+      </w:r>
+      <w:proofErr w:type="spellEnd"/>
+      <w:r>
+        <w:rPr>
+          <w:lang w:eastAsia="id-ID"/>
+        </w:rPr>
+        <w:t xml:space="preserve"> dan </w:t>
+      </w:r>
+      <w:proofErr w:type="spellStart"/>
+      <w:r>
+        <w:rPr>
+          <w:rFonts w:ascii="Courier New" w:hAnsi="Courier New" w:cs="Courier New"/>
+          <w:sz w:val="20"/>
+          <w:szCs w:val="20"/>
+          <w:lang w:eastAsia="id-ID"/>
+        </w:rPr>
+        <w:t>square</w:t>
+      </w:r>
+      <w:proofErr w:type="spellEnd"/>
+      <w:r>
+        <w:rPr>
+          <w:lang w:eastAsia="id-ID"/>
+        </w:rPr>
+        <w:t xml:space="preserve"> merupakan </w:t>
+      </w:r>
+      <w:proofErr w:type="spellStart"/>
+      <w:r>
+        <w:rPr>
+          <w:lang w:eastAsia="id-ID"/>
+        </w:rPr>
+        <w:t>subclass</w:t>
+      </w:r>
+      <w:proofErr w:type="spellEnd"/>
+      <w:r>
+        <w:rPr>
+          <w:lang w:eastAsia="id-ID"/>
+        </w:rPr>
+        <w:t xml:space="preserve"> yang mewarisi dari </w:t>
+      </w:r>
+      <w:proofErr w:type="spellStart"/>
+      <w:r>
+        <w:rPr>
+          <w:rFonts w:ascii="Courier New" w:hAnsi="Courier New" w:cs="Courier New"/>
+          <w:sz w:val="20"/>
+          <w:szCs w:val="20"/>
+          <w:lang w:eastAsia="id-ID"/>
+        </w:rPr>
+        <w:t>shape</w:t>
+      </w:r>
+      <w:proofErr w:type="spellEnd"/>
+      <w:r>
+        <w:rPr>
+          <w:lang w:eastAsia="id-ID"/>
+        </w:rPr>
+        <w:t xml:space="preserve"> dan masing-masing </w:t>
+      </w:r>
+      <w:proofErr w:type="spellStart"/>
+      <w:r>
+        <w:rPr>
+          <w:lang w:eastAsia="id-ID"/>
+        </w:rPr>
+        <w:t>meng-</w:t>
+      </w:r>
+      <w:r>
+        <w:rPr>
+          <w:i/>
+          <w:iCs/>
+          <w:lang w:eastAsia="id-ID"/>
+        </w:rPr>
+        <w:t>override</w:t>
+      </w:r>
+      <w:proofErr w:type="spellEnd"/>
+      <w:r>
+        <w:rPr>
+          <w:lang w:eastAsia="id-ID"/>
+        </w:rPr>
+        <w:t xml:space="preserve"> </w:t>
+      </w:r>
+      <w:proofErr w:type="spellStart"/>
+      <w:r>
+        <w:rPr>
+          <w:lang w:eastAsia="id-ID"/>
+        </w:rPr>
+        <w:t>method</w:t>
+      </w:r>
+      <w:proofErr w:type="spellEnd"/>
+      <w:r>
+        <w:rPr>
+          <w:lang w:eastAsia="id-ID"/>
+        </w:rPr>
+        <w:t xml:space="preserve"> </w:t>
+      </w:r>
+      <w:r>
+        <w:rPr>
+          <w:rFonts w:ascii="Courier New" w:hAnsi="Courier New" w:cs="Courier New"/>
+          <w:sz w:val="20"/>
+          <w:szCs w:val="20"/>
+          <w:lang w:eastAsia="id-ID"/>
+        </w:rPr>
+        <w:t>area()</w:t>
+      </w:r>
+      <w:r>
+        <w:rPr>
+          <w:lang w:eastAsia="id-ID"/>
+        </w:rPr>
+        <w:t xml:space="preserve"> sesuai rumusnya, yaitu luas lingkaran </w:t>
+      </w:r>
+      <m:oMath>
+        <m:r>
+          <w:rPr>
+            <w:rFonts w:ascii="Cambria Math" w:hAnsi="Cambria Math"/>
+            <w:lang w:eastAsia="id-ID"/>
+          </w:rPr>
+          <m:t>π</m:t>
+        </m:r>
+        <m:sSup>
+          <m:sSupPr>
+            <m:ctrlPr>
+              <w:rPr>
+                <w:rFonts w:ascii="Cambria Math" w:hAnsi="Cambria Math"/>
+                <w:lang w:eastAsia="id-ID"/>
+              </w:rPr>
+            </m:ctrlPr>
+          </m:sSupPr>
+          <m:e>
+            <m:r>
+              <w:rPr>
+                <w:rFonts w:ascii="Cambria Math" w:hAnsi="Cambria Math"/>
+                <w:lang w:eastAsia="id-ID"/>
+              </w:rPr>
+              <m:t>r</m:t>
+            </m:r>
+          </m:e>
+          <m:sup>
+            <m:r>
+              <w:rPr>
+                <w:rFonts w:ascii="Cambria Math" w:hAnsi="Cambria Math"/>
+                <w:lang w:eastAsia="id-ID"/>
+              </w:rPr>
+              <m:t>2</m:t>
+            </m:r>
+          </m:sup>
+        </m:sSup>
+      </m:oMath>
+      <w:r>
+        <w:rPr>
+          <w:lang w:eastAsia="id-ID"/>
+        </w:rPr>
+        <w:t xml:space="preserve">dan luas persegi </w:t>
+      </w:r>
+      <m:oMath>
+        <m:sSup>
+          <m:sSupPr>
+            <m:ctrlPr>
+              <w:rPr>
+                <w:rFonts w:ascii="Cambria Math" w:hAnsi="Cambria Math"/>
+                <w:lang w:eastAsia="id-ID"/>
+              </w:rPr>
+            </m:ctrlPr>
+          </m:sSupPr>
+          <m:e>
+            <m:r>
+              <w:rPr>
+                <w:rFonts w:ascii="Cambria Math" w:hAnsi="Cambria Math"/>
+                <w:lang w:eastAsia="id-ID"/>
+              </w:rPr>
+              <m:t>s</m:t>
+            </m:r>
+          </m:e>
+          <m:sup>
+            <m:r>
+              <w:rPr>
+                <w:rFonts w:ascii="Cambria Math" w:hAnsi="Cambria Math"/>
+                <w:lang w:eastAsia="id-ID"/>
+              </w:rPr>
+              <m:t>2</m:t>
+            </m:r>
+          </m:sup>
+        </m:sSup>
+      </m:oMath>
+      <w:r>
+        <w:rPr>
+          <w:lang w:eastAsia="id-ID"/>
+        </w:rPr>
+        <w:t xml:space="preserve">. Objek </w:t>
+      </w:r>
+      <w:r>
+        <w:rPr>
+          <w:rFonts w:ascii="Courier New" w:hAnsi="Courier New" w:cs="Courier New"/>
+          <w:sz w:val="20"/>
+          <w:szCs w:val="20"/>
+          <w:lang w:eastAsia="id-ID"/>
+        </w:rPr>
+        <w:t>lingkaran</w:t>
+      </w:r>
+      <w:r>
+        <w:rPr>
+          <w:lang w:eastAsia="id-ID"/>
+        </w:rPr>
+        <w:t xml:space="preserve"> dan </w:t>
+      </w:r>
+      <w:r>
+        <w:rPr>
+          <w:rFonts w:ascii="Courier New" w:hAnsi="Courier New" w:cs="Courier New"/>
+          <w:sz w:val="20"/>
+          <w:szCs w:val="20"/>
+          <w:lang w:eastAsia="id-ID"/>
+        </w:rPr>
+        <w:t>persegi</w:t>
+      </w:r>
+      <w:r>
+        <w:rPr>
+          <w:lang w:eastAsia="id-ID"/>
+        </w:rPr>
+        <w:t xml:space="preserve"> dibuat </w:t>
+      </w:r>
+      <w:r>
+        <w:rPr>
+          <w:lang w:eastAsia="id-ID"/>
+        </w:rPr>
+        <w:lastRenderedPageBreak/>
+        <w:t xml:space="preserve">dengan nilai parameter berbeda, kemudian </w:t>
+      </w:r>
+      <w:proofErr w:type="spellStart"/>
+      <w:r>
+        <w:rPr>
+          <w:lang w:eastAsia="id-ID"/>
+        </w:rPr>
+        <w:t>method</w:t>
+      </w:r>
+      <w:proofErr w:type="spellEnd"/>
+      <w:r>
+        <w:rPr>
+          <w:lang w:eastAsia="id-ID"/>
+        </w:rPr>
+        <w:t xml:space="preserve"> </w:t>
+      </w:r>
+      <w:r>
+        <w:rPr>
+          <w:rFonts w:ascii="Courier New" w:hAnsi="Courier New" w:cs="Courier New"/>
+          <w:sz w:val="20"/>
+          <w:szCs w:val="20"/>
+          <w:lang w:eastAsia="id-ID"/>
+        </w:rPr>
+        <w:t>area()</w:t>
+      </w:r>
+      <w:r>
+        <w:rPr>
+          <w:lang w:eastAsia="id-ID"/>
+        </w:rPr>
+        <w:t xml:space="preserve"> dipanggil untuk menghitung luas masing-masing bangun. Fungsi </w:t>
+      </w:r>
+      <w:r>
+        <w:rPr>
+          <w:rFonts w:ascii="Courier New" w:hAnsi="Courier New" w:cs="Courier New"/>
+          <w:sz w:val="20"/>
+          <w:szCs w:val="20"/>
+          <w:lang w:eastAsia="id-ID"/>
+        </w:rPr>
+        <w:t>main()</w:t>
+      </w:r>
+      <w:r>
+        <w:rPr>
+          <w:lang w:eastAsia="id-ID"/>
+        </w:rPr>
+        <w:t xml:space="preserve"> digunakan sebagai pengatur alur program, dan kondisi </w:t>
+      </w:r>
+      <w:proofErr w:type="spellStart"/>
+      <w:r>
+        <w:rPr>
+          <w:rFonts w:ascii="Courier New" w:hAnsi="Courier New" w:cs="Courier New"/>
+          <w:sz w:val="20"/>
+          <w:szCs w:val="20"/>
+          <w:lang w:eastAsia="id-ID"/>
+        </w:rPr>
+        <w:t>if</w:t>
+      </w:r>
+      <w:proofErr w:type="spellEnd"/>
+      <w:r>
+        <w:rPr>
+          <w:rFonts w:ascii="Courier New" w:hAnsi="Courier New" w:cs="Courier New"/>
+          <w:sz w:val="20"/>
+          <w:szCs w:val="20"/>
+          <w:lang w:eastAsia="id-ID"/>
+        </w:rPr>
+        <w:t xml:space="preserve"> __</w:t>
+      </w:r>
+      <w:proofErr w:type="spellStart"/>
+      <w:r>
+        <w:rPr>
+          <w:rFonts w:ascii="Courier New" w:hAnsi="Courier New" w:cs="Courier New"/>
+          <w:sz w:val="20"/>
+          <w:szCs w:val="20"/>
+          <w:lang w:eastAsia="id-ID"/>
+        </w:rPr>
+        <w:t>name</w:t>
+      </w:r>
+      <w:proofErr w:type="spellEnd"/>
+      <w:r>
+        <w:rPr>
+          <w:rFonts w:ascii="Courier New" w:hAnsi="Courier New" w:cs="Courier New"/>
+          <w:sz w:val="20"/>
+          <w:szCs w:val="20"/>
+          <w:lang w:eastAsia="id-ID"/>
+        </w:rPr>
+        <w:t>__ == "__main__":</w:t>
+      </w:r>
+      <w:r>
+        <w:rPr>
+          <w:lang w:eastAsia="id-ID"/>
+        </w:rPr>
+        <w:t xml:space="preserve"> memastikan fungsi tersebut hanya dijalankan saat </w:t>
+      </w:r>
+      <w:proofErr w:type="spellStart"/>
+      <w:r>
+        <w:rPr>
+          <w:lang w:eastAsia="id-ID"/>
+        </w:rPr>
+        <w:t>file</w:t>
+      </w:r>
+      <w:proofErr w:type="spellEnd"/>
+      <w:r>
+        <w:rPr>
+          <w:lang w:eastAsia="id-ID"/>
+        </w:rPr>
+        <w:t xml:space="preserve"> dieksekusi langsung. Secara konsep, </w:t>
+      </w:r>
+      <w:proofErr w:type="spellStart"/>
+      <w:r>
+        <w:rPr>
+          <w:lang w:eastAsia="id-ID"/>
+        </w:rPr>
+        <w:t>inheritance</w:t>
+      </w:r>
+      <w:proofErr w:type="spellEnd"/>
+      <w:r>
+        <w:rPr>
+          <w:lang w:eastAsia="id-ID"/>
+        </w:rPr>
+        <w:t xml:space="preserve"> terlihat dari hubungan </w:t>
+      </w:r>
+      <w:proofErr w:type="spellStart"/>
+      <w:r>
+        <w:rPr>
+          <w:lang w:eastAsia="id-ID"/>
+        </w:rPr>
+        <w:t>class</w:t>
+      </w:r>
+      <w:proofErr w:type="spellEnd"/>
+      <w:r>
+        <w:rPr>
+          <w:lang w:eastAsia="id-ID"/>
+        </w:rPr>
+        <w:t xml:space="preserve"> turunan dengan </w:t>
+      </w:r>
+      <w:proofErr w:type="spellStart"/>
+      <w:r>
+        <w:rPr>
+          <w:lang w:eastAsia="id-ID"/>
+        </w:rPr>
+        <w:t>class</w:t>
+      </w:r>
+      <w:proofErr w:type="spellEnd"/>
+      <w:r>
+        <w:rPr>
+          <w:lang w:eastAsia="id-ID"/>
+        </w:rPr>
+        <w:t xml:space="preserve"> </w:t>
+      </w:r>
+      <w:proofErr w:type="spellStart"/>
+      <w:r>
+        <w:rPr>
+          <w:rFonts w:ascii="Courier New" w:hAnsi="Courier New" w:cs="Courier New"/>
+          <w:sz w:val="20"/>
+          <w:szCs w:val="20"/>
+          <w:lang w:eastAsia="id-ID"/>
+        </w:rPr>
+        <w:t>shape</w:t>
+      </w:r>
+      <w:proofErr w:type="spellEnd"/>
+      <w:r>
+        <w:rPr>
+          <w:lang w:eastAsia="id-ID"/>
+        </w:rPr>
+        <w:t xml:space="preserve">, sedangkan </w:t>
+      </w:r>
+      <w:proofErr w:type="spellStart"/>
+      <w:r>
+        <w:rPr>
+          <w:lang w:eastAsia="id-ID"/>
+        </w:rPr>
+        <w:t>polymorphism</w:t>
+      </w:r>
+      <w:proofErr w:type="spellEnd"/>
+      <w:r>
+        <w:rPr>
+          <w:lang w:eastAsia="id-ID"/>
+        </w:rPr>
+        <w:t xml:space="preserve"> terlihat dari penggunaan </w:t>
+      </w:r>
+      <w:proofErr w:type="spellStart"/>
+      <w:r>
+        <w:rPr>
+          <w:lang w:eastAsia="id-ID"/>
+        </w:rPr>
+        <w:t>method</w:t>
+      </w:r>
+      <w:proofErr w:type="spellEnd"/>
+      <w:r>
+        <w:rPr>
+          <w:lang w:eastAsia="id-ID"/>
+        </w:rPr>
+        <w:t xml:space="preserve"> </w:t>
+      </w:r>
+      <w:r>
+        <w:rPr>
+          <w:rFonts w:ascii="Courier New" w:hAnsi="Courier New" w:cs="Courier New"/>
+          <w:sz w:val="20"/>
+          <w:szCs w:val="20"/>
+          <w:lang w:eastAsia="id-ID"/>
+        </w:rPr>
+        <w:t>area()</w:t>
+      </w:r>
+      <w:r>
+        <w:rPr>
+          <w:lang w:eastAsia="id-ID"/>
+        </w:rPr>
+        <w:t xml:space="preserve"> yang sama tetapi menghasilkan perilaku berbeda tergantung objek yang memanggilnya.</w:t>
+      </w:r>
+    </w:p>
+    <w:p>
+      <w:pPr>
+        <w:rPr>
+          <w:lang w:eastAsia="id-ID"/>
+        </w:rPr>
+      </w:pPr>
+      <w:r>
+        <w:rPr>
+          <w:lang w:eastAsia="id-ID"/>
+        </w:rPr>
+        <w:drawing>
+          <wp:inline distT="0" distB="0" distL="0" distR="0" wp14:anchorId="67AAF37E" wp14:editId="562CB327">
+            <wp:extent cx="3830320" cy="4454236"/>
+            <wp:effectExtent l="0" t="0" r="0" b="3810"/>
+            <wp:docPr id="812016443" name="Gambar 1"/>
+            <wp:cNvGraphicFramePr>
+              <a:graphicFrameLocks xmlns:a="http://schemas.openxmlformats.org/drawingml/2006/main" noChangeAspect="1"/>
+            </wp:cNvGraphicFramePr>
+            <a:graphic xmlns:a="http://schemas.openxmlformats.org/drawingml/2006/main">
+              <a:graphicData uri="http://schemas.openxmlformats.org/drawingml/2006/picture">
+                <pic:pic xmlns:pic="http://schemas.openxmlformats.org/drawingml/2006/picture">
+                  <pic:nvPicPr>
+                    <pic:cNvPr id="812016443" name=""/>
+                    <pic:cNvPicPr/>
+                  </pic:nvPicPr>
+                  <pic:blipFill rotWithShape="1">
+                    <a:blip r:embed="rId22"/>
+                    <a:srcRect l="14020" t="12835" r="9970" b="8567"/>
+                    <a:stretch>
+                      <a:fillRect/>
+                    </a:stretch>
+                  </pic:blipFill>
+                  <pic:spPr bwMode="auto">
+                    <a:xfrm>
+                      <a:off x="0" y="0"/>
+                      <a:ext cx="3830935" cy="4454951"/>
+                    </a:xfrm>
+                    <a:prstGeom prst="rect">
+                      <a:avLst/>
+                    </a:prstGeom>
+                    <a:ln>
+                      <a:noFill/>
+                    </a:ln>
+                    <a:extLst>
+                      <a:ext uri="{53640926-AAD7-44D8-BBD7-CCE9431645EC}">
+                        <a14:shadowObscured xmlns:a14="http://schemas.microsoft.com/office/drawing/2010/main"/>
+                      </a:ext>
+                    </a:extLst>
+                  </pic:spPr>
+                </pic:pic>
+              </a:graphicData>
+            </a:graphic>
+          </wp:inline>
+        </w:drawing>
+      </w:r>
+    </w:p>
+    <w:p>
+      <w:pPr>
+        <w:rPr>
+          <w:lang w:eastAsia="id-ID"/>
+        </w:rPr>
+      </w:pPr>
+      <w:proofErr w:type="spellStart"/>
+      <w:r>
+        <w:rPr>
+          <w:lang w:eastAsia="id-ID"/>
+        </w:rPr>
+        <w:t>Class</w:t>
+      </w:r>
+      <w:proofErr w:type="spellEnd"/>
+      <w:r>
+        <w:rPr>
+          <w:lang w:eastAsia="id-ID"/>
+        </w:rPr>
+        <w:t xml:space="preserve"> </w:t>
+      </w:r>
+      <w:proofErr w:type="spellStart"/>
+      <w:r>
+        <w:rPr>
+          <w:lang w:eastAsia="id-ID"/>
+        </w:rPr>
+        <w:t>Notification</w:t>
+      </w:r>
+      <w:proofErr w:type="spellEnd"/>
+      <w:r>
+        <w:rPr>
+          <w:lang w:eastAsia="id-ID"/>
+        </w:rPr>
+        <w:t xml:space="preserve"> berperan sebagai </w:t>
+      </w:r>
+      <w:proofErr w:type="spellStart"/>
+      <w:r>
+        <w:rPr>
+          <w:lang w:eastAsia="id-ID"/>
+        </w:rPr>
+        <w:t>superclass</w:t>
+      </w:r>
+      <w:proofErr w:type="spellEnd"/>
+      <w:r>
+        <w:rPr>
+          <w:lang w:eastAsia="id-ID"/>
+        </w:rPr>
+        <w:t xml:space="preserve"> yang mendefinisikan </w:t>
+      </w:r>
+      <w:proofErr w:type="spellStart"/>
+      <w:r>
+        <w:rPr>
+          <w:lang w:eastAsia="id-ID"/>
+        </w:rPr>
+        <w:t>method</w:t>
+      </w:r>
+      <w:proofErr w:type="spellEnd"/>
+      <w:r>
+        <w:rPr>
+          <w:lang w:eastAsia="id-ID"/>
+        </w:rPr>
+        <w:t xml:space="preserve"> </w:t>
+      </w:r>
+      <w:proofErr w:type="spellStart"/>
+      <w:r>
+        <w:rPr>
+          <w:lang w:eastAsia="id-ID"/>
+        </w:rPr>
+        <w:t>send</w:t>
+      </w:r>
+      <w:proofErr w:type="spellEnd"/>
+      <w:r>
+        <w:rPr>
+          <w:lang w:eastAsia="id-ID"/>
+        </w:rPr>
+        <w:t xml:space="preserve">() sebagai kerangka umum tanpa implementasi. </w:t>
+      </w:r>
+      <w:proofErr w:type="spellStart"/>
+      <w:r>
+        <w:rPr>
+          <w:lang w:eastAsia="id-ID"/>
+        </w:rPr>
+        <w:t>Class</w:t>
+      </w:r>
+      <w:proofErr w:type="spellEnd"/>
+      <w:r>
+        <w:rPr>
+          <w:lang w:eastAsia="id-ID"/>
+        </w:rPr>
+        <w:t xml:space="preserve"> Email, SMS, dan </w:t>
+      </w:r>
+      <w:proofErr w:type="spellStart"/>
+      <w:r>
+        <w:rPr>
+          <w:lang w:eastAsia="id-ID"/>
+        </w:rPr>
+        <w:t>Push</w:t>
+      </w:r>
+      <w:proofErr w:type="spellEnd"/>
+      <w:r>
+        <w:rPr>
+          <w:lang w:eastAsia="id-ID"/>
+        </w:rPr>
+        <w:t xml:space="preserve"> merupakan </w:t>
+      </w:r>
+      <w:proofErr w:type="spellStart"/>
+      <w:r>
+        <w:rPr>
+          <w:lang w:eastAsia="id-ID"/>
+        </w:rPr>
+        <w:t>subclass</w:t>
+      </w:r>
+      <w:proofErr w:type="spellEnd"/>
+      <w:r>
+        <w:rPr>
+          <w:lang w:eastAsia="id-ID"/>
+        </w:rPr>
+        <w:t xml:space="preserve"> yang mewarisi dari </w:t>
+      </w:r>
+      <w:proofErr w:type="spellStart"/>
+      <w:r>
+        <w:rPr>
+          <w:lang w:eastAsia="id-ID"/>
+        </w:rPr>
+        <w:t>Notification</w:t>
+      </w:r>
+      <w:proofErr w:type="spellEnd"/>
+      <w:r>
+        <w:rPr>
+          <w:lang w:eastAsia="id-ID"/>
+        </w:rPr>
+        <w:t xml:space="preserve"> dan masing-masing melakukan </w:t>
+      </w:r>
+      <w:proofErr w:type="spellStart"/>
+      <w:r>
+        <w:rPr>
+          <w:i/>
+          <w:iCs/>
+          <w:lang w:eastAsia="id-ID"/>
+        </w:rPr>
+        <w:t>method</w:t>
+      </w:r>
+      <w:proofErr w:type="spellEnd"/>
+      <w:r>
+        <w:rPr>
+          <w:i/>
+          <w:iCs/>
+          <w:lang w:eastAsia="id-ID"/>
+        </w:rPr>
+        <w:t xml:space="preserve"> </w:t>
+      </w:r>
+      <w:proofErr w:type="spellStart"/>
+      <w:r>
+        <w:rPr>
+          <w:i/>
+          <w:iCs/>
+          <w:lang w:eastAsia="id-ID"/>
+        </w:rPr>
+        <w:t>overriding</w:t>
+      </w:r>
+      <w:proofErr w:type="spellEnd"/>
+      <w:r>
+        <w:rPr>
+          <w:lang w:eastAsia="id-ID"/>
+        </w:rPr>
+        <w:t xml:space="preserve"> terhadap </w:t>
+      </w:r>
+      <w:proofErr w:type="spellStart"/>
+      <w:r>
+        <w:rPr>
+          <w:lang w:eastAsia="id-ID"/>
+        </w:rPr>
+        <w:t>send</w:t>
+      </w:r>
+      <w:proofErr w:type="spellEnd"/>
+      <w:r>
+        <w:rPr>
+          <w:lang w:eastAsia="id-ID"/>
+        </w:rPr>
+        <w:t>() dengan format pengiriman pesan yang berbeda sesuai jenis notifikasi.</w:t>
+      </w:r>
+    </w:p>
+    <w:p>
+      <w:pPr>
+        <w:rPr>
+          <w:lang w:eastAsia="id-ID"/>
+        </w:rPr>
+      </w:pPr>
+      <w:r>
+        <w:rPr>
+          <w:lang w:eastAsia="id-ID"/>
+        </w:rPr>
+        <w:t>Fungsi kirim(</w:t>
+      </w:r>
+      <w:proofErr w:type="spellStart"/>
+      <w:r>
+        <w:rPr>
+          <w:lang w:eastAsia="id-ID"/>
+        </w:rPr>
+        <w:t>notif</w:t>
+      </w:r>
+      <w:proofErr w:type="spellEnd"/>
+      <w:r>
+        <w:rPr>
+          <w:lang w:eastAsia="id-ID"/>
+        </w:rPr>
+        <w:t xml:space="preserve">, </w:t>
+      </w:r>
+      <w:proofErr w:type="spellStart"/>
+      <w:r>
+        <w:rPr>
+          <w:lang w:eastAsia="id-ID"/>
+        </w:rPr>
+        <w:t>message</w:t>
+      </w:r>
+      <w:proofErr w:type="spellEnd"/>
+      <w:r>
+        <w:rPr>
+          <w:lang w:eastAsia="id-ID"/>
+        </w:rPr>
+        <w:t xml:space="preserve">) bertindak sebagai antarmuka umum yang menerima objek apa pun selama memiliki </w:t>
+      </w:r>
+      <w:proofErr w:type="spellStart"/>
+      <w:r>
+        <w:rPr>
+          <w:lang w:eastAsia="id-ID"/>
+        </w:rPr>
+        <w:t>method</w:t>
+      </w:r>
+      <w:proofErr w:type="spellEnd"/>
+      <w:r>
+        <w:rPr>
+          <w:lang w:eastAsia="id-ID"/>
+        </w:rPr>
+        <w:t xml:space="preserve"> </w:t>
+      </w:r>
+      <w:proofErr w:type="spellStart"/>
+      <w:r>
+        <w:rPr>
+          <w:lang w:eastAsia="id-ID"/>
+        </w:rPr>
+        <w:t>send</w:t>
+      </w:r>
+      <w:proofErr w:type="spellEnd"/>
+      <w:r>
+        <w:rPr>
+          <w:lang w:eastAsia="id-ID"/>
+        </w:rPr>
+        <w:t xml:space="preserve">(). Hal ini menunjukkan </w:t>
+      </w:r>
+      <w:proofErr w:type="spellStart"/>
+      <w:r>
+        <w:rPr>
+          <w:lang w:eastAsia="id-ID"/>
+        </w:rPr>
+        <w:lastRenderedPageBreak/>
+        <w:t>polymorphism</w:t>
+      </w:r>
+      <w:proofErr w:type="spellEnd"/>
+      <w:r>
+        <w:rPr>
+          <w:lang w:eastAsia="id-ID"/>
+        </w:rPr>
+        <w:t xml:space="preserve">, karena fungsi yang sama dapat bekerja pada berbagai tipe objek dengan perilaku berbeda tanpa perlu mengetahui detail </w:t>
+      </w:r>
+      <w:proofErr w:type="spellStart"/>
+      <w:r>
+        <w:rPr>
+          <w:lang w:eastAsia="id-ID"/>
+        </w:rPr>
+        <w:t>class-nya</w:t>
+      </w:r>
+      <w:proofErr w:type="spellEnd"/>
+      <w:r>
+        <w:rPr>
+          <w:lang w:eastAsia="id-ID"/>
+        </w:rPr>
+        <w:t xml:space="preserve">. </w:t>
+      </w:r>
+      <w:proofErr w:type="spellStart"/>
+      <w:r>
+        <w:rPr>
+          <w:lang w:eastAsia="id-ID"/>
+        </w:rPr>
+        <w:t>List</w:t>
+      </w:r>
+      <w:proofErr w:type="spellEnd"/>
+      <w:r>
+        <w:rPr>
+          <w:lang w:eastAsia="id-ID"/>
+        </w:rPr>
+        <w:t xml:space="preserve"> notifikasi berisi objek dari berbagai </w:t>
+      </w:r>
+      <w:proofErr w:type="spellStart"/>
+      <w:r>
+        <w:rPr>
+          <w:lang w:eastAsia="id-ID"/>
+        </w:rPr>
+        <w:t>subclass</w:t>
+      </w:r>
+      <w:proofErr w:type="spellEnd"/>
+      <w:r>
+        <w:rPr>
+          <w:lang w:eastAsia="id-ID"/>
+        </w:rPr>
+        <w:t xml:space="preserve">, kemudian dilakukan perulangan untuk memanggil fungsi kirim() pada setiap objek. Hasilnya, pesan yang sama (“Jadwal kuliah berubah”) dikirim melalui berbagai jenis notifikasi dengan </w:t>
+      </w:r>
+      <w:proofErr w:type="spellStart"/>
+      <w:r>
+        <w:rPr>
+          <w:lang w:eastAsia="id-ID"/>
+        </w:rPr>
+        <w:t>output</w:t>
+      </w:r>
+      <w:proofErr w:type="spellEnd"/>
+      <w:r>
+        <w:rPr>
+          <w:lang w:eastAsia="id-ID"/>
+        </w:rPr>
+        <w:t xml:space="preserve"> yang berbeda sesuai implementasi masing-masing </w:t>
+      </w:r>
+      <w:proofErr w:type="spellStart"/>
+      <w:r>
+        <w:rPr>
+          <w:lang w:eastAsia="id-ID"/>
+        </w:rPr>
+        <w:t>class</w:t>
+      </w:r>
+      <w:proofErr w:type="spellEnd"/>
+      <w:r>
+        <w:rPr>
+          <w:lang w:eastAsia="id-ID"/>
+        </w:rPr>
+        <w:t>.</w:t>
+      </w:r>
+    </w:p>
+    <w:p>
+      <w:pPr>
+        <w:rPr>
+          <w:lang w:eastAsia="id-ID"/>
+        </w:rPr>
+      </w:pPr>
+      <w:r>
+        <w:rPr>
+          <w:lang w:eastAsia="id-ID"/>
+        </w:rPr>
+        <w:t xml:space="preserve">Secara konsep, </w:t>
+      </w:r>
+      <w:proofErr w:type="spellStart"/>
+      <w:r>
+        <w:rPr>
+          <w:lang w:eastAsia="id-ID"/>
+        </w:rPr>
+        <w:t>inheritance</w:t>
+      </w:r>
+      <w:proofErr w:type="spellEnd"/>
+      <w:r>
+        <w:rPr>
+          <w:lang w:eastAsia="id-ID"/>
+        </w:rPr>
+        <w:t xml:space="preserve"> terlihat dari hubungan antara </w:t>
+      </w:r>
+      <w:proofErr w:type="spellStart"/>
+      <w:r>
+        <w:rPr>
+          <w:lang w:eastAsia="id-ID"/>
+        </w:rPr>
+        <w:t>class</w:t>
+      </w:r>
+      <w:proofErr w:type="spellEnd"/>
+      <w:r>
+        <w:rPr>
+          <w:lang w:eastAsia="id-ID"/>
+        </w:rPr>
+        <w:t xml:space="preserve"> turunan dengan </w:t>
+      </w:r>
+      <w:proofErr w:type="spellStart"/>
+      <w:r>
+        <w:rPr>
+          <w:lang w:eastAsia="id-ID"/>
+        </w:rPr>
+        <w:t>class</w:t>
+      </w:r>
+      <w:proofErr w:type="spellEnd"/>
+      <w:r>
+        <w:rPr>
+          <w:lang w:eastAsia="id-ID"/>
+        </w:rPr>
+        <w:t xml:space="preserve"> </w:t>
+      </w:r>
+      <w:proofErr w:type="spellStart"/>
+      <w:r>
+        <w:rPr>
+          <w:lang w:eastAsia="id-ID"/>
+        </w:rPr>
+        <w:t>Notification</w:t>
+      </w:r>
+      <w:proofErr w:type="spellEnd"/>
+      <w:r>
+        <w:rPr>
+          <w:lang w:eastAsia="id-ID"/>
+        </w:rPr>
+        <w:t xml:space="preserve">, sedangkan </w:t>
+      </w:r>
+      <w:proofErr w:type="spellStart"/>
+      <w:r>
+        <w:rPr>
+          <w:lang w:eastAsia="id-ID"/>
+        </w:rPr>
+        <w:t>polymorphism</w:t>
+      </w:r>
+      <w:proofErr w:type="spellEnd"/>
+      <w:r>
+        <w:rPr>
+          <w:lang w:eastAsia="id-ID"/>
+        </w:rPr>
+        <w:t xml:space="preserve"> terlihat dari penggunaan </w:t>
+      </w:r>
+      <w:proofErr w:type="spellStart"/>
+      <w:r>
+        <w:rPr>
+          <w:lang w:eastAsia="id-ID"/>
+        </w:rPr>
+        <w:t>method</w:t>
+      </w:r>
+      <w:proofErr w:type="spellEnd"/>
+      <w:r>
+        <w:rPr>
+          <w:lang w:eastAsia="id-ID"/>
+        </w:rPr>
+        <w:t xml:space="preserve"> </w:t>
+      </w:r>
+      <w:proofErr w:type="spellStart"/>
+      <w:r>
+        <w:rPr>
+          <w:lang w:eastAsia="id-ID"/>
+        </w:rPr>
+        <w:t>send</w:t>
+      </w:r>
+      <w:proofErr w:type="spellEnd"/>
+      <w:r>
+        <w:rPr>
+          <w:lang w:eastAsia="id-ID"/>
+        </w:rPr>
+        <w:t>() yang sama namun menghasilkan perilaku berbeda tergantung objek yang digunakan.</w:t>
+      </w:r>
+    </w:p>
+    <w:p>
+      <w:pPr>
+        <w:rPr>
+          <w:lang w:eastAsia="id-ID"/>
+        </w:rPr>
+      </w:pPr>
+    </w:p>
+    <w:p/>
     <w:p>
       <w:r>
         <w:br w:type="page"/>
@@ -4386,6 +8103,155 @@
 <file path=word/numbering.xml><?xml version="1.0" encoding="utf-8"?>
 <w:numbering xmlns:wpc="http://schemas.microsoft.com/office/word/2010/wordprocessingCanvas" xmlns:cx="http://schemas.microsoft.com/office/drawing/2014/chartex" xmlns:cx1="http://schemas.microsoft.com/office/drawing/2015/9/8/chartex" xmlns:cx2="http://schemas.microsoft.com/office/drawing/2015/10/21/chartex" xmlns:cx3="http://schemas.microsoft.com/office/drawing/2016/5/9/chartex" xmlns:cx4="http://schemas.microsoft.com/office/drawing/2016/5/10/chartex" xmlns:cx5="http://schemas.microsoft.com/office/drawing/2016/5/11/chartex" xmlns:cx6="http://schemas.microsoft.com/office/drawing/2016/5/12/chartex" xmlns:cx7="http://schemas.microsoft.com/office/drawing/2016/5/13/chartex" xmlns:cx8="http://schemas.microsoft.com/office/drawing/2016/5/14/chartex" xmlns:mc="http://schemas.openxmlformats.org/markup-compatibility/2006" xmlns:aink="http://schemas.microsoft.com/office/drawing/2016/ink" xmlns:am3d="http://schemas.microsoft.com/office/drawing/2017/model3d" xmlns:o="urn:schemas-microsoft-com:office:office" xmlns:oel="http://schemas.microsoft.com/office/2019/extlst" xmlns:r="http://schemas.openxmlformats.org/officeDocument/2006/relationships" xmlns:m="http://schemas.openxmlformats.org/officeDocument/2006/math" xmlns:v="urn:schemas-microsoft-com:vml" xmlns:wp14="http://schemas.microsoft.com/office/word/2010/wordprocessingDrawing" xmlns:wp="http://schemas.openxmlformats.org/drawingml/2006/wordprocessingDrawing" xmlns:w10="urn:schemas-microsoft-com:office:word" xmlns:w="http://schemas.openxmlformats.org/wordprocessingml/2006/main" xmlns:w14="http://schemas.microsoft.com/office/word/2010/wordml" xmlns:w15="http://schemas.microsoft.com/office/word/2012/wordml" xmlns:w16cex="http://schemas.microsoft.com/office/word/2018/wordml/cex" xmlns:w16cid="http://schemas.microsoft.com/office/word/2016/wordml/cid" xmlns:w16="http://schemas.microsoft.com/office/word/2018/wordml" xmlns:w16du="http://schemas.microsoft.com/office/word/2023/wordml/word16du" xmlns:w16sdtdh="http://schemas.microsoft.com/office/word/2020/wordml/sdtdatahash" xmlns:w16sdtfl="http://schemas.microsoft.com/office/word/2024/wordml/sdtformatlock" xmlns:w16se="http://schemas.microsoft.com/office/word/2015/wordml/symex" xmlns:wpg="http://schemas.microsoft.com/office/word/2010/wordprocessingGroup" xmlns:wpi="http://schemas.microsoft.com/office/word/2010/wordprocessingInk" xmlns:wne="http://schemas.microsoft.com/office/word/2006/wordml" xmlns:wps="http://schemas.microsoft.com/office/word/2010/wordprocessingShape" mc:Ignorable="w14 w15 w16se w16cid w16 w16cex w16sdtdh w16sdtfl w16du wp14">
   <w:abstractNum w:abstractNumId="0" w15:restartNumberingAfterBreak="0">
+    <w:nsid w:val="03A506BF"/>
+    <w:multiLevelType w:val="multilevel"/>
+    <w:tmpl w:val="0EFAC7A0"/>
+    <w:lvl w:ilvl="0">
+      <w:start w:val="1"/>
+      <w:numFmt w:val="bullet"/>
+      <w:lvlText w:val=""/>
+      <w:lvlJc w:val="left"/>
+      <w:pPr>
+        <w:tabs>
+          <w:tab w:val="num" w:pos="720"/>
+        </w:tabs>
+        <w:ind w:left="720" w:hanging="360"/>
+      </w:pPr>
+      <w:rPr>
+        <w:rFonts w:ascii="Symbol" w:hAnsi="Symbol" w:hint="default"/>
+        <w:sz w:val="20"/>
+      </w:rPr>
+    </w:lvl>
+    <w:lvl w:ilvl="1" w:tentative="1">
+      <w:start w:val="1"/>
+      <w:numFmt w:val="bullet"/>
+      <w:lvlText w:val="o"/>
+      <w:lvlJc w:val="left"/>
+      <w:pPr>
+        <w:tabs>
+          <w:tab w:val="num" w:pos="1440"/>
+        </w:tabs>
+        <w:ind w:left="1440" w:hanging="360"/>
+      </w:pPr>
+      <w:rPr>
+        <w:rFonts w:ascii="Courier New" w:hAnsi="Courier New" w:hint="default"/>
+        <w:sz w:val="20"/>
+      </w:rPr>
+    </w:lvl>
+    <w:lvl w:ilvl="2" w:tentative="1">
+      <w:start w:val="1"/>
+      <w:numFmt w:val="bullet"/>
+      <w:lvlText w:val=""/>
+      <w:lvlJc w:val="left"/>
+      <w:pPr>
+        <w:tabs>
+          <w:tab w:val="num" w:pos="2160"/>
+        </w:tabs>
+        <w:ind w:left="2160" w:hanging="360"/>
+      </w:pPr>
+      <w:rPr>
+        <w:rFonts w:ascii="Wingdings" w:hAnsi="Wingdings" w:hint="default"/>
+        <w:sz w:val="20"/>
+      </w:rPr>
+    </w:lvl>
+    <w:lvl w:ilvl="3" w:tentative="1">
+      <w:start w:val="1"/>
+      <w:numFmt w:val="bullet"/>
+      <w:lvlText w:val=""/>
+      <w:lvlJc w:val="left"/>
+      <w:pPr>
+        <w:tabs>
+          <w:tab w:val="num" w:pos="2880"/>
+        </w:tabs>
+        <w:ind w:left="2880" w:hanging="360"/>
+      </w:pPr>
+      <w:rPr>
+        <w:rFonts w:ascii="Wingdings" w:hAnsi="Wingdings" w:hint="default"/>
+        <w:sz w:val="20"/>
+      </w:rPr>
+    </w:lvl>
+    <w:lvl w:ilvl="4" w:tentative="1">
+      <w:start w:val="1"/>
+      <w:numFmt w:val="bullet"/>
+      <w:lvlText w:val=""/>
+      <w:lvlJc w:val="left"/>
+      <w:pPr>
+        <w:tabs>
+          <w:tab w:val="num" w:pos="3600"/>
+        </w:tabs>
+        <w:ind w:left="3600" w:hanging="360"/>
+      </w:pPr>
+      <w:rPr>
+        <w:rFonts w:ascii="Wingdings" w:hAnsi="Wingdings" w:hint="default"/>
+        <w:sz w:val="20"/>
+      </w:rPr>
+    </w:lvl>
+    <w:lvl w:ilvl="5" w:tentative="1">
+      <w:start w:val="1"/>
+      <w:numFmt w:val="bullet"/>
+      <w:lvlText w:val=""/>
+      <w:lvlJc w:val="left"/>
+      <w:pPr>
+        <w:tabs>
+          <w:tab w:val="num" w:pos="4320"/>
+        </w:tabs>
+        <w:ind w:left="4320" w:hanging="360"/>
+      </w:pPr>
+      <w:rPr>
+        <w:rFonts w:ascii="Wingdings" w:hAnsi="Wingdings" w:hint="default"/>
+        <w:sz w:val="20"/>
+      </w:rPr>
+    </w:lvl>
+    <w:lvl w:ilvl="6" w:tentative="1">
+      <w:start w:val="1"/>
+      <w:numFmt w:val="bullet"/>
+      <w:lvlText w:val=""/>
+      <w:lvlJc w:val="left"/>
+      <w:pPr>
+        <w:tabs>
+          <w:tab w:val="num" w:pos="5040"/>
+        </w:tabs>
+        <w:ind w:left="5040" w:hanging="360"/>
+      </w:pPr>
+      <w:rPr>
+        <w:rFonts w:ascii="Wingdings" w:hAnsi="Wingdings" w:hint="default"/>
+        <w:sz w:val="20"/>
+      </w:rPr>
+    </w:lvl>
+    <w:lvl w:ilvl="7" w:tentative="1">
+      <w:start w:val="1"/>
+      <w:numFmt w:val="bullet"/>
+      <w:lvlText w:val=""/>
+      <w:lvlJc w:val="left"/>
+      <w:pPr>
+        <w:tabs>
+          <w:tab w:val="num" w:pos="5760"/>
+        </w:tabs>
+        <w:ind w:left="5760" w:hanging="360"/>
+      </w:pPr>
+      <w:rPr>
+        <w:rFonts w:ascii="Wingdings" w:hAnsi="Wingdings" w:hint="default"/>
+        <w:sz w:val="20"/>
+      </w:rPr>
+    </w:lvl>
+    <w:lvl w:ilvl="8" w:tentative="1">
+      <w:start w:val="1"/>
+      <w:numFmt w:val="bullet"/>
+      <w:lvlText w:val=""/>
+      <w:lvlJc w:val="left"/>
+      <w:pPr>
+        <w:tabs>
+          <w:tab w:val="num" w:pos="6480"/>
+        </w:tabs>
+        <w:ind w:left="6480" w:hanging="360"/>
+      </w:pPr>
+      <w:rPr>
+        <w:rFonts w:ascii="Wingdings" w:hAnsi="Wingdings" w:hint="default"/>
+        <w:sz w:val="20"/>
+      </w:rPr>
+    </w:lvl>
+  </w:abstractNum>
+  <w:abstractNum w:abstractNumId="1" w15:restartNumberingAfterBreak="0">
     <w:nsid w:val="03BC6861"/>
     <w:multiLevelType w:val="multilevel"/>
     <w:tmpl w:val="4D2E4548"/>
@@ -4508,7 +8374,93 @@
       </w:rPr>
     </w:lvl>
   </w:abstractNum>
-  <w:abstractNum w:abstractNumId="1" w15:restartNumberingAfterBreak="0">
+  <w:abstractNum w:abstractNumId="2" w15:restartNumberingAfterBreak="0">
+    <w:nsid w:val="13A01972"/>
+    <w:multiLevelType w:val="hybridMultilevel"/>
+    <w:tmpl w:val="CB0AE11C"/>
+    <w:lvl w:ilvl="0" w:tplc="0421000F">
+      <w:start w:val="1"/>
+      <w:numFmt w:val="decimal"/>
+      <w:lvlText w:val="%1."/>
+      <w:lvlJc w:val="left"/>
+      <w:pPr>
+        <w:ind w:left="720" w:hanging="360"/>
+      </w:pPr>
+    </w:lvl>
+    <w:lvl w:ilvl="1" w:tplc="04210019" w:tentative="1">
+      <w:start w:val="1"/>
+      <w:numFmt w:val="lowerLetter"/>
+      <w:lvlText w:val="%2."/>
+      <w:lvlJc w:val="left"/>
+      <w:pPr>
+        <w:ind w:left="1440" w:hanging="360"/>
+      </w:pPr>
+    </w:lvl>
+    <w:lvl w:ilvl="2" w:tplc="0421001B" w:tentative="1">
+      <w:start w:val="1"/>
+      <w:numFmt w:val="lowerRoman"/>
+      <w:lvlText w:val="%3."/>
+      <w:lvlJc w:val="right"/>
+      <w:pPr>
+        <w:ind w:left="2160" w:hanging="180"/>
+      </w:pPr>
+    </w:lvl>
+    <w:lvl w:ilvl="3" w:tplc="0421000F" w:tentative="1">
+      <w:start w:val="1"/>
+      <w:numFmt w:val="decimal"/>
+      <w:lvlText w:val="%4."/>
+      <w:lvlJc w:val="left"/>
+      <w:pPr>
+        <w:ind w:left="2880" w:hanging="360"/>
+      </w:pPr>
+    </w:lvl>
+    <w:lvl w:ilvl="4" w:tplc="04210019" w:tentative="1">
+      <w:start w:val="1"/>
+      <w:numFmt w:val="lowerLetter"/>
+      <w:lvlText w:val="%5."/>
+      <w:lvlJc w:val="left"/>
+      <w:pPr>
+        <w:ind w:left="3600" w:hanging="360"/>
+      </w:pPr>
+    </w:lvl>
+    <w:lvl w:ilvl="5" w:tplc="0421001B" w:tentative="1">
+      <w:start w:val="1"/>
+      <w:numFmt w:val="lowerRoman"/>
+      <w:lvlText w:val="%6."/>
+      <w:lvlJc w:val="right"/>
+      <w:pPr>
+        <w:ind w:left="4320" w:hanging="180"/>
+      </w:pPr>
+    </w:lvl>
+    <w:lvl w:ilvl="6" w:tplc="0421000F" w:tentative="1">
+      <w:start w:val="1"/>
+      <w:numFmt w:val="decimal"/>
+      <w:lvlText w:val="%7."/>
+      <w:lvlJc w:val="left"/>
+      <w:pPr>
+        <w:ind w:left="5040" w:hanging="360"/>
+      </w:pPr>
+    </w:lvl>
+    <w:lvl w:ilvl="7" w:tplc="04210019" w:tentative="1">
+      <w:start w:val="1"/>
+      <w:numFmt w:val="lowerLetter"/>
+      <w:lvlText w:val="%8."/>
+      <w:lvlJc w:val="left"/>
+      <w:pPr>
+        <w:ind w:left="5760" w:hanging="360"/>
+      </w:pPr>
+    </w:lvl>
+    <w:lvl w:ilvl="8" w:tplc="0421001B" w:tentative="1">
+      <w:start w:val="1"/>
+      <w:numFmt w:val="lowerRoman"/>
+      <w:lvlText w:val="%9."/>
+      <w:lvlJc w:val="right"/>
+      <w:pPr>
+        <w:ind w:left="6480" w:hanging="180"/>
+      </w:pPr>
+    </w:lvl>
+  </w:abstractNum>
+  <w:abstractNum w:abstractNumId="3" w15:restartNumberingAfterBreak="0">
     <w:nsid w:val="19CE297E"/>
     <w:multiLevelType w:val="multilevel"/>
     <w:tmpl w:val="F6000EEC"/>
@@ -4621,7 +8573,7 @@
       </w:pPr>
     </w:lvl>
   </w:abstractNum>
-  <w:abstractNum w:abstractNumId="2" w15:restartNumberingAfterBreak="0">
+  <w:abstractNum w:abstractNumId="4" w15:restartNumberingAfterBreak="0">
     <w:nsid w:val="23885036"/>
     <w:multiLevelType w:val="multilevel"/>
     <w:tmpl w:val="CFE03E54"/>
@@ -4770,7 +8722,7 @@
       </w:rPr>
     </w:lvl>
   </w:abstractNum>
-  <w:abstractNum w:abstractNumId="3" w15:restartNumberingAfterBreak="0">
+  <w:abstractNum w:abstractNumId="5" w15:restartNumberingAfterBreak="0">
     <w:nsid w:val="2CE457A3"/>
     <w:multiLevelType w:val="multilevel"/>
     <w:tmpl w:val="98DEFCE8"/>
@@ -4883,7 +8835,7 @@
       </w:pPr>
     </w:lvl>
   </w:abstractNum>
-  <w:abstractNum w:abstractNumId="4" w15:restartNumberingAfterBreak="0">
+  <w:abstractNum w:abstractNumId="6" w15:restartNumberingAfterBreak="0">
     <w:nsid w:val="35DB6335"/>
     <w:multiLevelType w:val="multilevel"/>
     <w:tmpl w:val="6A968784"/>
@@ -5032,7 +8984,93 @@
       </w:rPr>
     </w:lvl>
   </w:abstractNum>
-  <w:abstractNum w:abstractNumId="5" w15:restartNumberingAfterBreak="0">
+  <w:abstractNum w:abstractNumId="7" w15:restartNumberingAfterBreak="0">
+    <w:nsid w:val="3AA629E2"/>
+    <w:multiLevelType w:val="hybridMultilevel"/>
+    <w:tmpl w:val="0A8628F6"/>
+    <w:lvl w:ilvl="0" w:tplc="0421000F">
+      <w:start w:val="1"/>
+      <w:numFmt w:val="decimal"/>
+      <w:lvlText w:val="%1."/>
+      <w:lvlJc w:val="left"/>
+      <w:pPr>
+        <w:ind w:left="1440" w:hanging="360"/>
+      </w:pPr>
+    </w:lvl>
+    <w:lvl w:ilvl="1" w:tplc="04210019" w:tentative="1">
+      <w:start w:val="1"/>
+      <w:numFmt w:val="lowerLetter"/>
+      <w:lvlText w:val="%2."/>
+      <w:lvlJc w:val="left"/>
+      <w:pPr>
+        <w:ind w:left="2160" w:hanging="360"/>
+      </w:pPr>
+    </w:lvl>
+    <w:lvl w:ilvl="2" w:tplc="0421001B" w:tentative="1">
+      <w:start w:val="1"/>
+      <w:numFmt w:val="lowerRoman"/>
+      <w:lvlText w:val="%3."/>
+      <w:lvlJc w:val="right"/>
+      <w:pPr>
+        <w:ind w:left="2880" w:hanging="180"/>
+      </w:pPr>
+    </w:lvl>
+    <w:lvl w:ilvl="3" w:tplc="0421000F" w:tentative="1">
+      <w:start w:val="1"/>
+      <w:numFmt w:val="decimal"/>
+      <w:lvlText w:val="%4."/>
+      <w:lvlJc w:val="left"/>
+      <w:pPr>
+        <w:ind w:left="3600" w:hanging="360"/>
+      </w:pPr>
+    </w:lvl>
+    <w:lvl w:ilvl="4" w:tplc="04210019" w:tentative="1">
+      <w:start w:val="1"/>
+      <w:numFmt w:val="lowerLetter"/>
+      <w:lvlText w:val="%5."/>
+      <w:lvlJc w:val="left"/>
+      <w:pPr>
+        <w:ind w:left="4320" w:hanging="360"/>
+      </w:pPr>
+    </w:lvl>
+    <w:lvl w:ilvl="5" w:tplc="0421001B" w:tentative="1">
+      <w:start w:val="1"/>
+      <w:numFmt w:val="lowerRoman"/>
+      <w:lvlText w:val="%6."/>
+      <w:lvlJc w:val="right"/>
+      <w:pPr>
+        <w:ind w:left="5040" w:hanging="180"/>
+      </w:pPr>
+    </w:lvl>
+    <w:lvl w:ilvl="6" w:tplc="0421000F" w:tentative="1">
+      <w:start w:val="1"/>
+      <w:numFmt w:val="decimal"/>
+      <w:lvlText w:val="%7."/>
+      <w:lvlJc w:val="left"/>
+      <w:pPr>
+        <w:ind w:left="5760" w:hanging="360"/>
+      </w:pPr>
+    </w:lvl>
+    <w:lvl w:ilvl="7" w:tplc="04210019" w:tentative="1">
+      <w:start w:val="1"/>
+      <w:numFmt w:val="lowerLetter"/>
+      <w:lvlText w:val="%8."/>
+      <w:lvlJc w:val="left"/>
+      <w:pPr>
+        <w:ind w:left="6480" w:hanging="360"/>
+      </w:pPr>
+    </w:lvl>
+    <w:lvl w:ilvl="8" w:tplc="0421001B" w:tentative="1">
+      <w:start w:val="1"/>
+      <w:numFmt w:val="lowerRoman"/>
+      <w:lvlText w:val="%9."/>
+      <w:lvlJc w:val="right"/>
+      <w:pPr>
+        <w:ind w:left="7200" w:hanging="180"/>
+      </w:pPr>
+    </w:lvl>
+  </w:abstractNum>
+  <w:abstractNum w:abstractNumId="8" w15:restartNumberingAfterBreak="0">
     <w:nsid w:val="62B058E9"/>
     <w:multiLevelType w:val="multilevel"/>
     <w:tmpl w:val="0421001D"/>
@@ -5118,7 +9156,206 @@
       </w:pPr>
     </w:lvl>
   </w:abstractNum>
-  <w:abstractNum w:abstractNumId="6" w15:restartNumberingAfterBreak="0">
+  <w:abstractNum w:abstractNumId="9" w15:restartNumberingAfterBreak="0">
+    <w:nsid w:val="6500793A"/>
+    <w:multiLevelType w:val="hybridMultilevel"/>
+    <w:tmpl w:val="F5346CB0"/>
+    <w:lvl w:ilvl="0" w:tplc="0421000F">
+      <w:start w:val="1"/>
+      <w:numFmt w:val="decimal"/>
+      <w:lvlText w:val="%1."/>
+      <w:lvlJc w:val="left"/>
+      <w:pPr>
+        <w:ind w:left="1440" w:hanging="360"/>
+      </w:pPr>
+    </w:lvl>
+    <w:lvl w:ilvl="1" w:tplc="04210019" w:tentative="1">
+      <w:start w:val="1"/>
+      <w:numFmt w:val="lowerLetter"/>
+      <w:lvlText w:val="%2."/>
+      <w:lvlJc w:val="left"/>
+      <w:pPr>
+        <w:ind w:left="2160" w:hanging="360"/>
+      </w:pPr>
+    </w:lvl>
+    <w:lvl w:ilvl="2" w:tplc="0421001B" w:tentative="1">
+      <w:start w:val="1"/>
+      <w:numFmt w:val="lowerRoman"/>
+      <w:lvlText w:val="%3."/>
+      <w:lvlJc w:val="right"/>
+      <w:pPr>
+        <w:ind w:left="2880" w:hanging="180"/>
+      </w:pPr>
+    </w:lvl>
+    <w:lvl w:ilvl="3" w:tplc="0421000F" w:tentative="1">
+      <w:start w:val="1"/>
+      <w:numFmt w:val="decimal"/>
+      <w:lvlText w:val="%4."/>
+      <w:lvlJc w:val="left"/>
+      <w:pPr>
+        <w:ind w:left="3600" w:hanging="360"/>
+      </w:pPr>
+    </w:lvl>
+    <w:lvl w:ilvl="4" w:tplc="04210019" w:tentative="1">
+      <w:start w:val="1"/>
+      <w:numFmt w:val="lowerLetter"/>
+      <w:lvlText w:val="%5."/>
+      <w:lvlJc w:val="left"/>
+      <w:pPr>
+        <w:ind w:left="4320" w:hanging="360"/>
+      </w:pPr>
+    </w:lvl>
+    <w:lvl w:ilvl="5" w:tplc="0421001B" w:tentative="1">
+      <w:start w:val="1"/>
+      <w:numFmt w:val="lowerRoman"/>
+      <w:lvlText w:val="%6."/>
+      <w:lvlJc w:val="right"/>
+      <w:pPr>
+        <w:ind w:left="5040" w:hanging="180"/>
+      </w:pPr>
+    </w:lvl>
+    <w:lvl w:ilvl="6" w:tplc="0421000F" w:tentative="1">
+      <w:start w:val="1"/>
+      <w:numFmt w:val="decimal"/>
+      <w:lvlText w:val="%7."/>
+      <w:lvlJc w:val="left"/>
+      <w:pPr>
+        <w:ind w:left="5760" w:hanging="360"/>
+      </w:pPr>
+    </w:lvl>
+    <w:lvl w:ilvl="7" w:tplc="04210019" w:tentative="1">
+      <w:start w:val="1"/>
+      <w:numFmt w:val="lowerLetter"/>
+      <w:lvlText w:val="%8."/>
+      <w:lvlJc w:val="left"/>
+      <w:pPr>
+        <w:ind w:left="6480" w:hanging="360"/>
+      </w:pPr>
+    </w:lvl>
+    <w:lvl w:ilvl="8" w:tplc="0421001B" w:tentative="1">
+      <w:start w:val="1"/>
+      <w:numFmt w:val="lowerRoman"/>
+      <w:lvlText w:val="%9."/>
+      <w:lvlJc w:val="right"/>
+      <w:pPr>
+        <w:ind w:left="7200" w:hanging="180"/>
+      </w:pPr>
+    </w:lvl>
+  </w:abstractNum>
+  <w:abstractNum w:abstractNumId="10" w15:restartNumberingAfterBreak="0">
+    <w:nsid w:val="6FDC18C4"/>
+    <w:multiLevelType w:val="multilevel"/>
+    <w:tmpl w:val="B01E11F8"/>
+    <w:lvl w:ilvl="0">
+      <w:start w:val="1"/>
+      <w:numFmt w:val="decimal"/>
+      <w:lvlText w:val="%1."/>
+      <w:lvlJc w:val="left"/>
+      <w:pPr>
+        <w:tabs>
+          <w:tab w:val="num" w:pos="720"/>
+        </w:tabs>
+        <w:ind w:left="720" w:hanging="360"/>
+      </w:pPr>
+    </w:lvl>
+    <w:lvl w:ilvl="1" w:tentative="1">
+      <w:start w:val="1"/>
+      <w:numFmt w:val="decimal"/>
+      <w:lvlText w:val="%2."/>
+      <w:lvlJc w:val="left"/>
+      <w:pPr>
+        <w:tabs>
+          <w:tab w:val="num" w:pos="1440"/>
+        </w:tabs>
+        <w:ind w:left="1440" w:hanging="360"/>
+      </w:pPr>
+    </w:lvl>
+    <w:lvl w:ilvl="2" w:tentative="1">
+      <w:start w:val="1"/>
+      <w:numFmt w:val="decimal"/>
+      <w:lvlText w:val="%3."/>
+      <w:lvlJc w:val="left"/>
+      <w:pPr>
+        <w:tabs>
+          <w:tab w:val="num" w:pos="2160"/>
+        </w:tabs>
+        <w:ind w:left="2160" w:hanging="360"/>
+      </w:pPr>
+    </w:lvl>
+    <w:lvl w:ilvl="3" w:tentative="1">
+      <w:start w:val="1"/>
+      <w:numFmt w:val="decimal"/>
+      <w:lvlText w:val="%4."/>
+      <w:lvlJc w:val="left"/>
+      <w:pPr>
+        <w:tabs>
+          <w:tab w:val="num" w:pos="2880"/>
+        </w:tabs>
+        <w:ind w:left="2880" w:hanging="360"/>
+      </w:pPr>
+    </w:lvl>
+    <w:lvl w:ilvl="4" w:tentative="1">
+      <w:start w:val="1"/>
+      <w:numFmt w:val="decimal"/>
+      <w:lvlText w:val="%5."/>
+      <w:lvlJc w:val="left"/>
+      <w:pPr>
+        <w:tabs>
+          <w:tab w:val="num" w:pos="3600"/>
+        </w:tabs>
+        <w:ind w:left="3600" w:hanging="360"/>
+      </w:pPr>
+    </w:lvl>
+    <w:lvl w:ilvl="5" w:tentative="1">
+      <w:start w:val="1"/>
+      <w:numFmt w:val="decimal"/>
+      <w:lvlText w:val="%6."/>
+      <w:lvlJc w:val="left"/>
+      <w:pPr>
+        <w:tabs>
+          <w:tab w:val="num" w:pos="4320"/>
+        </w:tabs>
+        <w:ind w:left="4320" w:hanging="360"/>
+      </w:pPr>
+    </w:lvl>
+    <w:lvl w:ilvl="6" w:tentative="1">
+      <w:start w:val="1"/>
+      <w:numFmt w:val="decimal"/>
+      <w:lvlText w:val="%7."/>
+      <w:lvlJc w:val="left"/>
+      <w:pPr>
+        <w:tabs>
+          <w:tab w:val="num" w:pos="5040"/>
+        </w:tabs>
+        <w:ind w:left="5040" w:hanging="360"/>
+      </w:pPr>
+    </w:lvl>
+    <w:lvl w:ilvl="7" w:tentative="1">
+      <w:start w:val="1"/>
+      <w:numFmt w:val="decimal"/>
+      <w:lvlText w:val="%8."/>
+      <w:lvlJc w:val="left"/>
+      <w:pPr>
+        <w:tabs>
+          <w:tab w:val="num" w:pos="5760"/>
+        </w:tabs>
+        <w:ind w:left="5760" w:hanging="360"/>
+      </w:pPr>
+    </w:lvl>
+    <w:lvl w:ilvl="8" w:tentative="1">
+      <w:start w:val="1"/>
+      <w:numFmt w:val="decimal"/>
+      <w:lvlText w:val="%9."/>
+      <w:lvlJc w:val="left"/>
+      <w:pPr>
+        <w:tabs>
+          <w:tab w:val="num" w:pos="6480"/>
+        </w:tabs>
+        <w:ind w:left="6480" w:hanging="360"/>
+      </w:pPr>
+    </w:lvl>
+  </w:abstractNum>
+  <w:abstractNum w:abstractNumId="11" w15:restartNumberingAfterBreak="0">
     <w:nsid w:val="7DE225CA"/>
     <w:multiLevelType w:val="multilevel"/>
     <w:tmpl w:val="EF5C1C9E"/>
@@ -5240,13 +9477,13 @@
     </w:lvl>
   </w:abstractNum>
   <w:num w:numId="1" w16cid:durableId="435977835">
-    <w:abstractNumId w:val="5"/>
+    <w:abstractNumId w:val="8"/>
   </w:num>
   <w:num w:numId="2" w16cid:durableId="430779734">
-    <w:abstractNumId w:val="6"/>
+    <w:abstractNumId w:val="11"/>
   </w:num>
   <w:num w:numId="3" w16cid:durableId="1799684492">
-    <w:abstractNumId w:val="5"/>
+    <w:abstractNumId w:val="8"/>
     <w:lvlOverride w:ilvl="0">
       <w:startOverride w:val="1"/>
     </w:lvlOverride>
@@ -5276,19 +9513,34 @@
     </w:lvlOverride>
   </w:num>
   <w:num w:numId="4" w16cid:durableId="1879584797">
+    <w:abstractNumId w:val="1"/>
+  </w:num>
+  <w:num w:numId="5" w16cid:durableId="1945961542">
+    <w:abstractNumId w:val="3"/>
+  </w:num>
+  <w:num w:numId="6" w16cid:durableId="1967075811">
+    <w:abstractNumId w:val="5"/>
+  </w:num>
+  <w:num w:numId="7" w16cid:durableId="1330213808">
+    <w:abstractNumId w:val="4"/>
+  </w:num>
+  <w:num w:numId="8" w16cid:durableId="970742755">
+    <w:abstractNumId w:val="6"/>
+  </w:num>
+  <w:num w:numId="9" w16cid:durableId="1971007901">
+    <w:abstractNumId w:val="2"/>
+  </w:num>
+  <w:num w:numId="10" w16cid:durableId="2084403355">
     <w:abstractNumId w:val="0"/>
   </w:num>
-  <w:num w:numId="5" w16cid:durableId="1945961542">
-    <w:abstractNumId w:val="1"/>
+  <w:num w:numId="11" w16cid:durableId="40522069">
+    <w:abstractNumId w:val="9"/>
   </w:num>
-  <w:num w:numId="6" w16cid:durableId="1967075811">
-    <w:abstractNumId w:val="3"/>
+  <w:num w:numId="12" w16cid:durableId="1492595388">
+    <w:abstractNumId w:val="10"/>
   </w:num>
-  <w:num w:numId="7" w16cid:durableId="1330213808">
-    <w:abstractNumId w:val="2"/>
-  </w:num>
-  <w:num w:numId="8" w16cid:durableId="970742755">
-    <w:abstractNumId w:val="4"/>
+  <w:num w:numId="13" w16cid:durableId="1084032167">
+    <w:abstractNumId w:val="7"/>
   </w:num>
 </w:numbering>
 </file>
@@ -5918,7 +10170,6 @@
   <w:style w:type="character" w:default="1" w:styleId="FontParagrafDefault">
     <w:name w:val="Default Paragraph Font"/>
     <w:uiPriority w:val="1"/>
-    <w:semiHidden/>
     <w:unhideWhenUsed/>
   </w:style>
   <w:style w:type="table" w:default="1" w:styleId="TabelNormal">
@@ -6393,6 +10644,19 @@
       <w:ind w:left="284" w:firstLine="425"/>
     </w:pPr>
   </w:style>
+  <w:style w:type="character" w:styleId="KodeHTML">
+    <w:name w:val="HTML Code"/>
+    <w:basedOn w:val="FontParagrafDefault"/>
+    <w:uiPriority w:val="99"/>
+    <w:semiHidden/>
+    <w:unhideWhenUsed/>
+    <w:rsid w:val="00283D31"/>
+    <w:rPr>
+      <w:rFonts w:ascii="Courier New" w:eastAsia="Times New Roman" w:hAnsi="Courier New" w:cs="Courier New"/>
+      <w:sz w:val="20"/>
+      <w:szCs w:val="20"/>
+    </w:rPr>
+  </w:style>
 </w:styles>
 </file>
 

</xml_diff>